<commit_message>
aggiornamento documentazione e salvataggio CSV ISTAT
</commit_message>
<xml_diff>
--- a/Road Map - Capstone Project.docx
+++ b/Road Map - Capstone Project.docx
@@ -38,16 +38,7 @@
           <w:sz w:val="44"/>
           <w:szCs w:val="44"/>
         </w:rPr>
-        <w:t xml:space="preserve"> Project</w:t>
-      </w:r>
-      <w:r>
-        <w:rPr>
-          <w:b/>
-          <w:bCs/>
-          <w:sz w:val="44"/>
-          <w:szCs w:val="44"/>
-        </w:rPr>
-        <w:t xml:space="preserve"> – Mappatura </w:t>
+        <w:t xml:space="preserve"> Project – Mappatura </w:t>
       </w:r>
       <w:r>
         <w:rPr>
@@ -115,12 +106,14 @@
         <w:rPr>
           <w:sz w:val="44"/>
           <w:szCs w:val="44"/>
+          <w:highlight w:val="yellow"/>
         </w:rPr>
       </w:pPr>
       <w:r>
         <w:rPr>
           <w:sz w:val="44"/>
           <w:szCs w:val="44"/>
+          <w:highlight w:val="yellow"/>
         </w:rPr>
         <w:t xml:space="preserve">Fase 1: </w:t>
       </w:r>
@@ -130,6 +123,7 @@
           <w:bCs/>
           <w:sz w:val="44"/>
           <w:szCs w:val="44"/>
+          <w:highlight w:val="yellow"/>
         </w:rPr>
         <w:t>Download dati ISTAT</w:t>
       </w:r>
@@ -169,6 +163,7 @@
         </w:rPr>
       </w:pPr>
       <w:proofErr w:type="spellStart"/>
+      <w:proofErr w:type="gramStart"/>
       <w:r>
         <w:rPr>
           <w:sz w:val="28"/>
@@ -196,8 +191,9 @@
           <w:sz w:val="28"/>
           <w:szCs w:val="28"/>
         </w:rPr>
-        <w:sym w:font="Wingdings" w:char="F0E0"/>
-      </w:r>
+        <w:t>:</w:t>
+      </w:r>
+      <w:proofErr w:type="gramEnd"/>
       <w:r>
         <w:rPr>
           <w:sz w:val="28"/>
@@ -228,6 +224,7 @@
         </w:rPr>
       </w:pPr>
       <w:proofErr w:type="spellStart"/>
+      <w:proofErr w:type="gramStart"/>
       <w:r>
         <w:rPr>
           <w:sz w:val="28"/>
@@ -248,8 +245,9 @@
           <w:sz w:val="28"/>
           <w:szCs w:val="28"/>
         </w:rPr>
-        <w:sym w:font="Wingdings" w:char="F0E0"/>
-      </w:r>
+        <w:t>:</w:t>
+      </w:r>
+      <w:proofErr w:type="gramEnd"/>
       <w:r>
         <w:rPr>
           <w:sz w:val="28"/>
@@ -270,6 +268,7 @@
           <w:szCs w:val="28"/>
         </w:rPr>
       </w:pPr>
+      <w:proofErr w:type="gramStart"/>
       <w:r>
         <w:rPr>
           <w:sz w:val="28"/>
@@ -282,14 +281,29 @@
           <w:sz w:val="28"/>
           <w:szCs w:val="28"/>
         </w:rPr>
-        <w:sym w:font="Wingdings" w:char="F0E0"/>
-      </w:r>
-      <w:r>
-        <w:rPr>
-          <w:sz w:val="28"/>
-          <w:szCs w:val="28"/>
-        </w:rPr>
-        <w:t xml:space="preserve"> per poter interpretare con </w:t>
+        <w:t>:</w:t>
+      </w:r>
+      <w:proofErr w:type="gramEnd"/>
+      <w:r>
+        <w:rPr>
+          <w:sz w:val="28"/>
+          <w:szCs w:val="28"/>
+        </w:rPr>
+        <w:t xml:space="preserve"> per poter </w:t>
+      </w:r>
+      <w:r>
+        <w:rPr>
+          <w:sz w:val="28"/>
+          <w:szCs w:val="28"/>
+        </w:rPr>
+        <w:t xml:space="preserve">convertire il testo ottenuto dall’ api in un oggetto </w:t>
+      </w:r>
+      <w:r>
+        <w:rPr>
+          <w:sz w:val="28"/>
+          <w:szCs w:val="28"/>
+        </w:rPr>
+        <w:t xml:space="preserve">che </w:t>
       </w:r>
       <w:proofErr w:type="spellStart"/>
       <w:r>
@@ -297,21 +311,7 @@
           <w:sz w:val="28"/>
           <w:szCs w:val="28"/>
         </w:rPr>
-        <w:t>p</w:t>
-      </w:r>
-      <w:r>
-        <w:rPr>
-          <w:sz w:val="28"/>
-          <w:szCs w:val="28"/>
-        </w:rPr>
-        <w:t>a</w:t>
-      </w:r>
-      <w:r>
-        <w:rPr>
-          <w:sz w:val="28"/>
-          <w:szCs w:val="28"/>
-        </w:rPr>
-        <w:t>ndas</w:t>
+        <w:t>pandas</w:t>
       </w:r>
       <w:proofErr w:type="spellEnd"/>
       <w:r>
@@ -319,7 +319,7 @@
           <w:sz w:val="28"/>
           <w:szCs w:val="28"/>
         </w:rPr>
-        <w:t xml:space="preserve"> il file ricevuto </w:t>
+        <w:t xml:space="preserve"> può leggere come </w:t>
       </w:r>
       <w:proofErr w:type="spellStart"/>
       <w:r>
@@ -327,7 +327,7 @@
           <w:sz w:val="28"/>
           <w:szCs w:val="28"/>
         </w:rPr>
-        <w:t>dall’api</w:t>
+        <w:t>DataFrame</w:t>
       </w:r>
       <w:proofErr w:type="spellEnd"/>
     </w:p>
@@ -360,126 +360,126 @@
           <w:szCs w:val="28"/>
           <w:u w:val="single"/>
         </w:rPr>
-        <w:t xml:space="preserve">la libreria io non l’ho trovata negli appunti del corso, ho dovuto cercarla per poter riuscire a leggere il CSV ottenuto dalla </w:t>
-      </w:r>
-      <w:proofErr w:type="spellStart"/>
+        <w:t>la libreria io non l’ho trovata negli appunti del corso, ho dovuto cercarla</w:t>
+      </w:r>
       <w:r>
         <w:rPr>
           <w:sz w:val="28"/>
           <w:szCs w:val="28"/>
           <w:u w:val="single"/>
         </w:rPr>
-        <w:t>request</w:t>
-      </w:r>
-      <w:proofErr w:type="spellEnd"/>
-      <w:r>
-        <w:rPr>
-          <w:sz w:val="28"/>
-          <w:szCs w:val="28"/>
-          <w:u w:val="single"/>
-        </w:rPr>
-        <w:t xml:space="preserve"> con </w:t>
-      </w:r>
-      <w:proofErr w:type="spellStart"/>
-      <w:r>
-        <w:rPr>
-          <w:sz w:val="28"/>
-          <w:szCs w:val="28"/>
-          <w:u w:val="single"/>
-        </w:rPr>
-        <w:t>headers</w:t>
-      </w:r>
-      <w:proofErr w:type="spellEnd"/>
-      <w:r>
-        <w:rPr>
-          <w:sz w:val="28"/>
-          <w:szCs w:val="28"/>
-          <w:u w:val="single"/>
-        </w:rPr>
-        <w:t>.</w:t>
+        <w:t xml:space="preserve"> quando sono rimasto bloccato.</w:t>
       </w:r>
     </w:p>
     <w:p>
       <w:pPr>
         <w:rPr>
+          <w:sz w:val="28"/>
+          <w:szCs w:val="28"/>
+          <w:u w:val="single"/>
+        </w:rPr>
+      </w:pPr>
+      <w:r>
+        <w:rPr>
+          <w:sz w:val="28"/>
+          <w:szCs w:val="28"/>
+          <w:u w:val="single"/>
+        </w:rPr>
+        <w:t xml:space="preserve">Inizialmente avevo provato con </w:t>
+      </w:r>
+      <w:proofErr w:type="spellStart"/>
+      <w:r>
+        <w:rPr>
+          <w:sz w:val="28"/>
+          <w:szCs w:val="28"/>
+          <w:u w:val="single"/>
+        </w:rPr>
+        <w:t>df_istat</w:t>
+      </w:r>
+      <w:proofErr w:type="spellEnd"/>
+      <w:r>
+        <w:rPr>
+          <w:sz w:val="28"/>
+          <w:szCs w:val="28"/>
+          <w:u w:val="single"/>
+        </w:rPr>
+        <w:t xml:space="preserve"> = </w:t>
+      </w:r>
+      <w:proofErr w:type="spellStart"/>
+      <w:r>
+        <w:rPr>
+          <w:sz w:val="28"/>
+          <w:szCs w:val="28"/>
+          <w:u w:val="single"/>
+        </w:rPr>
+        <w:t>pd.read_</w:t>
+      </w:r>
+      <w:proofErr w:type="gramStart"/>
+      <w:r>
+        <w:rPr>
+          <w:sz w:val="28"/>
+          <w:szCs w:val="28"/>
+          <w:u w:val="single"/>
+        </w:rPr>
+        <w:t>csv</w:t>
+      </w:r>
+      <w:proofErr w:type="spellEnd"/>
+      <w:r>
+        <w:rPr>
+          <w:sz w:val="28"/>
+          <w:szCs w:val="28"/>
+          <w:u w:val="single"/>
+        </w:rPr>
+        <w:t>(</w:t>
+      </w:r>
+      <w:proofErr w:type="gramEnd"/>
+      <w:r>
+        <w:rPr>
+          <w:sz w:val="28"/>
+          <w:szCs w:val="28"/>
+          <w:u w:val="single"/>
+        </w:rPr>
+        <w:t xml:space="preserve">…) </w:t>
+      </w:r>
+      <w:r>
+        <w:rPr>
+          <w:sz w:val="28"/>
+          <w:szCs w:val="28"/>
+        </w:rPr>
+        <w:t>m</w:t>
+      </w:r>
+      <w:r>
+        <w:rPr>
+          <w:sz w:val="28"/>
+          <w:szCs w:val="28"/>
+        </w:rPr>
+        <w:t>a restituiva</w:t>
+      </w:r>
+      <w:r>
+        <w:rPr>
+          <w:sz w:val="28"/>
+          <w:szCs w:val="28"/>
+        </w:rPr>
+        <w:t xml:space="preserve"> </w:t>
+      </w:r>
+      <w:r>
+        <w:rPr>
+          <w:sz w:val="28"/>
+          <w:szCs w:val="28"/>
+        </w:rPr>
+        <w:t xml:space="preserve">questo errore: </w:t>
+      </w:r>
+      <w:proofErr w:type="spellStart"/>
+      <w:r>
+        <w:rPr>
           <w:i/>
           <w:iCs/>
           <w:sz w:val="28"/>
           <w:szCs w:val="28"/>
         </w:rPr>
-      </w:pPr>
-      <w:r>
-        <w:rPr>
-          <w:sz w:val="28"/>
-          <w:szCs w:val="28"/>
-        </w:rPr>
-        <w:t xml:space="preserve">Mi sono accorto che serviva approfondire la </w:t>
-      </w:r>
-      <w:proofErr w:type="spellStart"/>
-      <w:r>
-        <w:rPr>
-          <w:sz w:val="28"/>
-          <w:szCs w:val="28"/>
-        </w:rPr>
-        <w:t>strottura</w:t>
+        <w:t>Invalid</w:t>
       </w:r>
       <w:proofErr w:type="spellEnd"/>
-      <w:r>
-        <w:rPr>
-          <w:sz w:val="28"/>
-          <w:szCs w:val="28"/>
-        </w:rPr>
-        <w:t xml:space="preserve"> del codice </w:t>
-      </w:r>
-      <w:proofErr w:type="spellStart"/>
-      <w:r>
-        <w:rPr>
-          <w:sz w:val="28"/>
-          <w:szCs w:val="28"/>
-        </w:rPr>
-        <w:t>perchè</w:t>
-      </w:r>
-      <w:proofErr w:type="spellEnd"/>
-      <w:r>
-        <w:rPr>
-          <w:sz w:val="28"/>
-          <w:szCs w:val="28"/>
-        </w:rPr>
-        <w:t xml:space="preserve"> </w:t>
-      </w:r>
-      <w:proofErr w:type="spellStart"/>
-      <w:r>
-        <w:rPr>
-          <w:sz w:val="28"/>
-          <w:szCs w:val="28"/>
-        </w:rPr>
-        <w:t>pd.read_csv</w:t>
-      </w:r>
-      <w:proofErr w:type="spellEnd"/>
-      <w:r>
-        <w:rPr>
-          <w:sz w:val="28"/>
-          <w:szCs w:val="28"/>
-        </w:rPr>
-        <w:t xml:space="preserve"> mi </w:t>
-      </w:r>
-      <w:proofErr w:type="spellStart"/>
-      <w:r>
-        <w:rPr>
-          <w:sz w:val="28"/>
-          <w:szCs w:val="28"/>
-        </w:rPr>
-        <w:t>restituitva</w:t>
-      </w:r>
-      <w:proofErr w:type="spellEnd"/>
-      <w:r>
-        <w:rPr>
-          <w:sz w:val="28"/>
-          <w:szCs w:val="28"/>
-        </w:rPr>
-        <w:t xml:space="preserve"> questo errore: </w:t>
-      </w:r>
-      <w:proofErr w:type="spellStart"/>
       <w:r>
         <w:rPr>
           <w:i/>
@@ -487,9 +487,9 @@
           <w:sz w:val="28"/>
           <w:szCs w:val="28"/>
         </w:rPr>
-        <w:t>Invalid</w:t>
-      </w:r>
-      <w:proofErr w:type="spellEnd"/>
+        <w:t xml:space="preserve"> file </w:t>
+      </w:r>
+      <w:proofErr w:type="spellStart"/>
       <w:r>
         <w:rPr>
           <w:i/>
@@ -497,9 +497,9 @@
           <w:sz w:val="28"/>
           <w:szCs w:val="28"/>
         </w:rPr>
-        <w:t xml:space="preserve"> file </w:t>
-      </w:r>
-      <w:proofErr w:type="spellStart"/>
+        <w:t>path</w:t>
+      </w:r>
+      <w:proofErr w:type="spellEnd"/>
       <w:r>
         <w:rPr>
           <w:i/>
@@ -507,9 +507,9 @@
           <w:sz w:val="28"/>
           <w:szCs w:val="28"/>
         </w:rPr>
-        <w:t>path</w:t>
-      </w:r>
-      <w:proofErr w:type="spellEnd"/>
+        <w:t xml:space="preserve"> or buffer </w:t>
+      </w:r>
+      <w:proofErr w:type="spellStart"/>
       <w:r>
         <w:rPr>
           <w:i/>
@@ -517,9 +517,9 @@
           <w:sz w:val="28"/>
           <w:szCs w:val="28"/>
         </w:rPr>
-        <w:t xml:space="preserve"> or buffer </w:t>
-      </w:r>
-      <w:proofErr w:type="spellStart"/>
+        <w:t>object</w:t>
+      </w:r>
+      <w:proofErr w:type="spellEnd"/>
       <w:r>
         <w:rPr>
           <w:i/>
@@ -527,9 +527,9 @@
           <w:sz w:val="28"/>
           <w:szCs w:val="28"/>
         </w:rPr>
-        <w:t>object</w:t>
-      </w:r>
-      <w:proofErr w:type="spellEnd"/>
+        <w:t xml:space="preserve"> </w:t>
+      </w:r>
+      <w:proofErr w:type="spellStart"/>
       <w:r>
         <w:rPr>
           <w:i/>
@@ -537,9 +537,9 @@
           <w:sz w:val="28"/>
           <w:szCs w:val="28"/>
         </w:rPr>
-        <w:t xml:space="preserve"> </w:t>
-      </w:r>
-      <w:proofErr w:type="spellStart"/>
+        <w:t>type</w:t>
+      </w:r>
+      <w:proofErr w:type="spellEnd"/>
       <w:r>
         <w:rPr>
           <w:i/>
@@ -547,9 +547,10 @@
           <w:sz w:val="28"/>
           <w:szCs w:val="28"/>
         </w:rPr>
-        <w:t>type</w:t>
-      </w:r>
-      <w:proofErr w:type="spellEnd"/>
+        <w:t>: &lt;class '</w:t>
+      </w:r>
+      <w:proofErr w:type="spellStart"/>
+      <w:proofErr w:type="gramStart"/>
       <w:r>
         <w:rPr>
           <w:i/>
@@ -557,10 +558,9 @@
           <w:sz w:val="28"/>
           <w:szCs w:val="28"/>
         </w:rPr>
-        <w:t>: &lt;class '</w:t>
-      </w:r>
-      <w:proofErr w:type="spellStart"/>
-      <w:proofErr w:type="gramStart"/>
+        <w:t>requests.models</w:t>
+      </w:r>
+      <w:proofErr w:type="gramEnd"/>
       <w:r>
         <w:rPr>
           <w:i/>
@@ -568,9 +568,9 @@
           <w:sz w:val="28"/>
           <w:szCs w:val="28"/>
         </w:rPr>
-        <w:t>requests.models</w:t>
-      </w:r>
-      <w:proofErr w:type="gramEnd"/>
+        <w:t>.Response</w:t>
+      </w:r>
+      <w:proofErr w:type="spellEnd"/>
       <w:r>
         <w:rPr>
           <w:i/>
@@ -578,16 +578,6 @@
           <w:sz w:val="28"/>
           <w:szCs w:val="28"/>
         </w:rPr>
-        <w:t>.Response</w:t>
-      </w:r>
-      <w:proofErr w:type="spellEnd"/>
-      <w:r>
-        <w:rPr>
-          <w:i/>
-          <w:iCs/>
-          <w:sz w:val="28"/>
-          <w:szCs w:val="28"/>
-        </w:rPr>
         <w:t>'&gt;</w:t>
       </w:r>
     </w:p>
@@ -617,22 +607,31 @@
           <w:sz w:val="28"/>
           <w:szCs w:val="28"/>
         </w:rPr>
+        <w:t xml:space="preserve"> (</w:t>
+      </w:r>
+      <w:proofErr w:type="spellStart"/>
+      <w:r>
+        <w:rPr>
+          <w:sz w:val="28"/>
+          <w:szCs w:val="28"/>
+        </w:rPr>
+        <w:t>pandas</w:t>
+      </w:r>
+      <w:proofErr w:type="spellEnd"/>
+      <w:r>
+        <w:rPr>
+          <w:sz w:val="28"/>
+          <w:szCs w:val="28"/>
+        </w:rPr>
         <w:t xml:space="preserve"> </w:t>
       </w:r>
-      <w:r>
-        <w:rPr>
-          <w:sz w:val="28"/>
-          <w:szCs w:val="28"/>
-        </w:rPr>
-        <w:t>(</w:t>
-      </w:r>
       <w:proofErr w:type="spellStart"/>
       <w:r>
         <w:rPr>
           <w:sz w:val="28"/>
           <w:szCs w:val="28"/>
         </w:rPr>
-        <w:t>pandas</w:t>
+        <w:t>read</w:t>
       </w:r>
       <w:proofErr w:type="spellEnd"/>
       <w:r>
@@ -640,69 +639,44 @@
           <w:sz w:val="28"/>
           <w:szCs w:val="28"/>
         </w:rPr>
+        <w:t xml:space="preserve"> csv from </w:t>
+      </w:r>
+      <w:proofErr w:type="spellStart"/>
+      <w:r>
+        <w:rPr>
+          <w:sz w:val="28"/>
+          <w:szCs w:val="28"/>
+        </w:rPr>
+        <w:t>string</w:t>
+      </w:r>
+      <w:proofErr w:type="spellEnd"/>
+      <w:r>
+        <w:rPr>
+          <w:sz w:val="28"/>
+          <w:szCs w:val="28"/>
+        </w:rPr>
+        <w:t xml:space="preserve">) </w:t>
+      </w:r>
+      <w:r>
+        <w:rPr>
+          <w:sz w:val="28"/>
+          <w:szCs w:val="28"/>
+        </w:rPr>
+        <w:t xml:space="preserve">ho scoperto che per questo tipo di file/formato va usata la libreria io per leggere la stringa formato CSV. </w:t>
+      </w:r>
+      <w:r>
+        <w:rPr>
+          <w:sz w:val="28"/>
+          <w:szCs w:val="28"/>
+        </w:rPr>
         <w:t xml:space="preserve"> </w:t>
       </w:r>
-      <w:proofErr w:type="spellStart"/>
-      <w:r>
-        <w:rPr>
-          <w:sz w:val="28"/>
-          <w:szCs w:val="28"/>
-        </w:rPr>
-        <w:t>read</w:t>
-      </w:r>
-      <w:proofErr w:type="spellEnd"/>
-      <w:r>
-        <w:rPr>
-          <w:sz w:val="28"/>
-          <w:szCs w:val="28"/>
-        </w:rPr>
-        <w:t xml:space="preserve"> csv from </w:t>
-      </w:r>
-      <w:proofErr w:type="spellStart"/>
-      <w:proofErr w:type="gramStart"/>
-      <w:r>
-        <w:rPr>
-          <w:sz w:val="28"/>
-          <w:szCs w:val="28"/>
-        </w:rPr>
-        <w:t>string</w:t>
-      </w:r>
-      <w:proofErr w:type="spellEnd"/>
-      <w:r>
-        <w:rPr>
-          <w:sz w:val="28"/>
-          <w:szCs w:val="28"/>
-        </w:rPr>
-        <w:t xml:space="preserve">) </w:t>
-      </w:r>
-      <w:r>
-        <w:rPr>
-          <w:sz w:val="28"/>
-          <w:szCs w:val="28"/>
-        </w:rPr>
-        <w:t xml:space="preserve"> ho</w:t>
-      </w:r>
-      <w:proofErr w:type="gramEnd"/>
-      <w:r>
-        <w:rPr>
-          <w:sz w:val="28"/>
-          <w:szCs w:val="28"/>
-        </w:rPr>
-        <w:t xml:space="preserve"> scoperto che per questo tipo di file/formato va usata la libreria io per leggere la stringa formato CSV. </w:t>
-      </w:r>
-      <w:r>
-        <w:rPr>
-          <w:sz w:val="28"/>
-          <w:szCs w:val="28"/>
-        </w:rPr>
-        <w:t xml:space="preserve"> Ecco le fonti utilizzate</w:t>
-      </w:r>
-      <w:r>
-        <w:rPr>
-          <w:sz w:val="28"/>
-          <w:szCs w:val="28"/>
-        </w:rPr>
-        <w:t>:</w:t>
+      <w:r>
+        <w:rPr>
+          <w:sz w:val="28"/>
+          <w:szCs w:val="28"/>
+        </w:rPr>
+        <w:t>Ecco le fonti utilizzate in sequenza:</w:t>
       </w:r>
     </w:p>
     <w:p>
@@ -750,6 +724,22 @@
           <w:szCs w:val="28"/>
         </w:rPr>
       </w:pPr>
+      <w:proofErr w:type="gramStart"/>
+      <w:r>
+        <w:rPr>
+          <w:sz w:val="28"/>
+          <w:szCs w:val="28"/>
+        </w:rPr>
+        <w:t>E’</w:t>
+      </w:r>
+      <w:proofErr w:type="gramEnd"/>
+      <w:r>
+        <w:rPr>
+          <w:sz w:val="28"/>
+          <w:szCs w:val="28"/>
+        </w:rPr>
+        <w:t xml:space="preserve"> stata la</w:t>
+      </w:r>
       <w:r>
         <w:rPr>
           <w:sz w:val="28"/>
@@ -769,14 +759,7 @@
           <w:sz w:val="28"/>
           <w:szCs w:val="28"/>
         </w:rPr>
-        <w:t xml:space="preserve"> </w:t>
-      </w:r>
-      <w:r>
-        <w:rPr>
-          <w:sz w:val="28"/>
-          <w:szCs w:val="28"/>
-        </w:rPr>
-        <w:sym w:font="Wingdings" w:char="F0E0"/>
+        <w:t>,</w:t>
       </w:r>
       <w:r>
         <w:rPr>
@@ -809,6 +792,95 @@
           <w:szCs w:val="28"/>
         </w:rPr>
         <w:t>perché il resto della sintassi era uguale a quella già vista/usata</w:t>
+      </w:r>
+      <w:r>
+        <w:rPr>
+          <w:sz w:val="28"/>
+          <w:szCs w:val="28"/>
+        </w:rPr>
+        <w:t xml:space="preserve">. </w:t>
+      </w:r>
+    </w:p>
+    <w:p>
+      <w:pPr>
+        <w:pStyle w:val="ListParagraph"/>
+        <w:rPr>
+          <w:sz w:val="28"/>
+          <w:szCs w:val="28"/>
+        </w:rPr>
+      </w:pPr>
+      <w:r>
+        <w:rPr>
+          <w:sz w:val="28"/>
+          <w:szCs w:val="28"/>
+        </w:rPr>
+        <w:t>All’inizio non funzionava allora (andando a tentativi) a ho provato con prima .</w:t>
+      </w:r>
+      <w:proofErr w:type="spellStart"/>
+      <w:r>
+        <w:rPr>
+          <w:sz w:val="28"/>
+          <w:szCs w:val="28"/>
+        </w:rPr>
+        <w:t>str</w:t>
+      </w:r>
+      <w:proofErr w:type="spellEnd"/>
+      <w:r>
+        <w:rPr>
+          <w:sz w:val="28"/>
+          <w:szCs w:val="28"/>
+        </w:rPr>
+        <w:t xml:space="preserve"> e poi .text ed ha funzionato. </w:t>
+      </w:r>
+    </w:p>
+    <w:p>
+      <w:pPr>
+        <w:pStyle w:val="ListParagraph"/>
+        <w:rPr>
+          <w:sz w:val="28"/>
+          <w:szCs w:val="28"/>
+        </w:rPr>
+      </w:pPr>
+      <w:r>
+        <w:rPr>
+          <w:sz w:val="28"/>
+          <w:szCs w:val="28"/>
+        </w:rPr>
+        <w:t xml:space="preserve">Fatto questo ho verificato sulla documentazione se effettivamente </w:t>
+      </w:r>
+      <w:proofErr w:type="spellStart"/>
+      <w:proofErr w:type="gramStart"/>
+      <w:r>
+        <w:rPr>
+          <w:sz w:val="28"/>
+          <w:szCs w:val="28"/>
+        </w:rPr>
+        <w:t>io.StringIO</w:t>
+      </w:r>
+      <w:proofErr w:type="spellEnd"/>
+      <w:proofErr w:type="gramEnd"/>
+      <w:r>
+        <w:rPr>
+          <w:sz w:val="28"/>
+          <w:szCs w:val="28"/>
+        </w:rPr>
+        <w:t xml:space="preserve"> fosse corretto o meno da utilizzare con </w:t>
+      </w:r>
+      <w:proofErr w:type="spellStart"/>
+      <w:r>
+        <w:rPr>
+          <w:sz w:val="28"/>
+          <w:szCs w:val="28"/>
+        </w:rPr>
+        <w:t>pd.read_csv</w:t>
+      </w:r>
+      <w:proofErr w:type="spellEnd"/>
+      <w:r>
+        <w:rPr>
+          <w:sz w:val="28"/>
+          <w:szCs w:val="28"/>
+        </w:rPr>
+        <w:t xml:space="preserve"> e ho cercato quindi nella documentazione ufficiale:</w:t>
       </w:r>
     </w:p>
     <w:p>
@@ -823,202 +895,62 @@
           <w:szCs w:val="28"/>
         </w:rPr>
       </w:pPr>
-      <w:hyperlink r:id="rId6" w:history="1">
+      <w:hyperlink r:id="rId6" w:anchor="pandas.read_csv" w:history="1">
         <w:r>
           <w:rPr>
             <w:rStyle w:val="Hyperlink"/>
             <w:sz w:val="28"/>
             <w:szCs w:val="28"/>
           </w:rPr>
-          <w:t>https://pandas.pydata.org/pandas-docs/stable/reference/api/pandas.read_csv.html#pandas.read_csv</w:t>
+          <w:t>https://pandas.pydata.org/pa</w:t>
         </w:r>
-      </w:hyperlink>
-      <w:r>
-        <w:rPr>
-          <w:sz w:val="28"/>
-          <w:szCs w:val="28"/>
-        </w:rPr>
-        <w:t xml:space="preserve"> </w:t>
-      </w:r>
-      <w:r>
-        <w:rPr>
-          <w:sz w:val="28"/>
-          <w:szCs w:val="28"/>
-        </w:rPr>
-        <w:t>:</w:t>
-      </w:r>
-    </w:p>
-    <w:p>
-      <w:pPr>
-        <w:pStyle w:val="ListParagraph"/>
-        <w:rPr>
-          <w:sz w:val="28"/>
-          <w:szCs w:val="28"/>
-        </w:rPr>
-      </w:pPr>
-      <w:r>
-        <w:rPr>
-          <w:sz w:val="28"/>
-          <w:szCs w:val="28"/>
-        </w:rPr>
-        <w:t xml:space="preserve"> fo</w:t>
-      </w:r>
-      <w:r>
-        <w:rPr>
-          <w:sz w:val="28"/>
-          <w:szCs w:val="28"/>
-        </w:rPr>
-        <w:t>nte usata per validare l’utilizzo della libreria io.</w:t>
-      </w:r>
-      <w:r>
-        <w:rPr>
-          <w:sz w:val="28"/>
-          <w:szCs w:val="28"/>
-        </w:rPr>
-        <w:t xml:space="preserve"> </w:t>
-      </w:r>
-      <w:r>
-        <w:rPr>
-          <w:sz w:val="28"/>
-          <w:szCs w:val="28"/>
-          <w:lang w:val="en-GB"/>
-        </w:rPr>
-        <w:t xml:space="preserve">La </w:t>
-      </w:r>
-      <w:proofErr w:type="spellStart"/>
-      <w:r>
-        <w:rPr>
-          <w:sz w:val="28"/>
-          <w:szCs w:val="28"/>
-          <w:lang w:val="en-GB"/>
-        </w:rPr>
-        <w:t>documentazione</w:t>
-      </w:r>
-      <w:proofErr w:type="spellEnd"/>
-      <w:r>
-        <w:rPr>
-          <w:sz w:val="28"/>
-          <w:szCs w:val="28"/>
-          <w:lang w:val="en-GB"/>
-        </w:rPr>
-        <w:t xml:space="preserve"> </w:t>
-      </w:r>
-      <w:proofErr w:type="spellStart"/>
-      <w:r>
-        <w:rPr>
-          <w:sz w:val="28"/>
-          <w:szCs w:val="28"/>
-          <w:lang w:val="en-GB"/>
-        </w:rPr>
-        <w:t>riportava</w:t>
-      </w:r>
-      <w:proofErr w:type="spellEnd"/>
-      <w:r>
-        <w:rPr>
-          <w:sz w:val="28"/>
-          <w:szCs w:val="28"/>
-          <w:lang w:val="en-GB"/>
-        </w:rPr>
-        <w:t xml:space="preserve">: </w:t>
-      </w:r>
-      <w:r>
-        <w:rPr>
-          <w:sz w:val="28"/>
-          <w:szCs w:val="28"/>
-          <w:lang w:val="en-GB"/>
-        </w:rPr>
-        <w:t>By file-like object, we refer to objects with a </w:t>
-      </w:r>
-      <w:proofErr w:type="gramStart"/>
-      <w:r>
-        <w:rPr>
-          <w:sz w:val="28"/>
-          <w:szCs w:val="28"/>
-          <w:lang w:val="en-GB"/>
-        </w:rPr>
-        <w:t>read(</w:t>
-      </w:r>
-      <w:proofErr w:type="gramEnd"/>
-      <w:r>
-        <w:rPr>
-          <w:sz w:val="28"/>
-          <w:szCs w:val="28"/>
-          <w:lang w:val="en-GB"/>
-        </w:rPr>
-        <w:t xml:space="preserve">) method, such as a file handle (e.g. via </w:t>
-      </w:r>
-      <w:proofErr w:type="spellStart"/>
-      <w:r>
-        <w:rPr>
-          <w:sz w:val="28"/>
-          <w:szCs w:val="28"/>
-          <w:lang w:val="en-GB"/>
-        </w:rPr>
-        <w:t>builtin</w:t>
-      </w:r>
-      <w:proofErr w:type="spellEnd"/>
-      <w:r>
-        <w:rPr>
-          <w:sz w:val="28"/>
-          <w:szCs w:val="28"/>
-          <w:lang w:val="en-GB"/>
-        </w:rPr>
-        <w:t> open function) or </w:t>
-      </w:r>
-      <w:proofErr w:type="spellStart"/>
-      <w:r>
-        <w:rPr>
-          <w:sz w:val="28"/>
-          <w:szCs w:val="28"/>
-          <w:lang w:val="en-GB"/>
-        </w:rPr>
-        <w:t>StringIO</w:t>
-      </w:r>
-      <w:proofErr w:type="spellEnd"/>
-      <w:r>
-        <w:rPr>
-          <w:sz w:val="28"/>
-          <w:szCs w:val="28"/>
-          <w:lang w:val="en-GB"/>
-        </w:rPr>
-        <w:t>.</w:t>
-      </w:r>
-      <w:r>
-        <w:rPr>
-          <w:sz w:val="28"/>
-          <w:szCs w:val="28"/>
-          <w:lang w:val="en-GB"/>
-        </w:rPr>
-        <w:t xml:space="preserve"> </w:t>
-      </w:r>
-      <w:r>
-        <w:rPr>
-          <w:sz w:val="28"/>
-          <w:szCs w:val="28"/>
-        </w:rPr>
-        <w:t>E da qui ho trovato la terza fonte dati che validato l’utilizzo della libreria io:</w:t>
-      </w:r>
-    </w:p>
-    <w:p>
-      <w:pPr>
-        <w:pStyle w:val="ListParagraph"/>
-        <w:numPr>
-          <w:ilvl w:val="0"/>
-          <w:numId w:val="2"/>
-        </w:numPr>
-        <w:rPr>
-          <w:sz w:val="28"/>
-          <w:szCs w:val="28"/>
-        </w:rPr>
-      </w:pPr>
-      <w:hyperlink r:id="rId7" w:history="1">
         <w:r>
           <w:rPr>
             <w:rStyle w:val="Hyperlink"/>
             <w:sz w:val="28"/>
             <w:szCs w:val="28"/>
           </w:rPr>
-          <w:t>https://pandas.pydata.org/pandas-docs/stable/user_guide/io.html</w:t>
+          <w:t>n</w:t>
+        </w:r>
+        <w:r>
+          <w:rPr>
+            <w:rStyle w:val="Hyperlink"/>
+            <w:sz w:val="28"/>
+            <w:szCs w:val="28"/>
+          </w:rPr>
+          <w:t>das-docs/s</w:t>
+        </w:r>
+        <w:r>
+          <w:rPr>
+            <w:rStyle w:val="Hyperlink"/>
+            <w:sz w:val="28"/>
+            <w:szCs w:val="28"/>
+          </w:rPr>
+          <w:t>t</w:t>
+        </w:r>
+        <w:r>
+          <w:rPr>
+            <w:rStyle w:val="Hyperlink"/>
+            <w:sz w:val="28"/>
+            <w:szCs w:val="28"/>
+          </w:rPr>
+          <w:t>able/reference/api/</w:t>
+        </w:r>
+        <w:r>
+          <w:rPr>
+            <w:rStyle w:val="Hyperlink"/>
+            <w:sz w:val="28"/>
+            <w:szCs w:val="28"/>
+          </w:rPr>
+          <w:t>p</w:t>
+        </w:r>
+        <w:r>
+          <w:rPr>
+            <w:rStyle w:val="Hyperlink"/>
+            <w:sz w:val="28"/>
+            <w:szCs w:val="28"/>
+          </w:rPr>
+          <w:t>andas.read_csv.html#pandas.read_csv</w:t>
         </w:r>
       </w:hyperlink>
       <w:r>
@@ -1026,6 +958,13 @@
           <w:sz w:val="28"/>
           <w:szCs w:val="28"/>
         </w:rPr>
+        <w:t xml:space="preserve"> </w:t>
+      </w:r>
+      <w:r>
+        <w:rPr>
+          <w:sz w:val="28"/>
+          <w:szCs w:val="28"/>
+        </w:rPr>
         <w:t>:</w:t>
       </w:r>
     </w:p>
@@ -1041,9 +980,30 @@
         <w:rPr>
           <w:sz w:val="28"/>
           <w:szCs w:val="28"/>
+        </w:rPr>
+        <w:t xml:space="preserve"> fonte usata per validare l’utilizzo della libreria io</w:t>
+      </w:r>
+      <w:r>
+        <w:rPr>
+          <w:sz w:val="28"/>
+          <w:szCs w:val="28"/>
+        </w:rPr>
+        <w:t>.</w:t>
+      </w:r>
+      <w:r>
+        <w:rPr>
+          <w:sz w:val="28"/>
+          <w:szCs w:val="28"/>
+        </w:rPr>
+        <w:t xml:space="preserve"> </w:t>
+      </w:r>
+      <w:r>
+        <w:rPr>
+          <w:sz w:val="28"/>
+          <w:szCs w:val="28"/>
           <w:lang w:val="en-GB"/>
         </w:rPr>
-        <w:t xml:space="preserve">la </w:t>
+        <w:t xml:space="preserve">La </w:t>
       </w:r>
       <w:proofErr w:type="spellStart"/>
       <w:r>
@@ -1052,7 +1012,7 @@
           <w:szCs w:val="28"/>
           <w:lang w:val="en-GB"/>
         </w:rPr>
-        <w:t>conferma</w:t>
+        <w:t>documentazione</w:t>
       </w:r>
       <w:proofErr w:type="spellEnd"/>
       <w:r>
@@ -1070,7 +1030,7 @@
           <w:szCs w:val="28"/>
           <w:lang w:val="en-GB"/>
         </w:rPr>
-        <w:t>che</w:t>
+        <w:t>riportava</w:t>
       </w:r>
       <w:proofErr w:type="spellEnd"/>
       <w:r>
@@ -1079,7 +1039,25 @@
           <w:szCs w:val="28"/>
           <w:lang w:val="en-GB"/>
         </w:rPr>
-        <w:t xml:space="preserve"> </w:t>
+        <w:t>: By file-like object, we refer to objects with a </w:t>
+      </w:r>
+      <w:proofErr w:type="gramStart"/>
+      <w:r>
+        <w:rPr>
+          <w:sz w:val="28"/>
+          <w:szCs w:val="28"/>
+          <w:lang w:val="en-GB"/>
+        </w:rPr>
+        <w:t>read(</w:t>
+      </w:r>
+      <w:proofErr w:type="gramEnd"/>
+      <w:r>
+        <w:rPr>
+          <w:sz w:val="28"/>
+          <w:szCs w:val="28"/>
+          <w:lang w:val="en-GB"/>
+        </w:rPr>
+        <w:t xml:space="preserve">) method, such as a file handle (e.g. via </w:t>
       </w:r>
       <w:proofErr w:type="spellStart"/>
       <w:r>
@@ -1088,7 +1066,7 @@
           <w:szCs w:val="28"/>
           <w:lang w:val="en-GB"/>
         </w:rPr>
-        <w:t>ho</w:t>
+        <w:t>builtin</w:t>
       </w:r>
       <w:proofErr w:type="spellEnd"/>
       <w:r>
@@ -1097,7 +1075,7 @@
           <w:szCs w:val="28"/>
           <w:lang w:val="en-GB"/>
         </w:rPr>
-        <w:t xml:space="preserve"> </w:t>
+        <w:t> open function) or </w:t>
       </w:r>
       <w:proofErr w:type="spellStart"/>
       <w:r>
@@ -1106,7 +1084,7 @@
           <w:szCs w:val="28"/>
           <w:lang w:val="en-GB"/>
         </w:rPr>
-        <w:t>avuto</w:t>
+        <w:t>StringIO</w:t>
       </w:r>
       <w:proofErr w:type="spellEnd"/>
       <w:r>
@@ -1115,317 +1093,7 @@
           <w:szCs w:val="28"/>
           <w:lang w:val="en-GB"/>
         </w:rPr>
-        <w:t xml:space="preserve">: </w:t>
-      </w:r>
-      <w:r>
-        <w:rPr>
-          <w:sz w:val="28"/>
-          <w:szCs w:val="28"/>
-          <w:lang w:val="en-GB"/>
-        </w:rPr>
-        <w:t xml:space="preserve">The pandas I/O API is a set of </w:t>
-      </w:r>
-      <w:proofErr w:type="gramStart"/>
-      <w:r>
-        <w:rPr>
-          <w:sz w:val="28"/>
-          <w:szCs w:val="28"/>
-          <w:lang w:val="en-GB"/>
-        </w:rPr>
-        <w:t>top level</w:t>
-      </w:r>
-      <w:proofErr w:type="gramEnd"/>
-      <w:r>
-        <w:rPr>
-          <w:sz w:val="28"/>
-          <w:szCs w:val="28"/>
-          <w:lang w:val="en-GB"/>
-        </w:rPr>
-        <w:t> reader functions accessed like </w:t>
-      </w:r>
-      <w:proofErr w:type="spellStart"/>
-      <w:r>
-        <w:rPr>
-          <w:sz w:val="28"/>
-          <w:szCs w:val="28"/>
-        </w:rPr>
-        <w:fldChar w:fldCharType="begin"/>
-      </w:r>
-      <w:r>
-        <w:rPr>
-          <w:sz w:val="28"/>
-          <w:szCs w:val="28"/>
-          <w:lang w:val="en-GB"/>
-        </w:rPr>
-        <w:instrText>HYPERLINK "https://pandas.pydata.org/pandas-docs/stable/reference/api/pandas.read_csv.html" \l "pandas.read_csv" \o "pandas.read_csv"</w:instrText>
-      </w:r>
-      <w:r>
-        <w:rPr>
-          <w:sz w:val="28"/>
-          <w:szCs w:val="28"/>
-        </w:rPr>
-      </w:r>
-      <w:r>
-        <w:rPr>
-          <w:sz w:val="28"/>
-          <w:szCs w:val="28"/>
-        </w:rPr>
-        <w:fldChar w:fldCharType="separate"/>
-      </w:r>
-      <w:proofErr w:type="gramStart"/>
-      <w:r>
-        <w:rPr>
-          <w:rStyle w:val="Hyperlink"/>
-          <w:b/>
-          <w:bCs/>
-          <w:sz w:val="28"/>
-          <w:szCs w:val="28"/>
-          <w:lang w:val="en-GB"/>
-        </w:rPr>
-        <w:t>pandas.read</w:t>
-      </w:r>
-      <w:proofErr w:type="gramEnd"/>
-      <w:r>
-        <w:rPr>
-          <w:rStyle w:val="Hyperlink"/>
-          <w:b/>
-          <w:bCs/>
-          <w:sz w:val="28"/>
-          <w:szCs w:val="28"/>
-          <w:lang w:val="en-GB"/>
-        </w:rPr>
-        <w:t>_</w:t>
-      </w:r>
-      <w:proofErr w:type="gramStart"/>
-      <w:r>
-        <w:rPr>
-          <w:rStyle w:val="Hyperlink"/>
-          <w:b/>
-          <w:bCs/>
-          <w:sz w:val="28"/>
-          <w:szCs w:val="28"/>
-          <w:lang w:val="en-GB"/>
-        </w:rPr>
-        <w:t>csv</w:t>
-      </w:r>
-      <w:proofErr w:type="spellEnd"/>
-      <w:r>
-        <w:rPr>
-          <w:rStyle w:val="Hyperlink"/>
-          <w:b/>
-          <w:bCs/>
-          <w:sz w:val="28"/>
-          <w:szCs w:val="28"/>
-          <w:lang w:val="en-GB"/>
-        </w:rPr>
-        <w:t>(</w:t>
-      </w:r>
-      <w:proofErr w:type="gramEnd"/>
-      <w:r>
-        <w:rPr>
-          <w:rStyle w:val="Hyperlink"/>
-          <w:b/>
-          <w:bCs/>
-          <w:sz w:val="28"/>
-          <w:szCs w:val="28"/>
-          <w:lang w:val="en-GB"/>
-        </w:rPr>
-        <w:t>)</w:t>
-      </w:r>
-      <w:r>
-        <w:rPr>
-          <w:sz w:val="28"/>
-          <w:szCs w:val="28"/>
-        </w:rPr>
-        <w:fldChar w:fldCharType="end"/>
-      </w:r>
-      <w:r>
-        <w:rPr>
-          <w:sz w:val="28"/>
-          <w:szCs w:val="28"/>
-          <w:lang w:val="en-GB"/>
-        </w:rPr>
-        <w:t xml:space="preserve"> that generally return a </w:t>
-      </w:r>
-      <w:proofErr w:type="gramStart"/>
-      <w:r>
-        <w:rPr>
-          <w:sz w:val="28"/>
-          <w:szCs w:val="28"/>
-          <w:lang w:val="en-GB"/>
-        </w:rPr>
-        <w:t>pandas</w:t>
-      </w:r>
-      <w:proofErr w:type="gramEnd"/>
-      <w:r>
-        <w:rPr>
-          <w:sz w:val="28"/>
-          <w:szCs w:val="28"/>
-          <w:lang w:val="en-GB"/>
-        </w:rPr>
-        <w:t xml:space="preserve"> object. The corresponding writer functions are object methods that are accessed like </w:t>
-      </w:r>
-      <w:proofErr w:type="spellStart"/>
-      <w:r>
-        <w:rPr>
-          <w:sz w:val="28"/>
-          <w:szCs w:val="28"/>
-        </w:rPr>
-        <w:fldChar w:fldCharType="begin"/>
-      </w:r>
-      <w:r>
-        <w:rPr>
-          <w:sz w:val="28"/>
-          <w:szCs w:val="28"/>
-          <w:lang w:val="en-GB"/>
-        </w:rPr>
-        <w:instrText>HYPERLINK "https://pandas.pydata.org/pandas-docs/stable/reference/api/pandas.DataFrame.to_csv.html" \l "pandas.DataFrame.to_csv" \o "pandas.DataFrame.to_csv"</w:instrText>
-      </w:r>
-      <w:r>
-        <w:rPr>
-          <w:sz w:val="28"/>
-          <w:szCs w:val="28"/>
-        </w:rPr>
-      </w:r>
-      <w:r>
-        <w:rPr>
-          <w:sz w:val="28"/>
-          <w:szCs w:val="28"/>
-        </w:rPr>
-        <w:fldChar w:fldCharType="separate"/>
-      </w:r>
-      <w:r>
-        <w:rPr>
-          <w:rStyle w:val="Hyperlink"/>
-          <w:b/>
-          <w:bCs/>
-          <w:sz w:val="28"/>
-          <w:szCs w:val="28"/>
-          <w:lang w:val="en-GB"/>
-        </w:rPr>
-        <w:t>DataFrame.to_</w:t>
-      </w:r>
-      <w:proofErr w:type="gramStart"/>
-      <w:r>
-        <w:rPr>
-          <w:rStyle w:val="Hyperlink"/>
-          <w:b/>
-          <w:bCs/>
-          <w:sz w:val="28"/>
-          <w:szCs w:val="28"/>
-          <w:lang w:val="en-GB"/>
-        </w:rPr>
-        <w:t>csv</w:t>
-      </w:r>
-      <w:proofErr w:type="spellEnd"/>
-      <w:r>
-        <w:rPr>
-          <w:rStyle w:val="Hyperlink"/>
-          <w:b/>
-          <w:bCs/>
-          <w:sz w:val="28"/>
-          <w:szCs w:val="28"/>
-          <w:lang w:val="en-GB"/>
-        </w:rPr>
-        <w:t>(</w:t>
-      </w:r>
-      <w:proofErr w:type="gramEnd"/>
-      <w:r>
-        <w:rPr>
-          <w:rStyle w:val="Hyperlink"/>
-          <w:b/>
-          <w:bCs/>
-          <w:sz w:val="28"/>
-          <w:szCs w:val="28"/>
-          <w:lang w:val="en-GB"/>
-        </w:rPr>
-        <w:t>)</w:t>
-      </w:r>
-      <w:r>
-        <w:rPr>
-          <w:sz w:val="28"/>
-          <w:szCs w:val="28"/>
-        </w:rPr>
-        <w:fldChar w:fldCharType="end"/>
-      </w:r>
-      <w:r>
-        <w:rPr>
-          <w:sz w:val="28"/>
-          <w:szCs w:val="28"/>
-          <w:lang w:val="en-GB"/>
-        </w:rPr>
-        <w:t xml:space="preserve">. </w:t>
-      </w:r>
-      <w:r>
-        <w:rPr>
-          <w:sz w:val="28"/>
-          <w:szCs w:val="28"/>
-        </w:rPr>
-        <w:t xml:space="preserve">Below </w:t>
-      </w:r>
-      <w:proofErr w:type="spellStart"/>
-      <w:r>
-        <w:rPr>
-          <w:sz w:val="28"/>
-          <w:szCs w:val="28"/>
-        </w:rPr>
-        <w:t>is</w:t>
-      </w:r>
-      <w:proofErr w:type="spellEnd"/>
-      <w:r>
-        <w:rPr>
-          <w:sz w:val="28"/>
-          <w:szCs w:val="28"/>
-        </w:rPr>
-        <w:t xml:space="preserve"> a </w:t>
-      </w:r>
-      <w:proofErr w:type="spellStart"/>
-      <w:r>
-        <w:rPr>
-          <w:sz w:val="28"/>
-          <w:szCs w:val="28"/>
-        </w:rPr>
-        <w:t>table</w:t>
-      </w:r>
-      <w:proofErr w:type="spellEnd"/>
-      <w:r>
-        <w:rPr>
-          <w:sz w:val="28"/>
-          <w:szCs w:val="28"/>
-        </w:rPr>
-        <w:t xml:space="preserve"> </w:t>
-      </w:r>
-      <w:proofErr w:type="spellStart"/>
-      <w:r>
-        <w:rPr>
-          <w:sz w:val="28"/>
-          <w:szCs w:val="28"/>
-        </w:rPr>
-        <w:t>containing</w:t>
-      </w:r>
-      <w:proofErr w:type="spellEnd"/>
-      <w:r>
-        <w:rPr>
-          <w:sz w:val="28"/>
-          <w:szCs w:val="28"/>
-        </w:rPr>
-        <w:t xml:space="preserve"> </w:t>
-      </w:r>
-      <w:proofErr w:type="spellStart"/>
-      <w:r>
-        <w:rPr>
-          <w:sz w:val="28"/>
-          <w:szCs w:val="28"/>
-        </w:rPr>
-        <w:t>available</w:t>
-      </w:r>
-      <w:proofErr w:type="spellEnd"/>
-      <w:r>
-        <w:rPr>
-          <w:sz w:val="28"/>
-          <w:szCs w:val="28"/>
-        </w:rPr>
-        <w:t> readers and writers.</w:t>
+        <w:t>.</w:t>
       </w:r>
     </w:p>
     <w:p>
@@ -1449,28 +1117,16 @@
           <w:bCs/>
           <w:sz w:val="44"/>
           <w:szCs w:val="44"/>
+          <w:highlight w:val="yellow"/>
         </w:rPr>
       </w:pPr>
       <w:r>
         <w:rPr>
           <w:sz w:val="44"/>
           <w:szCs w:val="44"/>
-        </w:rPr>
-        <w:t xml:space="preserve">Fase </w:t>
-      </w:r>
-      <w:r>
-        <w:rPr>
-          <w:sz w:val="44"/>
-          <w:szCs w:val="44"/>
-        </w:rPr>
-        <w:t>2</w:t>
-      </w:r>
-      <w:r>
-        <w:rPr>
-          <w:sz w:val="44"/>
-          <w:szCs w:val="44"/>
-        </w:rPr>
-        <w:t xml:space="preserve">: </w:t>
+          <w:highlight w:val="yellow"/>
+        </w:rPr>
+        <w:t xml:space="preserve">Fase 2: </w:t>
       </w:r>
       <w:r>
         <w:rPr>
@@ -1478,6 +1134,7 @@
           <w:bCs/>
           <w:sz w:val="44"/>
           <w:szCs w:val="44"/>
+          <w:highlight w:val="yellow"/>
         </w:rPr>
         <w:t>Verifica e pulizia dati ISTAT</w:t>
       </w:r>
@@ -1576,6 +1233,21 @@
         </w:rPr>
         <w:t xml:space="preserve"> </w:t>
       </w:r>
+      <w:r>
+        <w:rPr>
+          <w:sz w:val="28"/>
+          <w:szCs w:val="28"/>
+        </w:rPr>
+        <w:t xml:space="preserve">quindi facendo pure riferimento alla citazione sul file d’esame (Take some time to read through the different columns and understand what kind of information is included…..) </w:t>
+      </w:r>
+      <w:r>
+        <w:rPr>
+          <w:sz w:val="28"/>
+          <w:szCs w:val="28"/>
+          <w:lang w:val="en-GB"/>
+        </w:rPr>
+        <w:t xml:space="preserve">mi </w:t>
+      </w:r>
       <w:proofErr w:type="spellStart"/>
       <w:r>
         <w:rPr>
@@ -1583,7 +1255,7 @@
           <w:szCs w:val="28"/>
           <w:lang w:val="en-GB"/>
         </w:rPr>
-        <w:t>quindi</w:t>
+        <w:t>sono</w:t>
       </w:r>
       <w:proofErr w:type="spellEnd"/>
       <w:r>
@@ -1601,7 +1273,7 @@
           <w:szCs w:val="28"/>
           <w:lang w:val="en-GB"/>
         </w:rPr>
-        <w:t>facendo</w:t>
+        <w:t>messo</w:t>
       </w:r>
       <w:proofErr w:type="spellEnd"/>
       <w:r>
@@ -1610,7 +1282,7 @@
           <w:szCs w:val="28"/>
           <w:lang w:val="en-GB"/>
         </w:rPr>
-        <w:t xml:space="preserve"> pure </w:t>
+        <w:t xml:space="preserve"> a </w:t>
       </w:r>
       <w:proofErr w:type="spellStart"/>
       <w:r>
@@ -1619,7 +1291,7 @@
           <w:szCs w:val="28"/>
           <w:lang w:val="en-GB"/>
         </w:rPr>
-        <w:t>riferimento</w:t>
+        <w:t>cercare</w:t>
       </w:r>
       <w:proofErr w:type="spellEnd"/>
       <w:r>
@@ -1628,123 +1300,7 @@
           <w:szCs w:val="28"/>
           <w:lang w:val="en-GB"/>
         </w:rPr>
-        <w:t xml:space="preserve"> alla </w:t>
-      </w:r>
-      <w:proofErr w:type="spellStart"/>
-      <w:r>
-        <w:rPr>
-          <w:sz w:val="28"/>
-          <w:szCs w:val="28"/>
-          <w:lang w:val="en-GB"/>
-        </w:rPr>
-        <w:t>citazione</w:t>
-      </w:r>
-      <w:proofErr w:type="spellEnd"/>
-      <w:r>
-        <w:rPr>
-          <w:sz w:val="28"/>
-          <w:szCs w:val="28"/>
-          <w:lang w:val="en-GB"/>
-        </w:rPr>
-        <w:t xml:space="preserve"> </w:t>
-      </w:r>
-      <w:proofErr w:type="spellStart"/>
-      <w:r>
-        <w:rPr>
-          <w:sz w:val="28"/>
-          <w:szCs w:val="28"/>
-          <w:lang w:val="en-GB"/>
-        </w:rPr>
-        <w:t>sul</w:t>
-      </w:r>
-      <w:proofErr w:type="spellEnd"/>
-      <w:r>
-        <w:rPr>
-          <w:sz w:val="28"/>
-          <w:szCs w:val="28"/>
-          <w:lang w:val="en-GB"/>
-        </w:rPr>
-        <w:t xml:space="preserve"> file </w:t>
-      </w:r>
-      <w:proofErr w:type="spellStart"/>
-      <w:r>
-        <w:rPr>
-          <w:sz w:val="28"/>
-          <w:szCs w:val="28"/>
-          <w:lang w:val="en-GB"/>
-        </w:rPr>
-        <w:t>d’esame</w:t>
-      </w:r>
-      <w:proofErr w:type="spellEnd"/>
-      <w:r>
-        <w:rPr>
-          <w:sz w:val="28"/>
-          <w:szCs w:val="28"/>
-          <w:lang w:val="en-GB"/>
-        </w:rPr>
-        <w:t xml:space="preserve"> (</w:t>
-      </w:r>
-      <w:r>
-        <w:rPr>
-          <w:sz w:val="28"/>
-          <w:szCs w:val="28"/>
-          <w:lang w:val="en-GB"/>
-        </w:rPr>
-        <w:t>Take some time to read through the different columns and understand what kind of information is included</w:t>
-      </w:r>
-      <w:proofErr w:type="gramStart"/>
-      <w:r>
-        <w:rPr>
-          <w:sz w:val="28"/>
-          <w:szCs w:val="28"/>
-          <w:lang w:val="en-GB"/>
-        </w:rPr>
-        <w:t>…..</w:t>
-      </w:r>
-      <w:proofErr w:type="gramEnd"/>
-      <w:r>
-        <w:rPr>
-          <w:sz w:val="28"/>
-          <w:szCs w:val="28"/>
-          <w:lang w:val="en-GB"/>
-        </w:rPr>
-        <w:t xml:space="preserve">) mi </w:t>
-      </w:r>
-      <w:proofErr w:type="spellStart"/>
-      <w:r>
-        <w:rPr>
-          <w:sz w:val="28"/>
-          <w:szCs w:val="28"/>
-          <w:lang w:val="en-GB"/>
-        </w:rPr>
-        <w:t>sono</w:t>
-      </w:r>
-      <w:proofErr w:type="spellEnd"/>
-      <w:r>
-        <w:rPr>
-          <w:sz w:val="28"/>
-          <w:szCs w:val="28"/>
-          <w:lang w:val="en-GB"/>
-        </w:rPr>
-        <w:t xml:space="preserve"> </w:t>
-      </w:r>
-      <w:proofErr w:type="spellStart"/>
-      <w:r>
-        <w:rPr>
-          <w:sz w:val="28"/>
-          <w:szCs w:val="28"/>
-          <w:lang w:val="en-GB"/>
-        </w:rPr>
-        <w:t>messo</w:t>
-      </w:r>
-      <w:proofErr w:type="spellEnd"/>
-      <w:r>
-        <w:rPr>
-          <w:sz w:val="28"/>
-          <w:szCs w:val="28"/>
-          <w:lang w:val="en-GB"/>
-        </w:rPr>
-        <w:t xml:space="preserve"> a cercare.</w:t>
+        <w:t>.</w:t>
       </w:r>
     </w:p>
     <w:p>

</xml_diff>

<commit_message>
ho sistemato il df_istat, manca da sost i valori al suo interno con quelli della documentazione e salvare nuovo file csv pulito
</commit_message>
<xml_diff>
--- a/Road Map - Capstone Project.docx
+++ b/Road Map - Capstone Project.docx
@@ -268,13 +268,22 @@
           <w:szCs w:val="28"/>
         </w:rPr>
       </w:pPr>
+      <w:proofErr w:type="spellStart"/>
       <w:proofErr w:type="gramStart"/>
       <w:r>
         <w:rPr>
           <w:sz w:val="28"/>
           <w:szCs w:val="28"/>
         </w:rPr>
-        <w:t xml:space="preserve">io </w:t>
+        <w:t>io</w:t>
+      </w:r>
+      <w:proofErr w:type="spellEnd"/>
+      <w:r>
+        <w:rPr>
+          <w:sz w:val="28"/>
+          <w:szCs w:val="28"/>
+        </w:rPr>
+        <w:t xml:space="preserve"> </w:t>
       </w:r>
       <w:r>
         <w:rPr>
@@ -902,23 +911,227 @@
             <w:sz w:val="28"/>
             <w:szCs w:val="28"/>
           </w:rPr>
-          <w:t>https://pandas.pydata.org/pa</w:t>
+          <w:t>https://pandas.pydata.org/pandas-docs/stable/reference/api/pandas.read_csv.html#pandas.read_csv</w:t>
         </w:r>
+      </w:hyperlink>
+      <w:r>
+        <w:rPr>
+          <w:sz w:val="28"/>
+          <w:szCs w:val="28"/>
+        </w:rPr>
+        <w:t xml:space="preserve"> </w:t>
+      </w:r>
+      <w:r>
+        <w:rPr>
+          <w:sz w:val="28"/>
+          <w:szCs w:val="28"/>
+        </w:rPr>
+        <w:t>:</w:t>
+      </w:r>
+    </w:p>
+    <w:p>
+      <w:pPr>
+        <w:pStyle w:val="ListParagraph"/>
+        <w:rPr>
+          <w:sz w:val="28"/>
+          <w:szCs w:val="28"/>
+          <w:lang w:val="en-GB"/>
+        </w:rPr>
+      </w:pPr>
+      <w:r>
+        <w:rPr>
+          <w:sz w:val="28"/>
+          <w:szCs w:val="28"/>
+        </w:rPr>
+        <w:t xml:space="preserve"> fonte usata per validare l’utilizzo della libreria io</w:t>
+      </w:r>
+      <w:r>
+        <w:rPr>
+          <w:sz w:val="28"/>
+          <w:szCs w:val="28"/>
+        </w:rPr>
+        <w:t>.</w:t>
+      </w:r>
+      <w:r>
+        <w:rPr>
+          <w:sz w:val="28"/>
+          <w:szCs w:val="28"/>
+        </w:rPr>
+        <w:t xml:space="preserve"> </w:t>
+      </w:r>
+      <w:r>
+        <w:rPr>
+          <w:sz w:val="28"/>
+          <w:szCs w:val="28"/>
+          <w:lang w:val="en-GB"/>
+        </w:rPr>
+        <w:t xml:space="preserve">La </w:t>
+      </w:r>
+      <w:proofErr w:type="spellStart"/>
+      <w:r>
+        <w:rPr>
+          <w:sz w:val="28"/>
+          <w:szCs w:val="28"/>
+          <w:lang w:val="en-GB"/>
+        </w:rPr>
+        <w:t>documentazione</w:t>
+      </w:r>
+      <w:proofErr w:type="spellEnd"/>
+      <w:r>
+        <w:rPr>
+          <w:sz w:val="28"/>
+          <w:szCs w:val="28"/>
+          <w:lang w:val="en-GB"/>
+        </w:rPr>
+        <w:t xml:space="preserve"> </w:t>
+      </w:r>
+      <w:proofErr w:type="spellStart"/>
+      <w:r>
+        <w:rPr>
+          <w:sz w:val="28"/>
+          <w:szCs w:val="28"/>
+          <w:lang w:val="en-GB"/>
+        </w:rPr>
+        <w:t>riportava</w:t>
+      </w:r>
+      <w:proofErr w:type="spellEnd"/>
+      <w:r>
+        <w:rPr>
+          <w:sz w:val="28"/>
+          <w:szCs w:val="28"/>
+          <w:lang w:val="en-GB"/>
+        </w:rPr>
+        <w:t>: By file-like object, we refer to objects with a </w:t>
+      </w:r>
+      <w:proofErr w:type="gramStart"/>
+      <w:r>
+        <w:rPr>
+          <w:sz w:val="28"/>
+          <w:szCs w:val="28"/>
+          <w:lang w:val="en-GB"/>
+        </w:rPr>
+        <w:t>read(</w:t>
+      </w:r>
+      <w:proofErr w:type="gramEnd"/>
+      <w:r>
+        <w:rPr>
+          <w:sz w:val="28"/>
+          <w:szCs w:val="28"/>
+          <w:lang w:val="en-GB"/>
+        </w:rPr>
+        <w:t xml:space="preserve">) method, such as a file handle (e.g. via </w:t>
+      </w:r>
+      <w:proofErr w:type="spellStart"/>
+      <w:r>
+        <w:rPr>
+          <w:sz w:val="28"/>
+          <w:szCs w:val="28"/>
+          <w:lang w:val="en-GB"/>
+        </w:rPr>
+        <w:t>builtin</w:t>
+      </w:r>
+      <w:proofErr w:type="spellEnd"/>
+      <w:r>
+        <w:rPr>
+          <w:sz w:val="28"/>
+          <w:szCs w:val="28"/>
+          <w:lang w:val="en-GB"/>
+        </w:rPr>
+        <w:t> open function) or </w:t>
+      </w:r>
+      <w:proofErr w:type="spellStart"/>
+      <w:r>
+        <w:rPr>
+          <w:sz w:val="28"/>
+          <w:szCs w:val="28"/>
+          <w:lang w:val="en-GB"/>
+        </w:rPr>
+        <w:t>StringIO</w:t>
+      </w:r>
+      <w:proofErr w:type="spellEnd"/>
+      <w:r>
+        <w:rPr>
+          <w:sz w:val="28"/>
+          <w:szCs w:val="28"/>
+          <w:lang w:val="en-GB"/>
+        </w:rPr>
+        <w:t>.</w:t>
+      </w:r>
+    </w:p>
+    <w:p>
+      <w:pPr>
+        <w:pStyle w:val="ListParagraph"/>
+        <w:rPr>
+          <w:sz w:val="28"/>
+          <w:szCs w:val="28"/>
+          <w:lang w:val="en-GB"/>
+        </w:rPr>
+      </w:pPr>
+    </w:p>
+    <w:p>
+      <w:pPr>
+        <w:pStyle w:val="ListParagraph"/>
+        <w:numPr>
+          <w:ilvl w:val="0"/>
+          <w:numId w:val="1"/>
+        </w:numPr>
+        <w:rPr>
+          <w:b/>
+          <w:bCs/>
+          <w:sz w:val="44"/>
+          <w:szCs w:val="44"/>
+          <w:highlight w:val="yellow"/>
+        </w:rPr>
+      </w:pPr>
+      <w:r>
+        <w:rPr>
+          <w:sz w:val="44"/>
+          <w:szCs w:val="44"/>
+          <w:highlight w:val="yellow"/>
+        </w:rPr>
+        <w:t xml:space="preserve">Fase 2: </w:t>
+      </w:r>
+      <w:r>
+        <w:rPr>
+          <w:b/>
+          <w:bCs/>
+          <w:sz w:val="44"/>
+          <w:szCs w:val="44"/>
+          <w:highlight w:val="yellow"/>
+        </w:rPr>
+        <w:t>Verifica e pulizia dati ISTAT</w:t>
+      </w:r>
+    </w:p>
+    <w:p>
+      <w:pPr>
+        <w:rPr>
+          <w:sz w:val="28"/>
+          <w:szCs w:val="28"/>
+        </w:rPr>
+      </w:pPr>
+      <w:r>
+        <w:rPr>
+          <w:sz w:val="28"/>
+          <w:szCs w:val="28"/>
+        </w:rPr>
+        <w:t xml:space="preserve">Fonti: </w:t>
+      </w:r>
+    </w:p>
+    <w:p>
+      <w:pPr>
+        <w:rPr>
+          <w:sz w:val="28"/>
+          <w:szCs w:val="28"/>
+        </w:rPr>
+      </w:pPr>
+      <w:hyperlink r:id="rId7" w:history="1">
         <w:r>
           <w:rPr>
             <w:rStyle w:val="Hyperlink"/>
             <w:sz w:val="28"/>
             <w:szCs w:val="28"/>
           </w:rPr>
-          <w:t>n</w:t>
-        </w:r>
-        <w:r>
-          <w:rPr>
-            <w:rStyle w:val="Hyperlink"/>
-            <w:sz w:val="28"/>
-            <w:szCs w:val="28"/>
-          </w:rPr>
-          <w:t>das-docs/s</w:t>
+          <w:t>https://git.nomics.world/dbnomics-json-data/istat-json-data/-/blob/mas</w:t>
         </w:r>
         <w:r>
           <w:rPr>
@@ -934,240 +1147,140 @@
             <w:sz w:val="28"/>
             <w:szCs w:val="28"/>
           </w:rPr>
-          <w:t>able/reference/api/</w:t>
+          <w:t>er/41_983/dataset.json</w:t>
         </w:r>
+      </w:hyperlink>
+    </w:p>
+    <w:p>
+      <w:pPr>
+        <w:rPr>
+          <w:sz w:val="28"/>
+          <w:szCs w:val="28"/>
+        </w:rPr>
+      </w:pPr>
+      <w:hyperlink r:id="rId8" w:history="1">
         <w:r>
           <w:rPr>
             <w:rStyle w:val="Hyperlink"/>
             <w:sz w:val="28"/>
             <w:szCs w:val="28"/>
           </w:rPr>
-          <w:t>p</w:t>
-        </w:r>
-        <w:r>
-          <w:rPr>
-            <w:rStyle w:val="Hyperlink"/>
-            <w:sz w:val="28"/>
-            <w:szCs w:val="28"/>
-          </w:rPr>
-          <w:t>andas.read_csv.html#pandas.read_csv</w:t>
+          <w:t>https://ondata.github.io/guida-api-istat</w:t>
         </w:r>
       </w:hyperlink>
-      <w:r>
-        <w:rPr>
-          <w:sz w:val="28"/>
-          <w:szCs w:val="28"/>
-        </w:rPr>
-        <w:t xml:space="preserve"> </w:t>
-      </w:r>
-      <w:r>
-        <w:rPr>
-          <w:sz w:val="28"/>
-          <w:szCs w:val="28"/>
-        </w:rPr>
-        <w:t>:</w:t>
-      </w:r>
     </w:p>
     <w:p>
       <w:pPr>
-        <w:pStyle w:val="ListParagraph"/>
-        <w:rPr>
-          <w:sz w:val="28"/>
-          <w:szCs w:val="28"/>
-        </w:rPr>
-      </w:pPr>
-      <w:r>
-        <w:rPr>
-          <w:sz w:val="28"/>
-          <w:szCs w:val="28"/>
-        </w:rPr>
-        <w:t xml:space="preserve"> fonte usata per validare l’utilizzo della libreria io</w:t>
-      </w:r>
-      <w:r>
-        <w:rPr>
-          <w:sz w:val="28"/>
-          <w:szCs w:val="28"/>
-        </w:rPr>
-        <w:t>.</w:t>
-      </w:r>
-      <w:r>
-        <w:rPr>
-          <w:sz w:val="28"/>
-          <w:szCs w:val="28"/>
-        </w:rPr>
-        <w:t xml:space="preserve"> </w:t>
-      </w:r>
-      <w:r>
-        <w:rPr>
-          <w:sz w:val="28"/>
-          <w:szCs w:val="28"/>
-          <w:lang w:val="en-GB"/>
-        </w:rPr>
-        <w:t xml:space="preserve">La </w:t>
-      </w:r>
-      <w:proofErr w:type="spellStart"/>
-      <w:r>
-        <w:rPr>
-          <w:sz w:val="28"/>
-          <w:szCs w:val="28"/>
-          <w:lang w:val="en-GB"/>
-        </w:rPr>
-        <w:t>documentazione</w:t>
-      </w:r>
-      <w:proofErr w:type="spellEnd"/>
-      <w:r>
-        <w:rPr>
-          <w:sz w:val="28"/>
-          <w:szCs w:val="28"/>
-          <w:lang w:val="en-GB"/>
-        </w:rPr>
-        <w:t xml:space="preserve"> </w:t>
-      </w:r>
-      <w:proofErr w:type="spellStart"/>
-      <w:r>
-        <w:rPr>
-          <w:sz w:val="28"/>
-          <w:szCs w:val="28"/>
-          <w:lang w:val="en-GB"/>
-        </w:rPr>
-        <w:t>riportava</w:t>
-      </w:r>
-      <w:proofErr w:type="spellEnd"/>
-      <w:r>
-        <w:rPr>
-          <w:sz w:val="28"/>
-          <w:szCs w:val="28"/>
-          <w:lang w:val="en-GB"/>
-        </w:rPr>
-        <w:t>: By file-like object, we refer to objects with a </w:t>
+        <w:rPr>
+          <w:sz w:val="28"/>
+          <w:szCs w:val="28"/>
+        </w:rPr>
+      </w:pPr>
+      <w:r>
+        <w:rPr>
+          <w:sz w:val="28"/>
+          <w:szCs w:val="28"/>
+        </w:rPr>
+        <w:t>Dopo aver caricato il dataset ho verificato la sua struttura con .</w:t>
       </w:r>
       <w:proofErr w:type="gramStart"/>
       <w:r>
         <w:rPr>
           <w:sz w:val="28"/>
           <w:szCs w:val="28"/>
-          <w:lang w:val="en-GB"/>
-        </w:rPr>
-        <w:t>read(</w:t>
+        </w:rPr>
+        <w:t>info(</w:t>
       </w:r>
       <w:proofErr w:type="gramEnd"/>
       <w:r>
         <w:rPr>
           <w:sz w:val="28"/>
           <w:szCs w:val="28"/>
-          <w:lang w:val="en-GB"/>
-        </w:rPr>
-        <w:t xml:space="preserve">) method, such as a file handle (e.g. via </w:t>
-      </w:r>
-      <w:proofErr w:type="spellStart"/>
-      <w:r>
-        <w:rPr>
-          <w:sz w:val="28"/>
-          <w:szCs w:val="28"/>
-          <w:lang w:val="en-GB"/>
-        </w:rPr>
-        <w:t>builtin</w:t>
-      </w:r>
-      <w:proofErr w:type="spellEnd"/>
-      <w:r>
-        <w:rPr>
-          <w:sz w:val="28"/>
-          <w:szCs w:val="28"/>
-          <w:lang w:val="en-GB"/>
-        </w:rPr>
-        <w:t> open function) or </w:t>
-      </w:r>
-      <w:proofErr w:type="spellStart"/>
-      <w:r>
-        <w:rPr>
-          <w:sz w:val="28"/>
-          <w:szCs w:val="28"/>
-          <w:lang w:val="en-GB"/>
-        </w:rPr>
-        <w:t>StringIO</w:t>
-      </w:r>
-      <w:proofErr w:type="spellEnd"/>
-      <w:r>
-        <w:rPr>
-          <w:sz w:val="28"/>
-          <w:szCs w:val="28"/>
-          <w:lang w:val="en-GB"/>
+        </w:rPr>
+        <w:t>)</w:t>
+      </w:r>
+      <w:r>
+        <w:rPr>
+          <w:sz w:val="28"/>
+          <w:szCs w:val="28"/>
         </w:rPr>
         <w:t>.</w:t>
       </w:r>
     </w:p>
     <w:p>
       <w:pPr>
-        <w:pStyle w:val="ListParagraph"/>
-        <w:rPr>
-          <w:sz w:val="28"/>
-          <w:szCs w:val="28"/>
-        </w:rPr>
-      </w:pPr>
+        <w:rPr>
+          <w:sz w:val="28"/>
+          <w:szCs w:val="28"/>
+        </w:rPr>
+      </w:pPr>
+      <w:r>
+        <w:rPr>
+          <w:sz w:val="28"/>
+          <w:szCs w:val="28"/>
+        </w:rPr>
+        <w:t>H</w:t>
+      </w:r>
+      <w:r>
+        <w:rPr>
+          <w:sz w:val="28"/>
+          <w:szCs w:val="28"/>
+        </w:rPr>
+        <w:t>o notato subito che 9 colonne avevano 0 valori non-</w:t>
+      </w:r>
+      <w:proofErr w:type="spellStart"/>
+      <w:r>
+        <w:rPr>
+          <w:sz w:val="28"/>
+          <w:szCs w:val="28"/>
+        </w:rPr>
+        <w:t>null</w:t>
+      </w:r>
+      <w:proofErr w:type="spellEnd"/>
+      <w:r>
+        <w:rPr>
+          <w:sz w:val="28"/>
+          <w:szCs w:val="28"/>
+        </w:rPr>
+        <w:t>, quindi completamente vuote</w:t>
+      </w:r>
+      <w:r>
+        <w:rPr>
+          <w:sz w:val="28"/>
+          <w:szCs w:val="28"/>
+        </w:rPr>
+        <w:t>, le ho eliminate,</w:t>
+      </w:r>
+      <w:r>
+        <w:rPr>
+          <w:sz w:val="28"/>
+          <w:szCs w:val="28"/>
+        </w:rPr>
+        <w:t xml:space="preserve"> e per ultima ho eliminato anche la colonna DATAFLOW perché conteneva sempre lo stesso valore che dal valore 41_983 ho dedotto si trattasse della fonte </w:t>
+      </w:r>
+      <w:proofErr w:type="gramStart"/>
+      <w:r>
+        <w:rPr>
+          <w:sz w:val="28"/>
+          <w:szCs w:val="28"/>
+        </w:rPr>
+        <w:t>dati..</w:t>
+      </w:r>
+      <w:proofErr w:type="gramEnd"/>
     </w:p>
     <w:p>
       <w:pPr>
-        <w:pStyle w:val="ListParagraph"/>
-        <w:numPr>
-          <w:ilvl w:val="0"/>
-          <w:numId w:val="1"/>
-        </w:numPr>
-        <w:rPr>
-          <w:b/>
-          <w:bCs/>
-          <w:sz w:val="44"/>
-          <w:szCs w:val="44"/>
-          <w:highlight w:val="yellow"/>
-        </w:rPr>
-      </w:pPr>
-      <w:r>
-        <w:rPr>
-          <w:sz w:val="44"/>
-          <w:szCs w:val="44"/>
-          <w:highlight w:val="yellow"/>
-        </w:rPr>
-        <w:t xml:space="preserve">Fase 2: </w:t>
-      </w:r>
-      <w:r>
-        <w:rPr>
-          <w:b/>
-          <w:bCs/>
-          <w:sz w:val="44"/>
-          <w:szCs w:val="44"/>
-          <w:highlight w:val="yellow"/>
-        </w:rPr>
-        <w:t>Verifica e pulizia dati ISTAT</w:t>
-      </w:r>
-    </w:p>
-    <w:p>
-      <w:pPr>
-        <w:rPr>
-          <w:sz w:val="28"/>
-          <w:szCs w:val="28"/>
-        </w:rPr>
-      </w:pPr>
-      <w:r>
-        <w:rPr>
-          <w:sz w:val="28"/>
-          <w:szCs w:val="28"/>
-        </w:rPr>
-        <w:t xml:space="preserve">Ho verificato il </w:t>
-      </w:r>
-      <w:proofErr w:type="spellStart"/>
-      <w:r>
-        <w:rPr>
-          <w:sz w:val="28"/>
-          <w:szCs w:val="28"/>
-        </w:rPr>
-        <w:t>df_istat</w:t>
-      </w:r>
-      <w:proofErr w:type="spellEnd"/>
-      <w:r>
-        <w:rPr>
-          <w:sz w:val="28"/>
-          <w:szCs w:val="28"/>
-        </w:rPr>
-        <w:t xml:space="preserve"> ottenuto con .</w:t>
+        <w:rPr>
+          <w:sz w:val="28"/>
+          <w:szCs w:val="28"/>
+        </w:rPr>
+      </w:pPr>
+      <w:r>
+        <w:rPr>
+          <w:sz w:val="28"/>
+          <w:szCs w:val="28"/>
+        </w:rPr>
+        <w:t xml:space="preserve">Per le restanti </w:t>
       </w:r>
       <w:proofErr w:type="gramStart"/>
       <w:r>
@@ -1175,7 +1288,7 @@
           <w:sz w:val="28"/>
           <w:szCs w:val="28"/>
         </w:rPr>
-        <w:t>info(</w:t>
+        <w:t>6</w:t>
       </w:r>
       <w:proofErr w:type="gramEnd"/>
       <w:r>
@@ -1183,23 +1296,21 @@
           <w:sz w:val="28"/>
           <w:szCs w:val="28"/>
         </w:rPr>
-        <w:t>) per capire quante colonne e righe abbiamo + il rispettivo formato.</w:t>
-      </w:r>
-    </w:p>
-    <w:p>
-      <w:pPr>
-        <w:rPr>
-          <w:sz w:val="28"/>
-          <w:szCs w:val="28"/>
-          <w:lang w:val="en-GB"/>
-        </w:rPr>
-      </w:pPr>
-      <w:r>
-        <w:rPr>
-          <w:sz w:val="28"/>
-          <w:szCs w:val="28"/>
-        </w:rPr>
-        <w:t xml:space="preserve">Ma subito mi sono accorto che non sapendo cosa indicano le colonne saperne il formato serve a </w:t>
+        <w:t xml:space="preserve"> </w:t>
+      </w:r>
+      <w:r>
+        <w:rPr>
+          <w:sz w:val="28"/>
+          <w:szCs w:val="28"/>
+        </w:rPr>
+        <w:t>colonne ho cercato di approfondire il loro utilizzo/significato dato che i valori contenuti sono in formato codice e sono riuscito a rimediare quanto mi serviva dal link che ho lasciato sopra nelle fonti.</w:t>
+      </w:r>
+      <w:r>
+        <w:rPr>
+          <w:sz w:val="28"/>
+          <w:szCs w:val="28"/>
+        </w:rPr>
+        <w:t xml:space="preserve"> (non erano presenti tutte le colonne </w:t>
       </w:r>
       <w:proofErr w:type="gramStart"/>
       <w:r>
@@ -1207,7 +1318,7 @@
           <w:sz w:val="28"/>
           <w:szCs w:val="28"/>
         </w:rPr>
-        <w:t>poco..</w:t>
+        <w:t>nella fonti</w:t>
       </w:r>
       <w:proofErr w:type="gramEnd"/>
       <w:r>
@@ -1215,111 +1326,8 @@
           <w:sz w:val="28"/>
           <w:szCs w:val="28"/>
         </w:rPr>
-        <w:t xml:space="preserve"> perché non so cosa esse devono effettivamente </w:t>
-      </w:r>
-      <w:proofErr w:type="gramStart"/>
-      <w:r>
-        <w:rPr>
-          <w:sz w:val="28"/>
-          <w:szCs w:val="28"/>
-        </w:rPr>
-        <w:t>contenere..</w:t>
-      </w:r>
-      <w:proofErr w:type="gramEnd"/>
-      <w:r>
-        <w:rPr>
-          <w:sz w:val="28"/>
-          <w:szCs w:val="28"/>
-        </w:rPr>
-        <w:t xml:space="preserve"> </w:t>
-      </w:r>
-      <w:r>
-        <w:rPr>
-          <w:sz w:val="28"/>
-          <w:szCs w:val="28"/>
-        </w:rPr>
-        <w:t xml:space="preserve">quindi facendo pure riferimento alla citazione sul file d’esame (Take some time to read through the different columns and understand what kind of information is included…..) </w:t>
-      </w:r>
-      <w:r>
-        <w:rPr>
-          <w:sz w:val="28"/>
-          <w:szCs w:val="28"/>
-          <w:lang w:val="en-GB"/>
-        </w:rPr>
-        <w:t xml:space="preserve">mi </w:t>
-      </w:r>
-      <w:proofErr w:type="spellStart"/>
-      <w:r>
-        <w:rPr>
-          <w:sz w:val="28"/>
-          <w:szCs w:val="28"/>
-          <w:lang w:val="en-GB"/>
-        </w:rPr>
-        <w:t>sono</w:t>
-      </w:r>
-      <w:proofErr w:type="spellEnd"/>
-      <w:r>
-        <w:rPr>
-          <w:sz w:val="28"/>
-          <w:szCs w:val="28"/>
-          <w:lang w:val="en-GB"/>
-        </w:rPr>
-        <w:t xml:space="preserve"> </w:t>
-      </w:r>
-      <w:proofErr w:type="spellStart"/>
-      <w:r>
-        <w:rPr>
-          <w:sz w:val="28"/>
-          <w:szCs w:val="28"/>
-          <w:lang w:val="en-GB"/>
-        </w:rPr>
-        <w:t>messo</w:t>
-      </w:r>
-      <w:proofErr w:type="spellEnd"/>
-      <w:r>
-        <w:rPr>
-          <w:sz w:val="28"/>
-          <w:szCs w:val="28"/>
-          <w:lang w:val="en-GB"/>
-        </w:rPr>
-        <w:t xml:space="preserve"> a </w:t>
-      </w:r>
-      <w:proofErr w:type="spellStart"/>
-      <w:r>
-        <w:rPr>
-          <w:sz w:val="28"/>
-          <w:szCs w:val="28"/>
-          <w:lang w:val="en-GB"/>
-        </w:rPr>
-        <w:t>cercare</w:t>
-      </w:r>
-      <w:proofErr w:type="spellEnd"/>
-      <w:r>
-        <w:rPr>
-          <w:sz w:val="28"/>
-          <w:szCs w:val="28"/>
-          <w:lang w:val="en-GB"/>
-        </w:rPr>
-        <w:t>.</w:t>
-      </w:r>
-    </w:p>
-    <w:p>
-      <w:pPr>
-        <w:rPr>
-          <w:sz w:val="28"/>
-          <w:szCs w:val="28"/>
-          <w:lang w:val="en-GB"/>
-        </w:rPr>
-      </w:pPr>
-    </w:p>
-    <w:p>
-      <w:pPr>
-        <w:rPr>
-          <w:sz w:val="28"/>
-          <w:szCs w:val="28"/>
-          <w:lang w:val="en-GB"/>
-        </w:rPr>
-      </w:pPr>
+        <w:t xml:space="preserve"> ma quelle non trovate erano di facile comprensione)</w:t>
+      </w:r>
     </w:p>
     <w:sectPr>
       <w:pgSz w:w="11906" w:h="16838"/>
@@ -1447,9 +1455,9 @@
     </w:lvl>
   </w:abstractNum>
   <w:abstractNum w:abstractNumId="1" w15:restartNumberingAfterBreak="0">
-    <w:nsid w:val="77CB0222"/>
+    <w:nsid w:val="6DBC25C0"/>
     <w:multiLevelType w:val="hybridMultilevel"/>
-    <w:tmpl w:val="5AE2F93C"/>
+    <w:tmpl w:val="55143D28"/>
     <w:lvl w:ilvl="0" w:tplc="04100011">
       <w:start w:val="1"/>
       <w:numFmt w:val="decimal"/>
@@ -1535,10 +1543,102 @@
       </w:pPr>
     </w:lvl>
   </w:abstractNum>
+  <w:abstractNum w:abstractNumId="2" w15:restartNumberingAfterBreak="0">
+    <w:nsid w:val="77CB0222"/>
+    <w:multiLevelType w:val="hybridMultilevel"/>
+    <w:tmpl w:val="5AE2F93C"/>
+    <w:lvl w:ilvl="0" w:tplc="04100011">
+      <w:start w:val="1"/>
+      <w:numFmt w:val="decimal"/>
+      <w:lvlText w:val="%1)"/>
+      <w:lvlJc w:val="left"/>
+      <w:pPr>
+        <w:ind w:left="720" w:hanging="360"/>
+      </w:pPr>
+      <w:rPr>
+        <w:rFonts w:hint="default"/>
+      </w:rPr>
+    </w:lvl>
+    <w:lvl w:ilvl="1" w:tplc="04100019" w:tentative="1">
+      <w:start w:val="1"/>
+      <w:numFmt w:val="lowerLetter"/>
+      <w:lvlText w:val="%2."/>
+      <w:lvlJc w:val="left"/>
+      <w:pPr>
+        <w:ind w:left="1440" w:hanging="360"/>
+      </w:pPr>
+    </w:lvl>
+    <w:lvl w:ilvl="2" w:tplc="0410001B" w:tentative="1">
+      <w:start w:val="1"/>
+      <w:numFmt w:val="lowerRoman"/>
+      <w:lvlText w:val="%3."/>
+      <w:lvlJc w:val="right"/>
+      <w:pPr>
+        <w:ind w:left="2160" w:hanging="180"/>
+      </w:pPr>
+    </w:lvl>
+    <w:lvl w:ilvl="3" w:tplc="0410000F" w:tentative="1">
+      <w:start w:val="1"/>
+      <w:numFmt w:val="decimal"/>
+      <w:lvlText w:val="%4."/>
+      <w:lvlJc w:val="left"/>
+      <w:pPr>
+        <w:ind w:left="2880" w:hanging="360"/>
+      </w:pPr>
+    </w:lvl>
+    <w:lvl w:ilvl="4" w:tplc="04100019" w:tentative="1">
+      <w:start w:val="1"/>
+      <w:numFmt w:val="lowerLetter"/>
+      <w:lvlText w:val="%5."/>
+      <w:lvlJc w:val="left"/>
+      <w:pPr>
+        <w:ind w:left="3600" w:hanging="360"/>
+      </w:pPr>
+    </w:lvl>
+    <w:lvl w:ilvl="5" w:tplc="0410001B" w:tentative="1">
+      <w:start w:val="1"/>
+      <w:numFmt w:val="lowerRoman"/>
+      <w:lvlText w:val="%6."/>
+      <w:lvlJc w:val="right"/>
+      <w:pPr>
+        <w:ind w:left="4320" w:hanging="180"/>
+      </w:pPr>
+    </w:lvl>
+    <w:lvl w:ilvl="6" w:tplc="0410000F" w:tentative="1">
+      <w:start w:val="1"/>
+      <w:numFmt w:val="decimal"/>
+      <w:lvlText w:val="%7."/>
+      <w:lvlJc w:val="left"/>
+      <w:pPr>
+        <w:ind w:left="5040" w:hanging="360"/>
+      </w:pPr>
+    </w:lvl>
+    <w:lvl w:ilvl="7" w:tplc="04100019" w:tentative="1">
+      <w:start w:val="1"/>
+      <w:numFmt w:val="lowerLetter"/>
+      <w:lvlText w:val="%8."/>
+      <w:lvlJc w:val="left"/>
+      <w:pPr>
+        <w:ind w:left="5760" w:hanging="360"/>
+      </w:pPr>
+    </w:lvl>
+    <w:lvl w:ilvl="8" w:tplc="0410001B" w:tentative="1">
+      <w:start w:val="1"/>
+      <w:numFmt w:val="lowerRoman"/>
+      <w:lvlText w:val="%9."/>
+      <w:lvlJc w:val="right"/>
+      <w:pPr>
+        <w:ind w:left="6480" w:hanging="180"/>
+      </w:pPr>
+    </w:lvl>
+  </w:abstractNum>
   <w:num w:numId="1" w16cid:durableId="959527209">
     <w:abstractNumId w:val="0"/>
   </w:num>
   <w:num w:numId="2" w16cid:durableId="546798924">
+    <w:abstractNumId w:val="2"/>
+  </w:num>
+  <w:num w:numId="3" w16cid:durableId="563374064">
     <w:abstractNumId w:val="1"/>
   </w:num>
 </w:numbering>
@@ -2147,6 +2247,7 @@
   <w:style w:type="character" w:default="1" w:styleId="DefaultParagraphFont">
     <w:name w:val="Default Paragraph Font"/>
     <w:uiPriority w:val="1"/>
+    <w:semiHidden/>
     <w:unhideWhenUsed/>
   </w:style>
   <w:style w:type="table" w:default="1" w:styleId="TableNormal">

</xml_diff>

<commit_message>
file csv dati_istat ripulito e pronto per la join, ho salvato una copia rinominata dati_istat_clean per avere il file raw se dovesse servire
</commit_message>
<xml_diff>
--- a/Road Map - Capstone Project.docx
+++ b/Road Map - Capstone Project.docx
@@ -1131,23 +1131,7 @@
             <w:sz w:val="28"/>
             <w:szCs w:val="28"/>
           </w:rPr>
-          <w:t>https://git.nomics.world/dbnomics-json-data/istat-json-data/-/blob/mas</w:t>
-        </w:r>
-        <w:r>
-          <w:rPr>
-            <w:rStyle w:val="Hyperlink"/>
-            <w:sz w:val="28"/>
-            <w:szCs w:val="28"/>
-          </w:rPr>
-          <w:t>t</w:t>
-        </w:r>
-        <w:r>
-          <w:rPr>
-            <w:rStyle w:val="Hyperlink"/>
-            <w:sz w:val="28"/>
-            <w:szCs w:val="28"/>
-          </w:rPr>
-          <w:t>er/41_983/dataset.json</w:t>
+          <w:t>https://git.nomics.world/dbnomics-json-data/istat-json-data/-/blob/master/41_983/dataset.json</w:t>
         </w:r>
       </w:hyperlink>
     </w:p>
@@ -1181,7 +1165,21 @@
           <w:sz w:val="28"/>
           <w:szCs w:val="28"/>
         </w:rPr>
-        <w:t>Dopo aver caricato il dataset ho verificato la sua struttura con .</w:t>
+        <w:t xml:space="preserve">Dopo aver caricato il </w:t>
+      </w:r>
+      <w:r>
+        <w:rPr>
+          <w:sz w:val="28"/>
+          <w:szCs w:val="28"/>
+        </w:rPr>
+        <w:t>file csv</w:t>
+      </w:r>
+      <w:r>
+        <w:rPr>
+          <w:sz w:val="28"/>
+          <w:szCs w:val="28"/>
+        </w:rPr>
+        <w:t xml:space="preserve"> ho verificato la sua struttura con .</w:t>
       </w:r>
       <w:proofErr w:type="gramStart"/>
       <w:r>
@@ -1310,24 +1308,129 @@
           <w:sz w:val="28"/>
           <w:szCs w:val="28"/>
         </w:rPr>
-        <w:t xml:space="preserve"> (non erano presenti tutte le colonne </w:t>
-      </w:r>
-      <w:proofErr w:type="gramStart"/>
-      <w:r>
-        <w:rPr>
-          <w:sz w:val="28"/>
-          <w:szCs w:val="28"/>
-        </w:rPr>
-        <w:t>nella fonti</w:t>
-      </w:r>
-      <w:proofErr w:type="gramEnd"/>
-      <w:r>
-        <w:rPr>
-          <w:sz w:val="28"/>
-          <w:szCs w:val="28"/>
-        </w:rPr>
-        <w:t xml:space="preserve"> ma quelle non trovate erano di facile comprensione)</w:t>
-      </w:r>
+        <w:t xml:space="preserve"> (non erano presenti tutte le colonne nell</w:t>
+      </w:r>
+      <w:r>
+        <w:rPr>
+          <w:sz w:val="28"/>
+          <w:szCs w:val="28"/>
+        </w:rPr>
+        <w:t>e</w:t>
+      </w:r>
+      <w:r>
+        <w:rPr>
+          <w:sz w:val="28"/>
+          <w:szCs w:val="28"/>
+        </w:rPr>
+        <w:t xml:space="preserve"> fonti ma quelle non trovate erano di facile comprensione)</w:t>
+      </w:r>
+    </w:p>
+    <w:p>
+      <w:pPr>
+        <w:rPr>
+          <w:sz w:val="28"/>
+          <w:szCs w:val="28"/>
+        </w:rPr>
+      </w:pPr>
+      <w:r>
+        <w:rPr>
+          <w:sz w:val="28"/>
+          <w:szCs w:val="28"/>
+        </w:rPr>
+        <w:t xml:space="preserve">Ho rinominato le colonne e sostituito i valori con quanto rimediato dalla documentazione e lasciato invariati i valori contenuti dento </w:t>
+      </w:r>
+      <w:r>
+        <w:rPr>
+          <w:sz w:val="28"/>
+          <w:szCs w:val="28"/>
+        </w:rPr>
+        <w:t>all</w:t>
+      </w:r>
+      <w:r>
+        <w:rPr>
+          <w:sz w:val="28"/>
+          <w:szCs w:val="28"/>
+        </w:rPr>
+        <w:t xml:space="preserve">a </w:t>
+      </w:r>
+      <w:r>
+        <w:rPr>
+          <w:sz w:val="28"/>
+          <w:szCs w:val="28"/>
+        </w:rPr>
+        <w:t xml:space="preserve">colonna </w:t>
+      </w:r>
+      <w:proofErr w:type="spellStart"/>
+      <w:r>
+        <w:rPr>
+          <w:sz w:val="28"/>
+          <w:szCs w:val="28"/>
+        </w:rPr>
+        <w:t>Territory</w:t>
+      </w:r>
+      <w:proofErr w:type="spellEnd"/>
+      <w:r>
+        <w:rPr>
+          <w:sz w:val="28"/>
+          <w:szCs w:val="28"/>
+        </w:rPr>
+        <w:t xml:space="preserve"> che andrò a sistemare una volta scaricati gli altri file e collegandoli con una join.</w:t>
+      </w:r>
+    </w:p>
+    <w:p>
+      <w:pPr>
+        <w:rPr>
+          <w:sz w:val="28"/>
+          <w:szCs w:val="28"/>
+        </w:rPr>
+      </w:pPr>
+      <w:r>
+        <w:rPr>
+          <w:sz w:val="28"/>
+          <w:szCs w:val="28"/>
+        </w:rPr>
+        <w:t xml:space="preserve">Ho salvato il tutto in nuovo file CSV rinominato </w:t>
+      </w:r>
+      <w:proofErr w:type="spellStart"/>
+      <w:r>
+        <w:rPr>
+          <w:sz w:val="28"/>
+          <w:szCs w:val="28"/>
+        </w:rPr>
+        <w:t>df_istat_clean</w:t>
+      </w:r>
+      <w:proofErr w:type="spellEnd"/>
+      <w:r>
+        <w:rPr>
+          <w:sz w:val="28"/>
+          <w:szCs w:val="28"/>
+        </w:rPr>
+        <w:t xml:space="preserve"> così da avere il file </w:t>
+      </w:r>
+      <w:proofErr w:type="spellStart"/>
+      <w:r>
+        <w:rPr>
+          <w:sz w:val="28"/>
+          <w:szCs w:val="28"/>
+        </w:rPr>
+        <w:t>raw</w:t>
+      </w:r>
+      <w:proofErr w:type="spellEnd"/>
+      <w:r>
+        <w:rPr>
+          <w:sz w:val="28"/>
+          <w:szCs w:val="28"/>
+        </w:rPr>
+        <w:t xml:space="preserve"> con me in caso di evenienza.</w:t>
+      </w:r>
+    </w:p>
+    <w:p>
+      <w:pPr>
+        <w:rPr>
+          <w:sz w:val="28"/>
+          <w:szCs w:val="28"/>
+        </w:rPr>
+      </w:pPr>
     </w:p>
     <w:sectPr>
       <w:pgSz w:w="11906" w:h="16838"/>

</xml_diff>

<commit_message>
aggiunto fonte video youtube che non avevo messo nella roadmap
</commit_message>
<xml_diff>
--- a/Road Map - Capstone Project.docx
+++ b/Road Map - Capstone Project.docx
@@ -305,40 +305,29 @@
           <w:sz w:val="28"/>
           <w:szCs w:val="28"/>
         </w:rPr>
-        <w:t xml:space="preserve">convertire il testo ottenuto dall’ api in un oggetto </w:t>
-      </w:r>
-      <w:r>
-        <w:rPr>
-          <w:sz w:val="28"/>
-          <w:szCs w:val="28"/>
-        </w:rPr>
-        <w:t xml:space="preserve">che </w:t>
-      </w:r>
-      <w:proofErr w:type="spellStart"/>
-      <w:r>
-        <w:rPr>
-          <w:sz w:val="28"/>
-          <w:szCs w:val="28"/>
-        </w:rPr>
-        <w:t>pandas</w:t>
-      </w:r>
-      <w:proofErr w:type="spellEnd"/>
-      <w:r>
-        <w:rPr>
-          <w:sz w:val="28"/>
-          <w:szCs w:val="28"/>
-        </w:rPr>
-        <w:t xml:space="preserve"> può leggere come </w:t>
-      </w:r>
-      <w:proofErr w:type="spellStart"/>
-      <w:r>
-        <w:rPr>
-          <w:sz w:val="28"/>
-          <w:szCs w:val="28"/>
-        </w:rPr>
-        <w:t>DataFrame</w:t>
-      </w:r>
-      <w:proofErr w:type="spellEnd"/>
+        <w:t>convertire il testo ottenuto dall’ api in un oggetto</w:t>
+      </w:r>
+      <w:r>
+        <w:rPr>
+          <w:sz w:val="28"/>
+          <w:szCs w:val="28"/>
+        </w:rPr>
+        <w:t xml:space="preserve"> </w:t>
+      </w:r>
+      <w:r>
+        <w:rPr>
+          <w:sz w:val="28"/>
+          <w:szCs w:val="28"/>
+        </w:rPr>
+        <w:t>file like in memoria</w:t>
+      </w:r>
+      <w:r>
+        <w:rPr>
+          <w:sz w:val="28"/>
+          <w:szCs w:val="28"/>
+        </w:rPr>
+        <w:t xml:space="preserve"> </w:t>
+      </w:r>
     </w:p>
     <w:p>
       <w:pPr>
@@ -707,7 +696,23 @@
             <w:sz w:val="28"/>
             <w:szCs w:val="28"/>
           </w:rPr>
-          <w:t>https://www.statology.org/pandas-read-csv-from-string/</w:t>
+          <w:t>https://www.statolo</w:t>
+        </w:r>
+        <w:r>
+          <w:rPr>
+            <w:rStyle w:val="Hyperlink"/>
+            <w:sz w:val="28"/>
+            <w:szCs w:val="28"/>
+          </w:rPr>
+          <w:t>g</w:t>
+        </w:r>
+        <w:r>
+          <w:rPr>
+            <w:rStyle w:val="Hyperlink"/>
+            <w:sz w:val="28"/>
+            <w:szCs w:val="28"/>
+          </w:rPr>
+          <w:t>y.org/pandas-read-csv-from-string/</w:t>
         </w:r>
       </w:hyperlink>
       <w:r>
@@ -808,38 +813,6 @@
           <w:szCs w:val="28"/>
         </w:rPr>
         <w:t xml:space="preserve">. </w:t>
-      </w:r>
-    </w:p>
-    <w:p>
-      <w:pPr>
-        <w:pStyle w:val="ListParagraph"/>
-        <w:rPr>
-          <w:sz w:val="28"/>
-          <w:szCs w:val="28"/>
-        </w:rPr>
-      </w:pPr>
-      <w:r>
-        <w:rPr>
-          <w:sz w:val="28"/>
-          <w:szCs w:val="28"/>
-        </w:rPr>
-        <w:t>All’inizio non funzionava allora (andando a tentativi) a ho provato con prima .</w:t>
-      </w:r>
-      <w:proofErr w:type="spellStart"/>
-      <w:r>
-        <w:rPr>
-          <w:sz w:val="28"/>
-          <w:szCs w:val="28"/>
-        </w:rPr>
-        <w:t>str</w:t>
-      </w:r>
-      <w:proofErr w:type="spellEnd"/>
-      <w:r>
-        <w:rPr>
-          <w:sz w:val="28"/>
-          <w:szCs w:val="28"/>
-        </w:rPr>
-        <w:t xml:space="preserve"> e poi .text ed ha funzionato. </w:t>
       </w:r>
     </w:p>
     <w:p>
@@ -1061,12 +1034,76 @@
     <w:p>
       <w:pPr>
         <w:pStyle w:val="ListParagraph"/>
+        <w:numPr>
+          <w:ilvl w:val="0"/>
+          <w:numId w:val="2"/>
+        </w:numPr>
         <w:rPr>
           <w:sz w:val="28"/>
           <w:szCs w:val="28"/>
           <w:lang w:val="en-GB"/>
         </w:rPr>
       </w:pPr>
+      <w:hyperlink r:id="rId7" w:history="1">
+        <w:r>
+          <w:rPr>
+            <w:rStyle w:val="Hyperlink"/>
+            <w:sz w:val="28"/>
+            <w:szCs w:val="28"/>
+            <w:lang w:val="en-GB"/>
+          </w:rPr>
+          <w:t>https://www.youtube.com/watch?v=QFRNb3DxITo</w:t>
+        </w:r>
+      </w:hyperlink>
+      <w:r>
+        <w:rPr>
+          <w:sz w:val="28"/>
+          <w:szCs w:val="28"/>
+          <w:lang w:val="en-GB"/>
+        </w:rPr>
+        <w:t xml:space="preserve"> :</w:t>
+      </w:r>
+    </w:p>
+    <w:p>
+      <w:pPr>
+        <w:pStyle w:val="ListParagraph"/>
+        <w:rPr>
+          <w:sz w:val="28"/>
+          <w:szCs w:val="28"/>
+        </w:rPr>
+      </w:pPr>
+      <w:r>
+        <w:rPr>
+          <w:sz w:val="28"/>
+          <w:szCs w:val="28"/>
+        </w:rPr>
+        <w:t xml:space="preserve">video usato per capire concettualmente </w:t>
+      </w:r>
+      <w:proofErr w:type="spellStart"/>
+      <w:proofErr w:type="gramStart"/>
+      <w:r>
+        <w:rPr>
+          <w:sz w:val="28"/>
+          <w:szCs w:val="28"/>
+        </w:rPr>
+        <w:t>io.StringIO</w:t>
+      </w:r>
+      <w:proofErr w:type="spellEnd"/>
+      <w:proofErr w:type="gramEnd"/>
+      <w:r>
+        <w:rPr>
+          <w:sz w:val="28"/>
+          <w:szCs w:val="28"/>
+        </w:rPr>
+        <w:t xml:space="preserve"> e del perché si usa</w:t>
+      </w:r>
+      <w:r>
+        <w:rPr>
+          <w:sz w:val="28"/>
+          <w:szCs w:val="28"/>
+        </w:rPr>
+        <w:t>, nel video diceva:</w:t>
+      </w:r>
     </w:p>
     <w:p>
       <w:pPr>
@@ -1076,6 +1113,83 @@
           <w:numId w:val="1"/>
         </w:numPr>
         <w:rPr>
+          <w:sz w:val="28"/>
+          <w:szCs w:val="28"/>
+        </w:rPr>
+      </w:pPr>
+      <w:r>
+        <w:rPr>
+          <w:sz w:val="28"/>
+          <w:szCs w:val="28"/>
+        </w:rPr>
+        <w:t xml:space="preserve">Le classi </w:t>
+      </w:r>
+      <w:proofErr w:type="spellStart"/>
+      <w:r>
+        <w:rPr>
+          <w:sz w:val="28"/>
+          <w:szCs w:val="28"/>
+        </w:rPr>
+        <w:t>stringIO</w:t>
+      </w:r>
+      <w:proofErr w:type="spellEnd"/>
+      <w:r>
+        <w:rPr>
+          <w:sz w:val="28"/>
+          <w:szCs w:val="28"/>
+        </w:rPr>
+        <w:t xml:space="preserve"> e </w:t>
+      </w:r>
+      <w:proofErr w:type="spellStart"/>
+      <w:r>
+        <w:rPr>
+          <w:sz w:val="28"/>
+          <w:szCs w:val="28"/>
+        </w:rPr>
+        <w:t>bytesIO</w:t>
+      </w:r>
+      <w:proofErr w:type="spellEnd"/>
+      <w:r>
+        <w:rPr>
+          <w:sz w:val="28"/>
+          <w:szCs w:val="28"/>
+        </w:rPr>
+        <w:t xml:space="preserve"> del modulo IO sono oggetti file like in memoria e uno dei casi di utilizzo più importanti di </w:t>
+      </w:r>
+      <w:proofErr w:type="spellStart"/>
+      <w:r>
+        <w:rPr>
+          <w:sz w:val="28"/>
+          <w:szCs w:val="28"/>
+        </w:rPr>
+        <w:t>stringIO</w:t>
+      </w:r>
+      <w:proofErr w:type="spellEnd"/>
+      <w:r>
+        <w:rPr>
+          <w:sz w:val="28"/>
+          <w:szCs w:val="28"/>
+        </w:rPr>
+        <w:t xml:space="preserve"> è quello di consentire l’utilizzo delle API dei file senza ricorrere al file System</w:t>
+      </w:r>
+    </w:p>
+    <w:p>
+      <w:pPr>
+        <w:pStyle w:val="ListParagraph"/>
+        <w:rPr>
+          <w:sz w:val="28"/>
+          <w:szCs w:val="28"/>
+        </w:rPr>
+      </w:pPr>
+    </w:p>
+    <w:p>
+      <w:pPr>
+        <w:pStyle w:val="ListParagraph"/>
+        <w:numPr>
+          <w:ilvl w:val="0"/>
+          <w:numId w:val="1"/>
+        </w:numPr>
+        <w:rPr>
           <w:b/>
           <w:bCs/>
           <w:sz w:val="44"/>
@@ -1124,7 +1238,7 @@
           <w:szCs w:val="28"/>
         </w:rPr>
       </w:pPr>
-      <w:hyperlink r:id="rId7" w:history="1">
+      <w:hyperlink r:id="rId8" w:history="1">
         <w:r>
           <w:rPr>
             <w:rStyle w:val="Hyperlink"/>
@@ -1142,7 +1256,7 @@
           <w:szCs w:val="28"/>
         </w:rPr>
       </w:pPr>
-      <w:hyperlink r:id="rId8" w:history="1">
+      <w:hyperlink r:id="rId9" w:history="1">
         <w:r>
           <w:rPr>
             <w:rStyle w:val="Hyperlink"/>

</xml_diff>

<commit_message>
Ho creato il file df_situas_clean pronto per la join e verificato i risultati ottenuti
</commit_message>
<xml_diff>
--- a/Road Map - Capstone Project.docx
+++ b/Road Map - Capstone Project.docx
@@ -1035,16 +1035,16 @@
         <mc:AlternateContent>
           <mc:Choice Requires="wps">
             <w:drawing>
-              <wp:anchor distT="0" distB="0" distL="114300" distR="114300" simplePos="0" relativeHeight="251661312" behindDoc="0" locked="0" layoutInCell="1" allowOverlap="1" wp14:anchorId="0C5DB149" wp14:editId="0166E7A2">
+              <wp:anchor distT="0" distB="0" distL="114300" distR="114300" simplePos="0" relativeHeight="251661312" behindDoc="0" locked="0" layoutInCell="1" allowOverlap="1" wp14:anchorId="0C5DB149" wp14:editId="7FB2026D">
                 <wp:simplePos x="0" y="0"/>
                 <wp:positionH relativeFrom="column">
-                  <wp:posOffset>0</wp:posOffset>
+                  <wp:posOffset>-275</wp:posOffset>
                 </wp:positionH>
                 <wp:positionV relativeFrom="paragraph">
-                  <wp:posOffset>-635</wp:posOffset>
+                  <wp:posOffset>-2596</wp:posOffset>
                 </wp:positionV>
-                <wp:extent cx="10887736" cy="0"/>
-                <wp:effectExtent l="0" t="0" r="0" b="0"/>
+                <wp:extent cx="20000518" cy="10571"/>
+                <wp:effectExtent l="0" t="0" r="21590" b="27940"/>
                 <wp:wrapNone/>
                 <wp:docPr id="1083866337" name="Straight Connector 1"/>
                 <wp:cNvGraphicFramePr/>
@@ -1055,7 +1055,7 @@
                       <wps:spPr>
                         <a:xfrm flipH="1" flipV="1">
                           <a:off x="0" y="0"/>
-                          <a:ext cx="10887736" cy="0"/>
+                          <a:ext cx="20000518" cy="10571"/>
                         </a:xfrm>
                         <a:prstGeom prst="line">
                           <a:avLst/>
@@ -1099,7 +1099,7 @@
           </mc:Choice>
           <mc:Fallback>
             <w:pict>
-              <v:line w14:anchorId="320EE0C9" id="Straight Connector 1" o:spid="_x0000_s1026" style="position:absolute;flip:x y;z-index:251661312;visibility:visible;mso-wrap-style:square;mso-width-percent:0;mso-height-percent:0;mso-wrap-distance-left:9pt;mso-wrap-distance-top:0;mso-wrap-distance-right:9pt;mso-wrap-distance-bottom:0;mso-position-horizontal:absolute;mso-position-horizontal-relative:text;mso-position-vertical:absolute;mso-position-vertical-relative:text;mso-width-percent:0;mso-height-percent:0;mso-width-relative:margin;mso-height-relative:margin" from="0,-.05pt" to="857.3pt,-.05pt" o:gfxdata="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" strokecolor="#156082 [3204]" strokeweight="1.5pt">
+              <v:line w14:anchorId="6FA1C5D8" id="Straight Connector 1" o:spid="_x0000_s1026" style="position:absolute;flip:x y;z-index:251661312;visibility:visible;mso-wrap-style:square;mso-width-percent:0;mso-height-percent:0;mso-wrap-distance-left:9pt;mso-wrap-distance-top:0;mso-wrap-distance-right:9pt;mso-wrap-distance-bottom:0;mso-position-horizontal:absolute;mso-position-horizontal-relative:text;mso-position-vertical:absolute;mso-position-vertical-relative:text;mso-width-percent:0;mso-height-percent:0;mso-width-relative:margin;mso-height-relative:margin" from="0,-.2pt" to="1574.85pt,.65pt" o:gfxdata="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" strokecolor="#156082 [3204]" strokeweight="1.5pt">
                 <v:stroke dashstyle="dash"/>
               </v:line>
             </w:pict>
@@ -1181,7 +1181,23 @@
             <w:sz w:val="28"/>
             <w:szCs w:val="28"/>
           </w:rPr>
-          <w:t>https://git.nomics.world/dbnomics-json-data/istat-json-data/-/blob/master/41_983/dataset.json</w:t>
+          <w:t>https://git.nomics.world/dbnomics-json-data/istat-</w:t>
+        </w:r>
+        <w:r>
+          <w:rPr>
+            <w:rStyle w:val="Hyperlink"/>
+            <w:sz w:val="28"/>
+            <w:szCs w:val="28"/>
+          </w:rPr>
+          <w:t>j</w:t>
+        </w:r>
+        <w:r>
+          <w:rPr>
+            <w:rStyle w:val="Hyperlink"/>
+            <w:sz w:val="28"/>
+            <w:szCs w:val="28"/>
+          </w:rPr>
+          <w:t>son-data/-/blob/master/41_983/dataset.json</w:t>
         </w:r>
       </w:hyperlink>
     </w:p>
@@ -2343,6 +2359,26 @@
     </w:p>
     <w:p>
       <w:pPr>
+        <w:pStyle w:val="ListParagraph"/>
+        <w:numPr>
+          <w:ilvl w:val="0"/>
+          <w:numId w:val="4"/>
+        </w:numPr>
+        <w:rPr>
+          <w:sz w:val="28"/>
+          <w:szCs w:val="28"/>
+        </w:rPr>
+      </w:pPr>
+      <w:r>
+        <w:rPr>
+          <w:sz w:val="28"/>
+          <w:szCs w:val="28"/>
+        </w:rPr>
+        <w:t>Creato nuovo file csv dati_census.csv</w:t>
+      </w:r>
+    </w:p>
+    <w:p>
+      <w:pPr>
         <w:jc w:val="center"/>
         <w:rPr>
           <w:sz w:val="28"/>
@@ -2412,22 +2448,502 @@
           <w:szCs w:val="28"/>
         </w:rPr>
       </w:pPr>
-    </w:p>
-    <w:p>
-      <w:pPr>
-        <w:rPr>
-          <w:sz w:val="28"/>
-          <w:szCs w:val="28"/>
-        </w:rPr>
-      </w:pPr>
-    </w:p>
-    <w:p>
-      <w:pPr>
-        <w:rPr>
-          <w:sz w:val="28"/>
-          <w:szCs w:val="28"/>
-        </w:rPr>
-      </w:pPr>
+      <w:r>
+        <w:rPr>
+          <w:noProof/>
+          <w:sz w:val="28"/>
+          <w:szCs w:val="28"/>
+        </w:rPr>
+        <mc:AlternateContent>
+          <mc:Choice Requires="wps">
+            <w:drawing>
+              <wp:anchor distT="0" distB="0" distL="114300" distR="114300" simplePos="0" relativeHeight="251663360" behindDoc="0" locked="0" layoutInCell="1" allowOverlap="1" wp14:anchorId="23ADDAB1" wp14:editId="5FAB8061">
+                <wp:simplePos x="0" y="0"/>
+                <wp:positionH relativeFrom="column">
+                  <wp:posOffset>0</wp:posOffset>
+                </wp:positionH>
+                <wp:positionV relativeFrom="paragraph">
+                  <wp:posOffset>0</wp:posOffset>
+                </wp:positionV>
+                <wp:extent cx="10887736" cy="0"/>
+                <wp:effectExtent l="0" t="0" r="0" b="0"/>
+                <wp:wrapNone/>
+                <wp:docPr id="917576010" name="Straight Connector 1"/>
+                <wp:cNvGraphicFramePr/>
+                <a:graphic xmlns:a="http://schemas.openxmlformats.org/drawingml/2006/main">
+                  <a:graphicData uri="http://schemas.microsoft.com/office/word/2010/wordprocessingShape">
+                    <wps:wsp>
+                      <wps:cNvCnPr/>
+                      <wps:spPr>
+                        <a:xfrm flipH="1" flipV="1">
+                          <a:off x="0" y="0"/>
+                          <a:ext cx="10887736" cy="0"/>
+                        </a:xfrm>
+                        <a:prstGeom prst="line">
+                          <a:avLst/>
+                        </a:prstGeom>
+                        <a:ln w="19050" cap="flat" cmpd="sng" algn="ctr">
+                          <a:solidFill>
+                            <a:schemeClr val="accent1"/>
+                          </a:solidFill>
+                          <a:prstDash val="dash"/>
+                          <a:round/>
+                          <a:headEnd type="none" w="med" len="med"/>
+                          <a:tailEnd type="none" w="med" len="med"/>
+                        </a:ln>
+                      </wps:spPr>
+                      <wps:style>
+                        <a:lnRef idx="0">
+                          <a:scrgbClr r="0" g="0" b="0"/>
+                        </a:lnRef>
+                        <a:fillRef idx="0">
+                          <a:scrgbClr r="0" g="0" b="0"/>
+                        </a:fillRef>
+                        <a:effectRef idx="0">
+                          <a:scrgbClr r="0" g="0" b="0"/>
+                        </a:effectRef>
+                        <a:fontRef idx="minor">
+                          <a:schemeClr val="tx1"/>
+                        </a:fontRef>
+                      </wps:style>
+                      <wps:bodyPr/>
+                    </wps:wsp>
+                  </a:graphicData>
+                </a:graphic>
+                <wp14:sizeRelH relativeFrom="margin">
+                  <wp14:pctWidth>0</wp14:pctWidth>
+                </wp14:sizeRelH>
+                <wp14:sizeRelV relativeFrom="margin">
+                  <wp14:pctHeight>0</wp14:pctHeight>
+                </wp14:sizeRelV>
+              </wp:anchor>
+            </w:drawing>
+          </mc:Choice>
+          <mc:Fallback>
+            <w:pict>
+              <v:line w14:anchorId="2FFE95A8" id="Straight Connector 1" o:spid="_x0000_s1026" style="position:absolute;flip:x y;z-index:251663360;visibility:visible;mso-wrap-style:square;mso-width-percent:0;mso-height-percent:0;mso-wrap-distance-left:9pt;mso-wrap-distance-top:0;mso-wrap-distance-right:9pt;mso-wrap-distance-bottom:0;mso-position-horizontal:absolute;mso-position-horizontal-relative:text;mso-position-vertical:absolute;mso-position-vertical-relative:text;mso-width-percent:0;mso-height-percent:0;mso-width-relative:margin;mso-height-relative:margin" from="0,0" to="857.3pt,0" o:gfxdata="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" strokecolor="#156082 [3204]" strokeweight="1.5pt">
+                <v:stroke dashstyle="dash"/>
+              </v:line>
+            </w:pict>
+          </mc:Fallback>
+        </mc:AlternateContent>
+      </w:r>
+    </w:p>
+    <w:p>
+      <w:pPr>
+        <w:pStyle w:val="ListParagraph"/>
+        <w:numPr>
+          <w:ilvl w:val="0"/>
+          <w:numId w:val="1"/>
+        </w:numPr>
+        <w:rPr>
+          <w:b/>
+          <w:bCs/>
+          <w:sz w:val="44"/>
+          <w:szCs w:val="44"/>
+          <w:highlight w:val="yellow"/>
+        </w:rPr>
+      </w:pPr>
+      <w:r>
+        <w:rPr>
+          <w:sz w:val="44"/>
+          <w:szCs w:val="44"/>
+          <w:highlight w:val="yellow"/>
+        </w:rPr>
+        <w:t xml:space="preserve">Fase </w:t>
+      </w:r>
+      <w:r>
+        <w:rPr>
+          <w:sz w:val="44"/>
+          <w:szCs w:val="44"/>
+          <w:highlight w:val="yellow"/>
+        </w:rPr>
+        <w:t>4</w:t>
+      </w:r>
+      <w:r>
+        <w:rPr>
+          <w:sz w:val="44"/>
+          <w:szCs w:val="44"/>
+          <w:highlight w:val="yellow"/>
+        </w:rPr>
+        <w:t xml:space="preserve">: </w:t>
+      </w:r>
+      <w:r>
+        <w:rPr>
+          <w:b/>
+          <w:bCs/>
+          <w:sz w:val="44"/>
+          <w:szCs w:val="44"/>
+          <w:highlight w:val="yellow"/>
+        </w:rPr>
+        <w:t>Verifica e pulizia</w:t>
+      </w:r>
+      <w:r>
+        <w:rPr>
+          <w:b/>
+          <w:bCs/>
+          <w:sz w:val="44"/>
+          <w:szCs w:val="44"/>
+          <w:highlight w:val="yellow"/>
+        </w:rPr>
+        <w:t xml:space="preserve"> dati </w:t>
+      </w:r>
+      <w:r>
+        <w:rPr>
+          <w:b/>
+          <w:bCs/>
+          <w:sz w:val="44"/>
+          <w:szCs w:val="44"/>
+          <w:highlight w:val="yellow"/>
+        </w:rPr>
+        <w:t>SITUAS</w:t>
+      </w:r>
+    </w:p>
+    <w:p>
+      <w:pPr>
+        <w:ind w:left="360"/>
+        <w:jc w:val="center"/>
+        <w:rPr>
+          <w:sz w:val="28"/>
+          <w:szCs w:val="28"/>
+        </w:rPr>
+      </w:pPr>
+      <w:r>
+        <w:rPr>
+          <w:b/>
+          <w:bCs/>
+          <w:sz w:val="28"/>
+          <w:szCs w:val="28"/>
+        </w:rPr>
+        <w:t>Fonti</w:t>
+      </w:r>
+      <w:r>
+        <w:rPr>
+          <w:sz w:val="28"/>
+          <w:szCs w:val="28"/>
+        </w:rPr>
+        <w:t>:</w:t>
+      </w:r>
+    </w:p>
+    <w:p>
+      <w:pPr>
+        <w:ind w:left="360"/>
+        <w:jc w:val="center"/>
+        <w:rPr>
+          <w:sz w:val="28"/>
+          <w:szCs w:val="28"/>
+        </w:rPr>
+      </w:pPr>
+    </w:p>
+    <w:p>
+      <w:pPr>
+        <w:pStyle w:val="ListParagraph"/>
+        <w:numPr>
+          <w:ilvl w:val="0"/>
+          <w:numId w:val="8"/>
+        </w:numPr>
+        <w:rPr>
+          <w:sz w:val="28"/>
+          <w:szCs w:val="28"/>
+        </w:rPr>
+      </w:pPr>
+      <w:r>
+        <w:rPr>
+          <w:sz w:val="28"/>
+          <w:szCs w:val="28"/>
+        </w:rPr>
+        <w:t xml:space="preserve">Ho caricato il file CSV </w:t>
+      </w:r>
+      <w:r>
+        <w:rPr>
+          <w:sz w:val="28"/>
+          <w:szCs w:val="28"/>
+        </w:rPr>
+        <w:t>dati_</w:t>
+      </w:r>
+      <w:r>
+        <w:rPr>
+          <w:sz w:val="28"/>
+          <w:szCs w:val="28"/>
+        </w:rPr>
+        <w:t>situas</w:t>
+      </w:r>
+      <w:r>
+        <w:rPr>
+          <w:sz w:val="28"/>
+          <w:szCs w:val="28"/>
+        </w:rPr>
+        <w:t>.csv</w:t>
+      </w:r>
+      <w:r>
+        <w:rPr>
+          <w:sz w:val="28"/>
+          <w:szCs w:val="28"/>
+        </w:rPr>
+        <w:t xml:space="preserve"> ed eseguito .</w:t>
+      </w:r>
+      <w:proofErr w:type="gramStart"/>
+      <w:r>
+        <w:rPr>
+          <w:sz w:val="28"/>
+          <w:szCs w:val="28"/>
+        </w:rPr>
+        <w:t>info(</w:t>
+      </w:r>
+      <w:proofErr w:type="gramEnd"/>
+      <w:r>
+        <w:rPr>
+          <w:sz w:val="28"/>
+          <w:szCs w:val="28"/>
+        </w:rPr>
+        <w:t>)</w:t>
+      </w:r>
+    </w:p>
+    <w:p>
+      <w:pPr>
+        <w:pStyle w:val="ListParagraph"/>
+        <w:numPr>
+          <w:ilvl w:val="0"/>
+          <w:numId w:val="8"/>
+        </w:numPr>
+        <w:rPr>
+          <w:sz w:val="28"/>
+          <w:szCs w:val="28"/>
+        </w:rPr>
+      </w:pPr>
+      <w:r>
+        <w:rPr>
+          <w:sz w:val="28"/>
+          <w:szCs w:val="28"/>
+        </w:rPr>
+        <w:t>Ho notato che Comune ha dei valori nulli e superfice è in formato oggetto invece che numerico</w:t>
+      </w:r>
+    </w:p>
+    <w:p>
+      <w:pPr>
+        <w:pStyle w:val="ListParagraph"/>
+        <w:numPr>
+          <w:ilvl w:val="0"/>
+          <w:numId w:val="8"/>
+        </w:numPr>
+        <w:rPr>
+          <w:sz w:val="28"/>
+          <w:szCs w:val="28"/>
+        </w:rPr>
+      </w:pPr>
+      <w:r>
+        <w:rPr>
+          <w:sz w:val="28"/>
+          <w:szCs w:val="28"/>
+        </w:rPr>
+        <w:t xml:space="preserve">Ho verificato </w:t>
+      </w:r>
+      <w:proofErr w:type="gramStart"/>
+      <w:r>
+        <w:rPr>
+          <w:sz w:val="28"/>
+          <w:szCs w:val="28"/>
+        </w:rPr>
+        <w:t>con .</w:t>
+      </w:r>
+      <w:proofErr w:type="spellStart"/>
+      <w:r>
+        <w:rPr>
+          <w:sz w:val="28"/>
+          <w:szCs w:val="28"/>
+        </w:rPr>
+        <w:t>isnull</w:t>
+      </w:r>
+      <w:proofErr w:type="spellEnd"/>
+      <w:proofErr w:type="gramEnd"/>
+      <w:r>
+        <w:rPr>
+          <w:sz w:val="28"/>
+          <w:szCs w:val="28"/>
+        </w:rPr>
+        <w:t xml:space="preserve">() la colonna con dati mancanti e dal codice comune ho trovato nel file </w:t>
+      </w:r>
+      <w:proofErr w:type="spellStart"/>
+      <w:r>
+        <w:rPr>
+          <w:sz w:val="28"/>
+          <w:szCs w:val="28"/>
+        </w:rPr>
+        <w:t>excel</w:t>
+      </w:r>
+      <w:proofErr w:type="spellEnd"/>
+      <w:r>
+        <w:rPr>
+          <w:sz w:val="28"/>
+          <w:szCs w:val="28"/>
+        </w:rPr>
+        <w:t xml:space="preserve"> il dato mancante</w:t>
+      </w:r>
+    </w:p>
+    <w:p>
+      <w:pPr>
+        <w:pStyle w:val="ListParagraph"/>
+        <w:numPr>
+          <w:ilvl w:val="0"/>
+          <w:numId w:val="8"/>
+        </w:numPr>
+        <w:rPr>
+          <w:sz w:val="28"/>
+          <w:szCs w:val="28"/>
+        </w:rPr>
+      </w:pPr>
+      <w:r>
+        <w:rPr>
+          <w:sz w:val="28"/>
+          <w:szCs w:val="28"/>
+        </w:rPr>
+        <w:t xml:space="preserve">Penso l’abbia tolto perché il nome </w:t>
+      </w:r>
+      <w:proofErr w:type="gramStart"/>
+      <w:r>
+        <w:rPr>
+          <w:sz w:val="28"/>
+          <w:szCs w:val="28"/>
+        </w:rPr>
+        <w:t>None  forse</w:t>
+      </w:r>
+      <w:proofErr w:type="gramEnd"/>
+      <w:r>
+        <w:rPr>
+          <w:sz w:val="28"/>
+          <w:szCs w:val="28"/>
+        </w:rPr>
+        <w:t xml:space="preserve"> lo interpreta come nullo</w:t>
+      </w:r>
+    </w:p>
+    <w:p>
+      <w:pPr>
+        <w:pStyle w:val="ListParagraph"/>
+        <w:numPr>
+          <w:ilvl w:val="0"/>
+          <w:numId w:val="8"/>
+        </w:numPr>
+        <w:rPr>
+          <w:sz w:val="28"/>
+          <w:szCs w:val="28"/>
+        </w:rPr>
+      </w:pPr>
+      <w:r>
+        <w:rPr>
+          <w:sz w:val="28"/>
+          <w:szCs w:val="28"/>
+        </w:rPr>
+        <w:t xml:space="preserve">Ho </w:t>
+      </w:r>
+      <w:proofErr w:type="gramStart"/>
+      <w:r>
+        <w:rPr>
+          <w:sz w:val="28"/>
+          <w:szCs w:val="28"/>
+        </w:rPr>
+        <w:t>usato .</w:t>
+      </w:r>
+      <w:proofErr w:type="spellStart"/>
+      <w:r>
+        <w:rPr>
+          <w:sz w:val="28"/>
+          <w:szCs w:val="28"/>
+        </w:rPr>
+        <w:t>fillna</w:t>
+      </w:r>
+      <w:proofErr w:type="spellEnd"/>
+      <w:proofErr w:type="gramEnd"/>
+      <w:r>
+        <w:rPr>
+          <w:sz w:val="28"/>
+          <w:szCs w:val="28"/>
+        </w:rPr>
+        <w:t>() per rimettere il nome mancante</w:t>
+      </w:r>
+    </w:p>
+    <w:p>
+      <w:pPr>
+        <w:pStyle w:val="ListParagraph"/>
+        <w:numPr>
+          <w:ilvl w:val="0"/>
+          <w:numId w:val="8"/>
+        </w:numPr>
+        <w:rPr>
+          <w:sz w:val="28"/>
+          <w:szCs w:val="28"/>
+        </w:rPr>
+      </w:pPr>
+      <w:r>
+        <w:rPr>
+          <w:sz w:val="28"/>
+          <w:szCs w:val="28"/>
+        </w:rPr>
+        <w:t xml:space="preserve">Ho sistemato il </w:t>
+      </w:r>
+      <w:proofErr w:type="spellStart"/>
+      <w:r>
+        <w:rPr>
+          <w:sz w:val="28"/>
+          <w:szCs w:val="28"/>
+        </w:rPr>
+        <w:t>Dtype</w:t>
+      </w:r>
+      <w:proofErr w:type="spellEnd"/>
+      <w:r>
+        <w:rPr>
+          <w:sz w:val="28"/>
+          <w:szCs w:val="28"/>
+        </w:rPr>
+        <w:t xml:space="preserve"> di superficie</w:t>
+      </w:r>
+    </w:p>
+    <w:p>
+      <w:pPr>
+        <w:jc w:val="center"/>
+        <w:rPr>
+          <w:sz w:val="28"/>
+          <w:szCs w:val="28"/>
+        </w:rPr>
+      </w:pPr>
+      <w:r>
+        <w:rPr>
+          <w:sz w:val="28"/>
+          <w:szCs w:val="28"/>
+        </w:rPr>
+        <w:t>NOTE</w:t>
+      </w:r>
+    </w:p>
+    <w:p>
+      <w:pPr>
+        <w:jc w:val="center"/>
+        <w:rPr>
+          <w:sz w:val="28"/>
+          <w:szCs w:val="28"/>
+        </w:rPr>
+      </w:pPr>
+      <w:r>
+        <w:rPr>
+          <w:sz w:val="28"/>
+          <w:szCs w:val="28"/>
+        </w:rPr>
+        <w:t xml:space="preserve">Alla fine della fase </w:t>
+      </w:r>
+      <w:proofErr w:type="gramStart"/>
+      <w:r>
+        <w:rPr>
+          <w:sz w:val="28"/>
+          <w:szCs w:val="28"/>
+        </w:rPr>
+        <w:t>4</w:t>
+      </w:r>
+      <w:proofErr w:type="gramEnd"/>
+      <w:r>
+        <w:rPr>
+          <w:sz w:val="28"/>
+          <w:szCs w:val="28"/>
+        </w:rPr>
+        <w:t xml:space="preserve"> ho aggiunto un’analisi fatta sul file dopo aver notato dei valori doppi negli anni</w:t>
+      </w:r>
     </w:p>
     <w:p>
       <w:pPr>
@@ -2539,6 +3055,95 @@
     </w:lvl>
   </w:abstractNum>
   <w:abstractNum w:abstractNumId="1" w15:restartNumberingAfterBreak="0">
+    <w:nsid w:val="2CD102BA"/>
+    <w:multiLevelType w:val="hybridMultilevel"/>
+    <w:tmpl w:val="7C52F486"/>
+    <w:lvl w:ilvl="0" w:tplc="04100011">
+      <w:start w:val="1"/>
+      <w:numFmt w:val="decimal"/>
+      <w:lvlText w:val="%1)"/>
+      <w:lvlJc w:val="left"/>
+      <w:pPr>
+        <w:ind w:left="720" w:hanging="360"/>
+      </w:pPr>
+      <w:rPr>
+        <w:rFonts w:hint="default"/>
+      </w:rPr>
+    </w:lvl>
+    <w:lvl w:ilvl="1" w:tplc="04100019" w:tentative="1">
+      <w:start w:val="1"/>
+      <w:numFmt w:val="lowerLetter"/>
+      <w:lvlText w:val="%2."/>
+      <w:lvlJc w:val="left"/>
+      <w:pPr>
+        <w:ind w:left="1440" w:hanging="360"/>
+      </w:pPr>
+    </w:lvl>
+    <w:lvl w:ilvl="2" w:tplc="0410001B" w:tentative="1">
+      <w:start w:val="1"/>
+      <w:numFmt w:val="lowerRoman"/>
+      <w:lvlText w:val="%3."/>
+      <w:lvlJc w:val="right"/>
+      <w:pPr>
+        <w:ind w:left="2160" w:hanging="180"/>
+      </w:pPr>
+    </w:lvl>
+    <w:lvl w:ilvl="3" w:tplc="0410000F" w:tentative="1">
+      <w:start w:val="1"/>
+      <w:numFmt w:val="decimal"/>
+      <w:lvlText w:val="%4."/>
+      <w:lvlJc w:val="left"/>
+      <w:pPr>
+        <w:ind w:left="2880" w:hanging="360"/>
+      </w:pPr>
+    </w:lvl>
+    <w:lvl w:ilvl="4" w:tplc="04100019" w:tentative="1">
+      <w:start w:val="1"/>
+      <w:numFmt w:val="lowerLetter"/>
+      <w:lvlText w:val="%5."/>
+      <w:lvlJc w:val="left"/>
+      <w:pPr>
+        <w:ind w:left="3600" w:hanging="360"/>
+      </w:pPr>
+    </w:lvl>
+    <w:lvl w:ilvl="5" w:tplc="0410001B" w:tentative="1">
+      <w:start w:val="1"/>
+      <w:numFmt w:val="lowerRoman"/>
+      <w:lvlText w:val="%6."/>
+      <w:lvlJc w:val="right"/>
+      <w:pPr>
+        <w:ind w:left="4320" w:hanging="180"/>
+      </w:pPr>
+    </w:lvl>
+    <w:lvl w:ilvl="6" w:tplc="0410000F" w:tentative="1">
+      <w:start w:val="1"/>
+      <w:numFmt w:val="decimal"/>
+      <w:lvlText w:val="%7."/>
+      <w:lvlJc w:val="left"/>
+      <w:pPr>
+        <w:ind w:left="5040" w:hanging="360"/>
+      </w:pPr>
+    </w:lvl>
+    <w:lvl w:ilvl="7" w:tplc="04100019" w:tentative="1">
+      <w:start w:val="1"/>
+      <w:numFmt w:val="lowerLetter"/>
+      <w:lvlText w:val="%8."/>
+      <w:lvlJc w:val="left"/>
+      <w:pPr>
+        <w:ind w:left="5760" w:hanging="360"/>
+      </w:pPr>
+    </w:lvl>
+    <w:lvl w:ilvl="8" w:tplc="0410001B" w:tentative="1">
+      <w:start w:val="1"/>
+      <w:numFmt w:val="lowerRoman"/>
+      <w:lvlText w:val="%9."/>
+      <w:lvlJc w:val="right"/>
+      <w:pPr>
+        <w:ind w:left="6480" w:hanging="180"/>
+      </w:pPr>
+    </w:lvl>
+  </w:abstractNum>
+  <w:abstractNum w:abstractNumId="2" w15:restartNumberingAfterBreak="0">
     <w:nsid w:val="2E181D0D"/>
     <w:multiLevelType w:val="hybridMultilevel"/>
     <w:tmpl w:val="EAE84DE0"/>
@@ -2627,7 +3232,7 @@
       </w:pPr>
     </w:lvl>
   </w:abstractNum>
-  <w:abstractNum w:abstractNumId="2" w15:restartNumberingAfterBreak="0">
+  <w:abstractNum w:abstractNumId="3" w15:restartNumberingAfterBreak="0">
     <w:nsid w:val="35442224"/>
     <w:multiLevelType w:val="hybridMultilevel"/>
     <w:tmpl w:val="5E901E4E"/>
@@ -2716,7 +3321,7 @@
       </w:pPr>
     </w:lvl>
   </w:abstractNum>
-  <w:abstractNum w:abstractNumId="3" w15:restartNumberingAfterBreak="0">
+  <w:abstractNum w:abstractNumId="4" w15:restartNumberingAfterBreak="0">
     <w:nsid w:val="48E371E5"/>
     <w:multiLevelType w:val="hybridMultilevel"/>
     <w:tmpl w:val="57CA4248"/>
@@ -2829,7 +3434,7 @@
       </w:rPr>
     </w:lvl>
   </w:abstractNum>
-  <w:abstractNum w:abstractNumId="4" w15:restartNumberingAfterBreak="0">
+  <w:abstractNum w:abstractNumId="5" w15:restartNumberingAfterBreak="0">
     <w:nsid w:val="56D8554D"/>
     <w:multiLevelType w:val="hybridMultilevel"/>
     <w:tmpl w:val="37B45552"/>
@@ -2918,7 +3523,7 @@
       </w:pPr>
     </w:lvl>
   </w:abstractNum>
-  <w:abstractNum w:abstractNumId="5" w15:restartNumberingAfterBreak="0">
+  <w:abstractNum w:abstractNumId="6" w15:restartNumberingAfterBreak="0">
     <w:nsid w:val="6DBC25C0"/>
     <w:multiLevelType w:val="hybridMultilevel"/>
     <w:tmpl w:val="55143D28"/>
@@ -3007,7 +3612,7 @@
       </w:pPr>
     </w:lvl>
   </w:abstractNum>
-  <w:abstractNum w:abstractNumId="6" w15:restartNumberingAfterBreak="0">
+  <w:abstractNum w:abstractNumId="7" w15:restartNumberingAfterBreak="0">
     <w:nsid w:val="77CB0222"/>
     <w:multiLevelType w:val="hybridMultilevel"/>
     <w:tmpl w:val="5AE2F93C"/>
@@ -3097,25 +3702,28 @@
     </w:lvl>
   </w:abstractNum>
   <w:num w:numId="1" w16cid:durableId="959527209">
-    <w:abstractNumId w:val="3"/>
+    <w:abstractNumId w:val="4"/>
   </w:num>
   <w:num w:numId="2" w16cid:durableId="546798924">
+    <w:abstractNumId w:val="7"/>
+  </w:num>
+  <w:num w:numId="3" w16cid:durableId="563374064">
     <w:abstractNumId w:val="6"/>
   </w:num>
-  <w:num w:numId="3" w16cid:durableId="563374064">
-    <w:abstractNumId w:val="5"/>
-  </w:num>
   <w:num w:numId="4" w16cid:durableId="1238975505">
-    <w:abstractNumId w:val="1"/>
+    <w:abstractNumId w:val="2"/>
   </w:num>
   <w:num w:numId="5" w16cid:durableId="196047935">
     <w:abstractNumId w:val="0"/>
   </w:num>
   <w:num w:numId="6" w16cid:durableId="807017504">
-    <w:abstractNumId w:val="4"/>
+    <w:abstractNumId w:val="5"/>
   </w:num>
   <w:num w:numId="7" w16cid:durableId="894853274">
-    <w:abstractNumId w:val="2"/>
+    <w:abstractNumId w:val="3"/>
+  </w:num>
+  <w:num w:numId="8" w16cid:durableId="1752852094">
+    <w:abstractNumId w:val="1"/>
   </w:num>
 </w:numbering>
 </file>
@@ -3723,7 +4331,6 @@
   <w:style w:type="character" w:default="1" w:styleId="DefaultParagraphFont">
     <w:name w:val="Default Paragraph Font"/>
     <w:uiPriority w:val="1"/>
-    <w:semiHidden/>
     <w:unhideWhenUsed/>
   </w:style>
   <w:style w:type="table" w:default="1" w:styleId="TableNormal">

</xml_diff>

<commit_message>
oggi ho lavorato solo sulla join e fatto verifiche e prove varie per capire se fosse corretto e per decidere su come proseguire, domani mattina aggiorno roadmap e si parte col file pronto e pulito
</commit_message>
<xml_diff>
--- a/Road Map - Capstone Project.docx
+++ b/Road Map - Capstone Project.docx
@@ -388,7 +388,6 @@
         <w:t xml:space="preserve">Con </w:t>
       </w:r>
       <w:proofErr w:type="spellStart"/>
-      <w:proofErr w:type="gramStart"/>
       <w:r>
         <w:rPr>
           <w:sz w:val="28"/>
@@ -397,7 +396,6 @@
         <w:t>io.StringIO</w:t>
       </w:r>
       <w:proofErr w:type="spellEnd"/>
-      <w:proofErr w:type="gramEnd"/>
       <w:r>
         <w:rPr>
           <w:sz w:val="28"/>
@@ -504,15 +502,7 @@
           <w:sz w:val="28"/>
           <w:szCs w:val="28"/>
         </w:rPr>
-        <w:t>pd.read_</w:t>
-      </w:r>
-      <w:proofErr w:type="gramStart"/>
-      <w:r>
-        <w:rPr>
-          <w:sz w:val="28"/>
-          <w:szCs w:val="28"/>
-        </w:rPr>
-        <w:t>csv</w:t>
+        <w:t>pd.read_csv</w:t>
       </w:r>
       <w:proofErr w:type="spellEnd"/>
       <w:r>
@@ -520,15 +510,7 @@
           <w:sz w:val="28"/>
           <w:szCs w:val="28"/>
         </w:rPr>
-        <w:t>(</w:t>
-      </w:r>
-      <w:proofErr w:type="gramEnd"/>
-      <w:r>
-        <w:rPr>
-          <w:sz w:val="28"/>
-          <w:szCs w:val="28"/>
-        </w:rPr>
-        <w:t>…) ma restituiva</w:t>
+        <w:t>(…) ma restituiva</w:t>
       </w:r>
       <w:r>
         <w:rPr>
@@ -618,7 +600,6 @@
         <w:t>: &lt;class '</w:t>
       </w:r>
       <w:proofErr w:type="spellStart"/>
-      <w:proofErr w:type="gramStart"/>
       <w:r>
         <w:rPr>
           <w:i/>
@@ -626,17 +607,7 @@
           <w:sz w:val="28"/>
           <w:szCs w:val="28"/>
         </w:rPr>
-        <w:t>requests.models</w:t>
-      </w:r>
-      <w:proofErr w:type="gramEnd"/>
-      <w:r>
-        <w:rPr>
-          <w:i/>
-          <w:iCs/>
-          <w:sz w:val="28"/>
-          <w:szCs w:val="28"/>
-        </w:rPr>
-        <w:t>.Response</w:t>
+        <w:t>requests.models.Response</w:t>
       </w:r>
       <w:proofErr w:type="spellEnd"/>
       <w:r>
@@ -669,7 +640,6 @@
         <w:t xml:space="preserve">l’unico pezzo nuovo che mi mancava era </w:t>
       </w:r>
       <w:proofErr w:type="spellStart"/>
-      <w:proofErr w:type="gramStart"/>
       <w:r>
         <w:rPr>
           <w:sz w:val="28"/>
@@ -678,7 +648,6 @@
         <w:t>io.StringIO</w:t>
       </w:r>
       <w:proofErr w:type="spellEnd"/>
-      <w:proofErr w:type="gramEnd"/>
       <w:r>
         <w:rPr>
           <w:sz w:val="28"/>
@@ -756,25 +725,25 @@
           <w:szCs w:val="28"/>
           <w:lang w:val="en-GB"/>
         </w:rPr>
-        <w:t>: By file-like object, we refer to objects with a </w:t>
-      </w:r>
-      <w:proofErr w:type="gramStart"/>
+        <w:t xml:space="preserve">: By file-like object, we refer to objects with a read() method, such as a file handle (e.g. via </w:t>
+      </w:r>
+      <w:proofErr w:type="spellStart"/>
       <w:r>
         <w:rPr>
           <w:sz w:val="28"/>
           <w:szCs w:val="28"/>
           <w:lang w:val="en-GB"/>
         </w:rPr>
-        <w:t>read(</w:t>
-      </w:r>
-      <w:proofErr w:type="gramEnd"/>
+        <w:t>builtin</w:t>
+      </w:r>
+      <w:proofErr w:type="spellEnd"/>
       <w:r>
         <w:rPr>
           <w:sz w:val="28"/>
           <w:szCs w:val="28"/>
           <w:lang w:val="en-GB"/>
         </w:rPr>
-        <w:t xml:space="preserve">) method, such as a file handle (e.g. via </w:t>
+        <w:t> open function) or </w:t>
       </w:r>
       <w:proofErr w:type="spellStart"/>
       <w:r>
@@ -783,7 +752,7 @@
           <w:szCs w:val="28"/>
           <w:lang w:val="en-GB"/>
         </w:rPr>
-        <w:t>builtin</w:t>
+        <w:t>StringIO</w:t>
       </w:r>
       <w:proofErr w:type="spellEnd"/>
       <w:r>
@@ -792,43 +761,15 @@
           <w:szCs w:val="28"/>
           <w:lang w:val="en-GB"/>
         </w:rPr>
-        <w:t> open function) or </w:t>
-      </w:r>
-      <w:proofErr w:type="spellStart"/>
+        <w:t>.</w:t>
+      </w:r>
       <w:r>
         <w:rPr>
           <w:sz w:val="28"/>
           <w:szCs w:val="28"/>
           <w:lang w:val="en-GB"/>
         </w:rPr>
-        <w:t>StringIO</w:t>
-      </w:r>
-      <w:proofErr w:type="spellEnd"/>
-      <w:proofErr w:type="gramStart"/>
-      <w:r>
-        <w:rPr>
-          <w:sz w:val="28"/>
-          <w:szCs w:val="28"/>
-          <w:lang w:val="en-GB"/>
-        </w:rPr>
-        <w:t>.</w:t>
-      </w:r>
-      <w:r>
-        <w:rPr>
-          <w:sz w:val="28"/>
-          <w:szCs w:val="28"/>
-          <w:lang w:val="en-GB"/>
-        </w:rPr>
-        <w:t xml:space="preserve"> :</w:t>
-      </w:r>
-      <w:proofErr w:type="gramEnd"/>
-      <w:r>
-        <w:rPr>
-          <w:sz w:val="28"/>
-          <w:szCs w:val="28"/>
-          <w:lang w:val="en-GB"/>
-        </w:rPr>
-        <w:t xml:space="preserve"> </w:t>
+        <w:t xml:space="preserve"> : </w:t>
       </w:r>
       <w:proofErr w:type="spellStart"/>
       <w:r>
@@ -1181,23 +1122,7 @@
             <w:sz w:val="28"/>
             <w:szCs w:val="28"/>
           </w:rPr>
-          <w:t>https://git.nomics.world/dbnomics-json-data/istat-</w:t>
-        </w:r>
-        <w:r>
-          <w:rPr>
-            <w:rStyle w:val="Hyperlink"/>
-            <w:sz w:val="28"/>
-            <w:szCs w:val="28"/>
-          </w:rPr>
-          <w:t>j</w:t>
-        </w:r>
-        <w:r>
-          <w:rPr>
-            <w:rStyle w:val="Hyperlink"/>
-            <w:sz w:val="28"/>
-            <w:szCs w:val="28"/>
-          </w:rPr>
-          <w:t>son-data/-/blob/master/41_983/dataset.json</w:t>
+          <w:t>https://git.nomics.world/dbnomics-json-data/istat-json-data/-/blob/master/41_983/dataset.json</w:t>
         </w:r>
       </w:hyperlink>
     </w:p>
@@ -1277,23 +1202,7 @@
           <w:sz w:val="28"/>
           <w:szCs w:val="28"/>
         </w:rPr>
-        <w:t>ho verificato la sua struttura con .</w:t>
-      </w:r>
-      <w:proofErr w:type="gramStart"/>
-      <w:r>
-        <w:rPr>
-          <w:sz w:val="28"/>
-          <w:szCs w:val="28"/>
-        </w:rPr>
-        <w:t>info(</w:t>
-      </w:r>
-      <w:proofErr w:type="gramEnd"/>
-      <w:r>
-        <w:rPr>
-          <w:sz w:val="28"/>
-          <w:szCs w:val="28"/>
-        </w:rPr>
-        <w:t>)</w:t>
+        <w:t>ho verificato la sua struttura con .info()</w:t>
       </w:r>
       <w:r>
         <w:rPr>
@@ -1362,21 +1271,12 @@
         </w:rPr>
         <w:t xml:space="preserve">Per le restanti </w:t>
       </w:r>
-      <w:proofErr w:type="gramStart"/>
-      <w:r>
-        <w:rPr>
-          <w:sz w:val="28"/>
-          <w:szCs w:val="28"/>
-        </w:rPr>
-        <w:t>6</w:t>
-      </w:r>
-      <w:proofErr w:type="gramEnd"/>
-      <w:r>
-        <w:rPr>
-          <w:sz w:val="28"/>
-          <w:szCs w:val="28"/>
-        </w:rPr>
-        <w:t xml:space="preserve"> </w:t>
+      <w:r>
+        <w:rPr>
+          <w:sz w:val="28"/>
+          <w:szCs w:val="28"/>
+        </w:rPr>
+        <w:t xml:space="preserve">6 </w:t>
       </w:r>
       <w:r>
         <w:rPr>
@@ -1691,17 +1591,8 @@
           <w:sz w:val="28"/>
           <w:szCs w:val="28"/>
         </w:rPr>
-        <w:t xml:space="preserve">ho dedotto si trattasse della fonte </w:t>
-      </w:r>
-      <w:proofErr w:type="gramStart"/>
-      <w:r>
-        <w:rPr>
-          <w:sz w:val="28"/>
-          <w:szCs w:val="28"/>
-        </w:rPr>
-        <w:t>dati..</w:t>
-      </w:r>
-      <w:proofErr w:type="gramEnd"/>
+        <w:t>ho dedotto si trattasse della fonte dati..</w:t>
+      </w:r>
     </w:p>
     <w:p>
       <w:pPr>
@@ -1955,39 +1846,7 @@
           <w:sz w:val="28"/>
           <w:szCs w:val="28"/>
         </w:rPr>
-        <w:t xml:space="preserve"> un .</w:t>
-      </w:r>
-      <w:proofErr w:type="gramStart"/>
-      <w:r>
-        <w:rPr>
-          <w:sz w:val="28"/>
-          <w:szCs w:val="28"/>
-        </w:rPr>
-        <w:t>max(</w:t>
-      </w:r>
-      <w:proofErr w:type="gramEnd"/>
-      <w:r>
-        <w:rPr>
-          <w:sz w:val="28"/>
-          <w:szCs w:val="28"/>
-        </w:rPr>
-        <w:t xml:space="preserve">) </w:t>
-      </w:r>
-      <w:proofErr w:type="gramStart"/>
-      <w:r>
-        <w:rPr>
-          <w:sz w:val="28"/>
-          <w:szCs w:val="28"/>
-        </w:rPr>
-        <w:t>e .min</w:t>
-      </w:r>
-      <w:proofErr w:type="gramEnd"/>
-      <w:r>
-        <w:rPr>
-          <w:sz w:val="28"/>
-          <w:szCs w:val="28"/>
-        </w:rPr>
-        <w:t xml:space="preserve">() sulla colonna </w:t>
+        <w:t xml:space="preserve"> un .max() e .min() sulla colonna </w:t>
       </w:r>
       <w:proofErr w:type="spellStart"/>
       <w:r>
@@ -2088,17 +1947,8 @@
           <w:sz w:val="28"/>
           <w:szCs w:val="28"/>
         </w:rPr>
-        <w:t xml:space="preserve">per motivi organizzativi non potevo rischiare di rimanere troppo indietro con </w:t>
-      </w:r>
-      <w:proofErr w:type="gramStart"/>
-      <w:r>
-        <w:rPr>
-          <w:sz w:val="28"/>
-          <w:szCs w:val="28"/>
-        </w:rPr>
-        <w:t>l’esame..</w:t>
-      </w:r>
-      <w:proofErr w:type="gramEnd"/>
+        <w:t>per motivi organizzativi non potevo rischiare di rimanere troppo indietro con l’esame..</w:t>
+      </w:r>
       <w:r>
         <w:rPr>
           <w:sz w:val="28"/>
@@ -2300,15 +2150,7 @@
           <w:sz w:val="28"/>
           <w:szCs w:val="28"/>
         </w:rPr>
-        <w:t xml:space="preserve"> dentro a una lista </w:t>
-      </w:r>
-      <w:proofErr w:type="gramStart"/>
-      <w:r>
-        <w:rPr>
-          <w:sz w:val="28"/>
-          <w:szCs w:val="28"/>
-        </w:rPr>
-        <w:t>con .</w:t>
+        <w:t xml:space="preserve"> dentro a una lista con .</w:t>
       </w:r>
       <w:proofErr w:type="spellStart"/>
       <w:r>
@@ -2319,7 +2161,6 @@
         <w:t>append</w:t>
       </w:r>
       <w:proofErr w:type="spellEnd"/>
-      <w:proofErr w:type="gramEnd"/>
     </w:p>
     <w:p>
       <w:pPr>
@@ -2406,39 +2247,7 @@
           <w:sz w:val="28"/>
           <w:szCs w:val="28"/>
         </w:rPr>
-        <w:t xml:space="preserve">Ho notato, aprendo i vari file, che il censimento viene fatto ogni </w:t>
-      </w:r>
-      <w:proofErr w:type="gramStart"/>
-      <w:r>
-        <w:rPr>
-          <w:sz w:val="28"/>
-          <w:szCs w:val="28"/>
-        </w:rPr>
-        <w:t>10</w:t>
-      </w:r>
-      <w:proofErr w:type="gramEnd"/>
-      <w:r>
-        <w:rPr>
-          <w:sz w:val="28"/>
-          <w:szCs w:val="28"/>
-        </w:rPr>
-        <w:t xml:space="preserve"> anni e che la colonna popolazione legale non fa riferimento a quella attuale perché anch’essa cambia col cambiare del </w:t>
-      </w:r>
-      <w:proofErr w:type="gramStart"/>
-      <w:r>
-        <w:rPr>
-          <w:sz w:val="28"/>
-          <w:szCs w:val="28"/>
-        </w:rPr>
-        <w:t>censimento..</w:t>
-      </w:r>
-      <w:proofErr w:type="gramEnd"/>
-      <w:r>
-        <w:rPr>
-          <w:sz w:val="28"/>
-          <w:szCs w:val="28"/>
-        </w:rPr>
-        <w:t xml:space="preserve"> ho quindi usato la colonna popolazione residente avendo notato che cambia col passare degli anni, quindi col cambiare della colonna anno popolazione</w:t>
+        <w:t>Ho notato, aprendo i vari file, che il censimento viene fatto ogni 10 anni e che la colonna popolazione legale non fa riferimento a quella attuale perché anch’essa cambia col cambiare del censimento.. ho quindi usato la colonna popolazione residente avendo notato che cambia col passare degli anni, quindi col cambiare della colonna anno popolazione</w:t>
       </w:r>
     </w:p>
     <w:p>
@@ -2680,23 +2489,7 @@
           <w:sz w:val="28"/>
           <w:szCs w:val="28"/>
         </w:rPr>
-        <w:t xml:space="preserve"> ed eseguito .</w:t>
-      </w:r>
-      <w:proofErr w:type="gramStart"/>
-      <w:r>
-        <w:rPr>
-          <w:sz w:val="28"/>
-          <w:szCs w:val="28"/>
-        </w:rPr>
-        <w:t>info(</w:t>
-      </w:r>
-      <w:proofErr w:type="gramEnd"/>
-      <w:r>
-        <w:rPr>
-          <w:sz w:val="28"/>
-          <w:szCs w:val="28"/>
-        </w:rPr>
-        <w:t>)</w:t>
+        <w:t xml:space="preserve"> ed eseguito .info()</w:t>
       </w:r>
     </w:p>
     <w:p>
@@ -2736,15 +2529,7 @@
           <w:sz w:val="28"/>
           <w:szCs w:val="28"/>
         </w:rPr>
-        <w:t xml:space="preserve">Ho verificato </w:t>
-      </w:r>
-      <w:proofErr w:type="gramStart"/>
-      <w:r>
-        <w:rPr>
-          <w:sz w:val="28"/>
-          <w:szCs w:val="28"/>
-        </w:rPr>
-        <w:t>con .</w:t>
+        <w:t>Ho verificato con .</w:t>
       </w:r>
       <w:proofErr w:type="spellStart"/>
       <w:r>
@@ -2755,7 +2540,6 @@
         <w:t>isnull</w:t>
       </w:r>
       <w:proofErr w:type="spellEnd"/>
-      <w:proofErr w:type="gramEnd"/>
       <w:r>
         <w:rPr>
           <w:sz w:val="28"/>
@@ -2797,23 +2581,7 @@
           <w:sz w:val="28"/>
           <w:szCs w:val="28"/>
         </w:rPr>
-        <w:t xml:space="preserve">Penso l’abbia tolto perché il nome </w:t>
-      </w:r>
-      <w:proofErr w:type="gramStart"/>
-      <w:r>
-        <w:rPr>
-          <w:sz w:val="28"/>
-          <w:szCs w:val="28"/>
-        </w:rPr>
-        <w:t>None  forse</w:t>
-      </w:r>
-      <w:proofErr w:type="gramEnd"/>
-      <w:r>
-        <w:rPr>
-          <w:sz w:val="28"/>
-          <w:szCs w:val="28"/>
-        </w:rPr>
-        <w:t xml:space="preserve"> lo interpreta come nullo</w:t>
+        <w:t>Penso l’abbia tolto perché il nome None lo interpreta come nullo</w:t>
       </w:r>
     </w:p>
     <w:p>
@@ -2833,15 +2601,7 @@
           <w:sz w:val="28"/>
           <w:szCs w:val="28"/>
         </w:rPr>
-        <w:t xml:space="preserve">Ho </w:t>
-      </w:r>
-      <w:proofErr w:type="gramStart"/>
-      <w:r>
-        <w:rPr>
-          <w:sz w:val="28"/>
-          <w:szCs w:val="28"/>
-        </w:rPr>
-        <w:t>usato .</w:t>
+        <w:t>Ho usato .</w:t>
       </w:r>
       <w:proofErr w:type="spellStart"/>
       <w:r>
@@ -2852,7 +2612,6 @@
         <w:t>fillna</w:t>
       </w:r>
       <w:proofErr w:type="spellEnd"/>
-      <w:proofErr w:type="gramEnd"/>
       <w:r>
         <w:rPr>
           <w:sz w:val="28"/>
@@ -2926,23 +2685,188 @@
           <w:sz w:val="28"/>
           <w:szCs w:val="28"/>
         </w:rPr>
-        <w:t xml:space="preserve">Alla fine della fase </w:t>
-      </w:r>
-      <w:proofErr w:type="gramStart"/>
-      <w:r>
-        <w:rPr>
-          <w:sz w:val="28"/>
-          <w:szCs w:val="28"/>
-        </w:rPr>
-        <w:t>4</w:t>
-      </w:r>
-      <w:proofErr w:type="gramEnd"/>
-      <w:r>
-        <w:rPr>
-          <w:sz w:val="28"/>
-          <w:szCs w:val="28"/>
-        </w:rPr>
-        <w:t xml:space="preserve"> ho aggiunto un’analisi fatta sul file dopo aver notato dei valori doppi negli anni</w:t>
+        <w:t>Alla fine della fase 4 ho aggiunto un’analisi fatta sul file dopo aver notato dei valori doppi negli anni</w:t>
+      </w:r>
+    </w:p>
+    <w:p>
+      <w:pPr>
+        <w:rPr>
+          <w:sz w:val="28"/>
+          <w:szCs w:val="28"/>
+        </w:rPr>
+      </w:pPr>
+      <w:r>
+        <w:rPr>
+          <w:noProof/>
+          <w:sz w:val="28"/>
+          <w:szCs w:val="28"/>
+        </w:rPr>
+        <mc:AlternateContent>
+          <mc:Choice Requires="wps">
+            <w:drawing>
+              <wp:anchor distT="0" distB="0" distL="114300" distR="114300" simplePos="0" relativeHeight="251665408" behindDoc="0" locked="0" layoutInCell="1" allowOverlap="1" wp14:anchorId="46585B0E" wp14:editId="46A9F124">
+                <wp:simplePos x="0" y="0"/>
+                <wp:positionH relativeFrom="column">
+                  <wp:posOffset>0</wp:posOffset>
+                </wp:positionH>
+                <wp:positionV relativeFrom="paragraph">
+                  <wp:posOffset>-635</wp:posOffset>
+                </wp:positionV>
+                <wp:extent cx="10887736" cy="0"/>
+                <wp:effectExtent l="0" t="0" r="0" b="0"/>
+                <wp:wrapNone/>
+                <wp:docPr id="1665347393" name="Straight Connector 1"/>
+                <wp:cNvGraphicFramePr/>
+                <a:graphic xmlns:a="http://schemas.openxmlformats.org/drawingml/2006/main">
+                  <a:graphicData uri="http://schemas.microsoft.com/office/word/2010/wordprocessingShape">
+                    <wps:wsp>
+                      <wps:cNvCnPr/>
+                      <wps:spPr>
+                        <a:xfrm flipH="1" flipV="1">
+                          <a:off x="0" y="0"/>
+                          <a:ext cx="10887736" cy="0"/>
+                        </a:xfrm>
+                        <a:prstGeom prst="line">
+                          <a:avLst/>
+                        </a:prstGeom>
+                        <a:ln w="19050" cap="flat" cmpd="sng" algn="ctr">
+                          <a:solidFill>
+                            <a:schemeClr val="accent1"/>
+                          </a:solidFill>
+                          <a:prstDash val="dash"/>
+                          <a:round/>
+                          <a:headEnd type="none" w="med" len="med"/>
+                          <a:tailEnd type="none" w="med" len="med"/>
+                        </a:ln>
+                      </wps:spPr>
+                      <wps:style>
+                        <a:lnRef idx="0">
+                          <a:scrgbClr r="0" g="0" b="0"/>
+                        </a:lnRef>
+                        <a:fillRef idx="0">
+                          <a:scrgbClr r="0" g="0" b="0"/>
+                        </a:fillRef>
+                        <a:effectRef idx="0">
+                          <a:scrgbClr r="0" g="0" b="0"/>
+                        </a:effectRef>
+                        <a:fontRef idx="minor">
+                          <a:schemeClr val="tx1"/>
+                        </a:fontRef>
+                      </wps:style>
+                      <wps:bodyPr/>
+                    </wps:wsp>
+                  </a:graphicData>
+                </a:graphic>
+                <wp14:sizeRelH relativeFrom="margin">
+                  <wp14:pctWidth>0</wp14:pctWidth>
+                </wp14:sizeRelH>
+                <wp14:sizeRelV relativeFrom="margin">
+                  <wp14:pctHeight>0</wp14:pctHeight>
+                </wp14:sizeRelV>
+              </wp:anchor>
+            </w:drawing>
+          </mc:Choice>
+          <mc:Fallback>
+            <w:pict>
+              <v:line w14:anchorId="6236CEE0" id="Straight Connector 1" o:spid="_x0000_s1026" style="position:absolute;flip:x y;z-index:251665408;visibility:visible;mso-wrap-style:square;mso-width-percent:0;mso-height-percent:0;mso-wrap-distance-left:9pt;mso-wrap-distance-top:0;mso-wrap-distance-right:9pt;mso-wrap-distance-bottom:0;mso-position-horizontal:absolute;mso-position-horizontal-relative:text;mso-position-vertical:absolute;mso-position-vertical-relative:text;mso-width-percent:0;mso-height-percent:0;mso-width-relative:margin;mso-height-relative:margin" from="0,-.05pt" to="857.3pt,-.05pt" o:gfxdata="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" strokecolor="#156082 [3204]" strokeweight="1.5pt">
+                <v:stroke dashstyle="dash"/>
+              </v:line>
+            </w:pict>
+          </mc:Fallback>
+        </mc:AlternateContent>
+      </w:r>
+    </w:p>
+    <w:p>
+      <w:pPr>
+        <w:pStyle w:val="ListParagraph"/>
+        <w:numPr>
+          <w:ilvl w:val="0"/>
+          <w:numId w:val="1"/>
+        </w:numPr>
+        <w:rPr>
+          <w:b/>
+          <w:bCs/>
+          <w:sz w:val="44"/>
+          <w:szCs w:val="44"/>
+          <w:highlight w:val="yellow"/>
+        </w:rPr>
+      </w:pPr>
+      <w:r>
+        <w:rPr>
+          <w:sz w:val="44"/>
+          <w:szCs w:val="44"/>
+          <w:highlight w:val="yellow"/>
+        </w:rPr>
+        <w:t xml:space="preserve">Fase </w:t>
+      </w:r>
+      <w:r>
+        <w:rPr>
+          <w:sz w:val="44"/>
+          <w:szCs w:val="44"/>
+          <w:highlight w:val="yellow"/>
+        </w:rPr>
+        <w:t>5</w:t>
+      </w:r>
+      <w:r>
+        <w:rPr>
+          <w:sz w:val="44"/>
+          <w:szCs w:val="44"/>
+          <w:highlight w:val="yellow"/>
+        </w:rPr>
+        <w:t xml:space="preserve">: </w:t>
+      </w:r>
+      <w:r>
+        <w:rPr>
+          <w:b/>
+          <w:bCs/>
+          <w:sz w:val="44"/>
+          <w:szCs w:val="44"/>
+          <w:highlight w:val="yellow"/>
+        </w:rPr>
+        <w:t xml:space="preserve">Join delle 2 tabelle + verifica e pulizia </w:t>
+      </w:r>
+    </w:p>
+    <w:p>
+      <w:pPr>
+        <w:ind w:left="360"/>
+        <w:jc w:val="center"/>
+        <w:rPr>
+          <w:sz w:val="28"/>
+          <w:szCs w:val="28"/>
+        </w:rPr>
+      </w:pPr>
+      <w:r>
+        <w:rPr>
+          <w:b/>
+          <w:bCs/>
+          <w:sz w:val="28"/>
+          <w:szCs w:val="28"/>
+        </w:rPr>
+        <w:t>Fonti</w:t>
+      </w:r>
+      <w:r>
+        <w:rPr>
+          <w:sz w:val="28"/>
+          <w:szCs w:val="28"/>
+        </w:rPr>
+        <w:t>:</w:t>
+      </w:r>
+    </w:p>
+    <w:p>
+      <w:pPr>
+        <w:ind w:left="360"/>
+        <w:jc w:val="center"/>
+        <w:rPr>
+          <w:sz w:val="28"/>
+          <w:szCs w:val="28"/>
+        </w:rPr>
+      </w:pPr>
+      <w:r>
+        <w:rPr>
+          <w:sz w:val="28"/>
+          <w:szCs w:val="28"/>
+        </w:rPr>
+        <w:t>https://stackoverflow.com/questions/41417214/prevent-pandas-from-reading-na-as-nan</w:t>
       </w:r>
     </w:p>
     <w:p>
@@ -4331,6 +4255,7 @@
   <w:style w:type="character" w:default="1" w:styleId="DefaultParagraphFont">
     <w:name w:val="Default Paragraph Font"/>
     <w:uiPriority w:val="1"/>
+    <w:semiHidden/>
     <w:unhideWhenUsed/>
   </w:style>
   <w:style w:type="table" w:default="1" w:styleId="TableNormal">

</xml_diff>

<commit_message>
ho sistemato la join dopo aver analizzato il file csv e aggiornato la rroad map
</commit_message>
<xml_diff>
--- a/Road Map - Capstone Project.docx
+++ b/Road Map - Capstone Project.docx
@@ -2861,12 +2861,425 @@
           <w:szCs w:val="28"/>
         </w:rPr>
       </w:pPr>
-      <w:r>
-        <w:rPr>
-          <w:sz w:val="28"/>
-          <w:szCs w:val="28"/>
-        </w:rPr>
-        <w:t>https://stackoverflow.com/questions/41417214/prevent-pandas-from-reading-na-as-nan</w:t>
+      <w:hyperlink r:id="rId11" w:history="1">
+        <w:r>
+          <w:rPr>
+            <w:rStyle w:val="Hyperlink"/>
+            <w:sz w:val="28"/>
+            <w:szCs w:val="28"/>
+          </w:rPr>
+          <w:t>https://stackoverflow.com/questions/41417214/prevent-pandas-fro</w:t>
+        </w:r>
+        <w:r>
+          <w:rPr>
+            <w:rStyle w:val="Hyperlink"/>
+            <w:sz w:val="28"/>
+            <w:szCs w:val="28"/>
+          </w:rPr>
+          <w:t>m</w:t>
+        </w:r>
+        <w:r>
+          <w:rPr>
+            <w:rStyle w:val="Hyperlink"/>
+            <w:sz w:val="28"/>
+            <w:szCs w:val="28"/>
+          </w:rPr>
+          <w:t>-reading-na-as-nan</w:t>
+        </w:r>
+      </w:hyperlink>
+    </w:p>
+    <w:p>
+      <w:pPr>
+        <w:ind w:left="360"/>
+        <w:jc w:val="center"/>
+        <w:rPr>
+          <w:sz w:val="28"/>
+          <w:szCs w:val="28"/>
+        </w:rPr>
+      </w:pPr>
+      <w:hyperlink r:id="rId12" w:history="1">
+        <w:r>
+          <w:rPr>
+            <w:rStyle w:val="Hyperlink"/>
+            <w:sz w:val="28"/>
+            <w:szCs w:val="28"/>
+          </w:rPr>
+          <w:t>https://www.w3resource.com/pandas/dataframe/dataframe-rename_axis.php</w:t>
+        </w:r>
+      </w:hyperlink>
+    </w:p>
+    <w:p>
+      <w:pPr>
+        <w:ind w:left="360"/>
+        <w:jc w:val="center"/>
+        <w:rPr>
+          <w:sz w:val="28"/>
+          <w:szCs w:val="28"/>
+        </w:rPr>
+      </w:pPr>
+      <w:hyperlink r:id="rId13" w:history="1">
+        <w:r>
+          <w:rPr>
+            <w:rStyle w:val="Hyperlink"/>
+            <w:sz w:val="28"/>
+            <w:szCs w:val="28"/>
+          </w:rPr>
+          <w:t>https://python-course.eu/numerical-programming/pandas-pivot.php</w:t>
+        </w:r>
+      </w:hyperlink>
+    </w:p>
+    <w:p>
+      <w:pPr>
+        <w:ind w:left="360"/>
+        <w:jc w:val="center"/>
+        <w:rPr>
+          <w:sz w:val="28"/>
+          <w:szCs w:val="28"/>
+        </w:rPr>
+      </w:pPr>
+    </w:p>
+    <w:p>
+      <w:pPr>
+        <w:pStyle w:val="ListParagraph"/>
+        <w:numPr>
+          <w:ilvl w:val="0"/>
+          <w:numId w:val="9"/>
+        </w:numPr>
+        <w:rPr>
+          <w:sz w:val="28"/>
+          <w:szCs w:val="28"/>
+        </w:rPr>
+      </w:pPr>
+      <w:r>
+        <w:rPr>
+          <w:sz w:val="28"/>
+          <w:szCs w:val="28"/>
+        </w:rPr>
+        <w:t xml:space="preserve">Ho caricato i 2 file csv </w:t>
+      </w:r>
+      <w:proofErr w:type="spellStart"/>
+      <w:r>
+        <w:rPr>
+          <w:sz w:val="28"/>
+          <w:szCs w:val="28"/>
+        </w:rPr>
+        <w:t>istat</w:t>
+      </w:r>
+      <w:proofErr w:type="spellEnd"/>
+      <w:r>
+        <w:rPr>
+          <w:sz w:val="28"/>
+          <w:szCs w:val="28"/>
+        </w:rPr>
+        <w:t xml:space="preserve"> e </w:t>
+      </w:r>
+      <w:proofErr w:type="spellStart"/>
+      <w:r>
+        <w:rPr>
+          <w:sz w:val="28"/>
+          <w:szCs w:val="28"/>
+        </w:rPr>
+        <w:t>situas</w:t>
+      </w:r>
+      <w:proofErr w:type="spellEnd"/>
+    </w:p>
+    <w:p>
+      <w:pPr>
+        <w:pStyle w:val="ListParagraph"/>
+        <w:numPr>
+          <w:ilvl w:val="0"/>
+          <w:numId w:val="9"/>
+        </w:numPr>
+        <w:rPr>
+          <w:sz w:val="28"/>
+          <w:szCs w:val="28"/>
+        </w:rPr>
+      </w:pPr>
+      <w:r>
+        <w:rPr>
+          <w:sz w:val="28"/>
+          <w:szCs w:val="28"/>
+        </w:rPr>
+        <w:t>Ho fatto la Left join dei 2 file usando come chiavi i codici comune e anni</w:t>
+      </w:r>
+    </w:p>
+    <w:p>
+      <w:pPr>
+        <w:pStyle w:val="ListParagraph"/>
+        <w:numPr>
+          <w:ilvl w:val="0"/>
+          <w:numId w:val="9"/>
+        </w:numPr>
+        <w:rPr>
+          <w:sz w:val="28"/>
+          <w:szCs w:val="28"/>
+        </w:rPr>
+      </w:pPr>
+      <w:r>
+        <w:rPr>
+          <w:sz w:val="28"/>
+          <w:szCs w:val="28"/>
+        </w:rPr>
+        <w:t xml:space="preserve">Ho verificato che i valori siano corretti </w:t>
+      </w:r>
+    </w:p>
+    <w:p>
+      <w:pPr>
+        <w:pStyle w:val="ListParagraph"/>
+        <w:numPr>
+          <w:ilvl w:val="0"/>
+          <w:numId w:val="9"/>
+        </w:numPr>
+        <w:rPr>
+          <w:sz w:val="28"/>
+          <w:szCs w:val="28"/>
+        </w:rPr>
+      </w:pPr>
+      <w:r>
+        <w:rPr>
+          <w:sz w:val="28"/>
+          <w:szCs w:val="28"/>
+        </w:rPr>
+        <w:t>Ho verificato con .info() e ho subito notato esserci dei valori mancanti e formato dati da sistemare</w:t>
+      </w:r>
+    </w:p>
+    <w:p>
+      <w:pPr>
+        <w:pStyle w:val="ListParagraph"/>
+        <w:numPr>
+          <w:ilvl w:val="0"/>
+          <w:numId w:val="9"/>
+        </w:numPr>
+        <w:rPr>
+          <w:sz w:val="28"/>
+          <w:szCs w:val="28"/>
+        </w:rPr>
+      </w:pPr>
+      <w:r>
+        <w:rPr>
+          <w:sz w:val="28"/>
+          <w:szCs w:val="28"/>
+        </w:rPr>
+        <w:t>Ho verificato i valori mancati e fatto una verifica sui valori dati perderei se decidessi di eliminare le righe con valori mancanti</w:t>
+      </w:r>
+    </w:p>
+    <w:p>
+      <w:pPr>
+        <w:pStyle w:val="ListParagraph"/>
+        <w:numPr>
+          <w:ilvl w:val="0"/>
+          <w:numId w:val="9"/>
+        </w:numPr>
+        <w:rPr>
+          <w:sz w:val="28"/>
+          <w:szCs w:val="28"/>
+        </w:rPr>
+      </w:pPr>
+      <w:r>
+        <w:rPr>
+          <w:sz w:val="28"/>
+          <w:szCs w:val="28"/>
+        </w:rPr>
+        <w:t>Ho eliminato le righe con valori mancanti e verificato con .info()</w:t>
+      </w:r>
+    </w:p>
+    <w:p>
+      <w:pPr>
+        <w:pStyle w:val="ListParagraph"/>
+        <w:numPr>
+          <w:ilvl w:val="0"/>
+          <w:numId w:val="9"/>
+        </w:numPr>
+        <w:rPr>
+          <w:sz w:val="28"/>
+          <w:szCs w:val="28"/>
+        </w:rPr>
+      </w:pPr>
+      <w:r>
+        <w:rPr>
+          <w:sz w:val="28"/>
+          <w:szCs w:val="28"/>
+        </w:rPr>
+        <w:t>Ho iniziato a sistemare la tabella per prepararla alla versione finale, facendo:</w:t>
+      </w:r>
+    </w:p>
+    <w:p>
+      <w:pPr>
+        <w:pStyle w:val="ListParagraph"/>
+        <w:numPr>
+          <w:ilvl w:val="0"/>
+          <w:numId w:val="1"/>
+        </w:numPr>
+        <w:rPr>
+          <w:sz w:val="28"/>
+          <w:szCs w:val="28"/>
+        </w:rPr>
+      </w:pPr>
+      <w:r>
+        <w:rPr>
+          <w:sz w:val="28"/>
+          <w:szCs w:val="28"/>
+        </w:rPr>
+        <w:t xml:space="preserve">Sistemazione delle colonne </w:t>
+      </w:r>
+    </w:p>
+    <w:p>
+      <w:pPr>
+        <w:pStyle w:val="ListParagraph"/>
+        <w:numPr>
+          <w:ilvl w:val="0"/>
+          <w:numId w:val="1"/>
+        </w:numPr>
+        <w:rPr>
+          <w:sz w:val="28"/>
+          <w:szCs w:val="28"/>
+        </w:rPr>
+      </w:pPr>
+      <w:r>
+        <w:rPr>
+          <w:sz w:val="28"/>
+          <w:szCs w:val="28"/>
+        </w:rPr>
+        <w:t>Ho fatto una pivot per rendere più efficiente l’analisi e utilizzo dei valori</w:t>
+      </w:r>
+    </w:p>
+    <w:p>
+      <w:pPr>
+        <w:pStyle w:val="ListParagraph"/>
+        <w:numPr>
+          <w:ilvl w:val="0"/>
+          <w:numId w:val="1"/>
+        </w:numPr>
+        <w:rPr>
+          <w:sz w:val="28"/>
+          <w:szCs w:val="28"/>
+        </w:rPr>
+      </w:pPr>
+      <w:r>
+        <w:rPr>
+          <w:sz w:val="28"/>
+          <w:szCs w:val="28"/>
+        </w:rPr>
+        <w:t xml:space="preserve">Sistemato i </w:t>
+      </w:r>
+      <w:proofErr w:type="spellStart"/>
+      <w:r>
+        <w:rPr>
+          <w:sz w:val="28"/>
+          <w:szCs w:val="28"/>
+        </w:rPr>
+        <w:t>Dtype</w:t>
+      </w:r>
+      <w:proofErr w:type="spellEnd"/>
+    </w:p>
+    <w:p>
+      <w:pPr>
+        <w:pStyle w:val="ListParagraph"/>
+        <w:numPr>
+          <w:ilvl w:val="0"/>
+          <w:numId w:val="1"/>
+        </w:numPr>
+        <w:rPr>
+          <w:sz w:val="28"/>
+          <w:szCs w:val="28"/>
+        </w:rPr>
+      </w:pPr>
+      <w:r>
+        <w:rPr>
+          <w:sz w:val="28"/>
+          <w:szCs w:val="28"/>
+        </w:rPr>
+        <w:t xml:space="preserve">Rinominato tutto in italiano </w:t>
+      </w:r>
+    </w:p>
+    <w:p>
+      <w:pPr>
+        <w:pStyle w:val="ListParagraph"/>
+        <w:numPr>
+          <w:ilvl w:val="0"/>
+          <w:numId w:val="9"/>
+        </w:numPr>
+        <w:rPr>
+          <w:sz w:val="28"/>
+          <w:szCs w:val="28"/>
+        </w:rPr>
+      </w:pPr>
+      <w:r>
+        <w:rPr>
+          <w:sz w:val="28"/>
+          <w:szCs w:val="28"/>
+        </w:rPr>
+        <w:t>Creato file CSV finale : df_finale.CSV</w:t>
+      </w:r>
+    </w:p>
+    <w:p>
+      <w:pPr>
+        <w:pStyle w:val="ListParagraph"/>
+        <w:ind w:left="1080"/>
+        <w:jc w:val="center"/>
+        <w:rPr>
+          <w:sz w:val="28"/>
+          <w:szCs w:val="28"/>
+        </w:rPr>
+      </w:pPr>
+      <w:r>
+        <w:rPr>
+          <w:sz w:val="28"/>
+          <w:szCs w:val="28"/>
+        </w:rPr>
+        <w:t>NOTE</w:t>
+      </w:r>
+    </w:p>
+    <w:p>
+      <w:pPr>
+        <w:pStyle w:val="ListParagraph"/>
+        <w:ind w:left="1080"/>
+        <w:jc w:val="center"/>
+        <w:rPr>
+          <w:sz w:val="28"/>
+          <w:szCs w:val="28"/>
+        </w:rPr>
+      </w:pPr>
+      <w:r>
+        <w:rPr>
+          <w:sz w:val="28"/>
+          <w:szCs w:val="28"/>
+        </w:rPr>
+        <w:t>Ho elencato i link dove ho reperito le fonti per la pivot e risolvere il problema di None visto che non si era risolto col sistema usato precedentemente.</w:t>
+      </w:r>
+    </w:p>
+    <w:p>
+      <w:pPr>
+        <w:pStyle w:val="ListParagraph"/>
+        <w:ind w:left="1080"/>
+        <w:jc w:val="center"/>
+        <w:rPr>
+          <w:sz w:val="28"/>
+          <w:szCs w:val="28"/>
+        </w:rPr>
+      </w:pPr>
+      <w:r>
+        <w:rPr>
+          <w:sz w:val="28"/>
+          <w:szCs w:val="28"/>
+        </w:rPr>
+        <w:t xml:space="preserve">La scelta di eliminare i valori </w:t>
+      </w:r>
+      <w:proofErr w:type="spellStart"/>
+      <w:r>
+        <w:rPr>
+          <w:sz w:val="28"/>
+          <w:szCs w:val="28"/>
+        </w:rPr>
+        <w:t>nan</w:t>
+      </w:r>
+      <w:proofErr w:type="spellEnd"/>
+      <w:r>
+        <w:rPr>
+          <w:sz w:val="28"/>
+          <w:szCs w:val="28"/>
+        </w:rPr>
+        <w:t xml:space="preserve"> è stata presa solo dopo aver analizzato i dati e ragionato su come tale decisione avrebbe potuto impattare su quello che è l’obbiettivo finale.</w:t>
       </w:r>
     </w:p>
     <w:p>
@@ -2890,6 +3303,92 @@
 <file path=word/numbering.xml><?xml version="1.0" encoding="utf-8"?>
 <w:numbering xmlns:wpc="http://schemas.microsoft.com/office/word/2010/wordprocessingCanvas" xmlns:cx="http://schemas.microsoft.com/office/drawing/2014/chartex" xmlns:cx1="http://schemas.microsoft.com/office/drawing/2015/9/8/chartex" xmlns:cx2="http://schemas.microsoft.com/office/drawing/2015/10/21/chartex" xmlns:cx3="http://schemas.microsoft.com/office/drawing/2016/5/9/chartex" xmlns:cx4="http://schemas.microsoft.com/office/drawing/2016/5/10/chartex" xmlns:cx5="http://schemas.microsoft.com/office/drawing/2016/5/11/chartex" xmlns:cx6="http://schemas.microsoft.com/office/drawing/2016/5/12/chartex" xmlns:cx7="http://schemas.microsoft.com/office/drawing/2016/5/13/chartex" xmlns:cx8="http://schemas.microsoft.com/office/drawing/2016/5/14/chartex" xmlns:mc="http://schemas.openxmlformats.org/markup-compatibility/2006" xmlns:aink="http://schemas.microsoft.com/office/drawing/2016/ink" xmlns:am3d="http://schemas.microsoft.com/office/drawing/2017/model3d" xmlns:o="urn:schemas-microsoft-com:office:office" xmlns:oel="http://schemas.microsoft.com/office/2019/extlst" xmlns:r="http://schemas.openxmlformats.org/officeDocument/2006/relationships" xmlns:m="http://schemas.openxmlformats.org/officeDocument/2006/math" xmlns:v="urn:schemas-microsoft-com:vml" xmlns:wp14="http://schemas.microsoft.com/office/word/2010/wordprocessingDrawing" xmlns:wp="http://schemas.openxmlformats.org/drawingml/2006/wordprocessingDrawing" xmlns:w10="urn:schemas-microsoft-com:office:word" xmlns:w="http://schemas.openxmlformats.org/wordprocessingml/2006/main" xmlns:w14="http://schemas.microsoft.com/office/word/2010/wordml" xmlns:w15="http://schemas.microsoft.com/office/word/2012/wordml" xmlns:w16cex="http://schemas.microsoft.com/office/word/2018/wordml/cex" xmlns:w16cid="http://schemas.microsoft.com/office/word/2016/wordml/cid" xmlns:w16="http://schemas.microsoft.com/office/word/2018/wordml" xmlns:w16du="http://schemas.microsoft.com/office/word/2023/wordml/word16du" xmlns:w16sdtdh="http://schemas.microsoft.com/office/word/2020/wordml/sdtdatahash" xmlns:w16sdtfl="http://schemas.microsoft.com/office/word/2024/wordml/sdtformatlock" xmlns:w16se="http://schemas.microsoft.com/office/word/2015/wordml/symex" xmlns:wpg="http://schemas.microsoft.com/office/word/2010/wordprocessingGroup" xmlns:wpi="http://schemas.microsoft.com/office/word/2010/wordprocessingInk" xmlns:wne="http://schemas.microsoft.com/office/word/2006/wordml" xmlns:wps="http://schemas.microsoft.com/office/word/2010/wordprocessingShape" mc:Ignorable="w14 w15 w16se w16cid w16 w16cex w16sdtdh w16sdtfl w16du wp14">
   <w:abstractNum w:abstractNumId="0" w15:restartNumberingAfterBreak="0">
+    <w:nsid w:val="05FF42A6"/>
+    <w:multiLevelType w:val="hybridMultilevel"/>
+    <w:tmpl w:val="5F1C4D24"/>
+    <w:lvl w:ilvl="0" w:tplc="0410000F">
+      <w:start w:val="1"/>
+      <w:numFmt w:val="decimal"/>
+      <w:lvlText w:val="%1."/>
+      <w:lvlJc w:val="left"/>
+      <w:pPr>
+        <w:ind w:left="1080" w:hanging="360"/>
+      </w:pPr>
+    </w:lvl>
+    <w:lvl w:ilvl="1" w:tplc="04100019" w:tentative="1">
+      <w:start w:val="1"/>
+      <w:numFmt w:val="lowerLetter"/>
+      <w:lvlText w:val="%2."/>
+      <w:lvlJc w:val="left"/>
+      <w:pPr>
+        <w:ind w:left="1800" w:hanging="360"/>
+      </w:pPr>
+    </w:lvl>
+    <w:lvl w:ilvl="2" w:tplc="0410001B" w:tentative="1">
+      <w:start w:val="1"/>
+      <w:numFmt w:val="lowerRoman"/>
+      <w:lvlText w:val="%3."/>
+      <w:lvlJc w:val="right"/>
+      <w:pPr>
+        <w:ind w:left="2520" w:hanging="180"/>
+      </w:pPr>
+    </w:lvl>
+    <w:lvl w:ilvl="3" w:tplc="0410000F" w:tentative="1">
+      <w:start w:val="1"/>
+      <w:numFmt w:val="decimal"/>
+      <w:lvlText w:val="%4."/>
+      <w:lvlJc w:val="left"/>
+      <w:pPr>
+        <w:ind w:left="3240" w:hanging="360"/>
+      </w:pPr>
+    </w:lvl>
+    <w:lvl w:ilvl="4" w:tplc="04100019" w:tentative="1">
+      <w:start w:val="1"/>
+      <w:numFmt w:val="lowerLetter"/>
+      <w:lvlText w:val="%5."/>
+      <w:lvlJc w:val="left"/>
+      <w:pPr>
+        <w:ind w:left="3960" w:hanging="360"/>
+      </w:pPr>
+    </w:lvl>
+    <w:lvl w:ilvl="5" w:tplc="0410001B" w:tentative="1">
+      <w:start w:val="1"/>
+      <w:numFmt w:val="lowerRoman"/>
+      <w:lvlText w:val="%6."/>
+      <w:lvlJc w:val="right"/>
+      <w:pPr>
+        <w:ind w:left="4680" w:hanging="180"/>
+      </w:pPr>
+    </w:lvl>
+    <w:lvl w:ilvl="6" w:tplc="0410000F" w:tentative="1">
+      <w:start w:val="1"/>
+      <w:numFmt w:val="decimal"/>
+      <w:lvlText w:val="%7."/>
+      <w:lvlJc w:val="left"/>
+      <w:pPr>
+        <w:ind w:left="5400" w:hanging="360"/>
+      </w:pPr>
+    </w:lvl>
+    <w:lvl w:ilvl="7" w:tplc="04100019" w:tentative="1">
+      <w:start w:val="1"/>
+      <w:numFmt w:val="lowerLetter"/>
+      <w:lvlText w:val="%8."/>
+      <w:lvlJc w:val="left"/>
+      <w:pPr>
+        <w:ind w:left="6120" w:hanging="360"/>
+      </w:pPr>
+    </w:lvl>
+    <w:lvl w:ilvl="8" w:tplc="0410001B" w:tentative="1">
+      <w:start w:val="1"/>
+      <w:numFmt w:val="lowerRoman"/>
+      <w:lvlText w:val="%9."/>
+      <w:lvlJc w:val="right"/>
+      <w:pPr>
+        <w:ind w:left="6840" w:hanging="180"/>
+      </w:pPr>
+    </w:lvl>
+  </w:abstractNum>
+  <w:abstractNum w:abstractNumId="1" w15:restartNumberingAfterBreak="0">
     <w:nsid w:val="2C631B30"/>
     <w:multiLevelType w:val="hybridMultilevel"/>
     <w:tmpl w:val="A91ADAF6"/>
@@ -2978,7 +3477,7 @@
       </w:pPr>
     </w:lvl>
   </w:abstractNum>
-  <w:abstractNum w:abstractNumId="1" w15:restartNumberingAfterBreak="0">
+  <w:abstractNum w:abstractNumId="2" w15:restartNumberingAfterBreak="0">
     <w:nsid w:val="2CD102BA"/>
     <w:multiLevelType w:val="hybridMultilevel"/>
     <w:tmpl w:val="7C52F486"/>
@@ -3067,7 +3566,7 @@
       </w:pPr>
     </w:lvl>
   </w:abstractNum>
-  <w:abstractNum w:abstractNumId="2" w15:restartNumberingAfterBreak="0">
+  <w:abstractNum w:abstractNumId="3" w15:restartNumberingAfterBreak="0">
     <w:nsid w:val="2E181D0D"/>
     <w:multiLevelType w:val="hybridMultilevel"/>
     <w:tmpl w:val="EAE84DE0"/>
@@ -3156,7 +3655,7 @@
       </w:pPr>
     </w:lvl>
   </w:abstractNum>
-  <w:abstractNum w:abstractNumId="3" w15:restartNumberingAfterBreak="0">
+  <w:abstractNum w:abstractNumId="4" w15:restartNumberingAfterBreak="0">
     <w:nsid w:val="35442224"/>
     <w:multiLevelType w:val="hybridMultilevel"/>
     <w:tmpl w:val="5E901E4E"/>
@@ -3245,7 +3744,7 @@
       </w:pPr>
     </w:lvl>
   </w:abstractNum>
-  <w:abstractNum w:abstractNumId="4" w15:restartNumberingAfterBreak="0">
+  <w:abstractNum w:abstractNumId="5" w15:restartNumberingAfterBreak="0">
     <w:nsid w:val="48E371E5"/>
     <w:multiLevelType w:val="hybridMultilevel"/>
     <w:tmpl w:val="57CA4248"/>
@@ -3358,7 +3857,7 @@
       </w:rPr>
     </w:lvl>
   </w:abstractNum>
-  <w:abstractNum w:abstractNumId="5" w15:restartNumberingAfterBreak="0">
+  <w:abstractNum w:abstractNumId="6" w15:restartNumberingAfterBreak="0">
     <w:nsid w:val="56D8554D"/>
     <w:multiLevelType w:val="hybridMultilevel"/>
     <w:tmpl w:val="37B45552"/>
@@ -3447,7 +3946,7 @@
       </w:pPr>
     </w:lvl>
   </w:abstractNum>
-  <w:abstractNum w:abstractNumId="6" w15:restartNumberingAfterBreak="0">
+  <w:abstractNum w:abstractNumId="7" w15:restartNumberingAfterBreak="0">
     <w:nsid w:val="6DBC25C0"/>
     <w:multiLevelType w:val="hybridMultilevel"/>
     <w:tmpl w:val="55143D28"/>
@@ -3536,7 +4035,7 @@
       </w:pPr>
     </w:lvl>
   </w:abstractNum>
-  <w:abstractNum w:abstractNumId="7" w15:restartNumberingAfterBreak="0">
+  <w:abstractNum w:abstractNumId="8" w15:restartNumberingAfterBreak="0">
     <w:nsid w:val="77CB0222"/>
     <w:multiLevelType w:val="hybridMultilevel"/>
     <w:tmpl w:val="5AE2F93C"/>
@@ -3626,28 +4125,31 @@
     </w:lvl>
   </w:abstractNum>
   <w:num w:numId="1" w16cid:durableId="959527209">
+    <w:abstractNumId w:val="5"/>
+  </w:num>
+  <w:num w:numId="2" w16cid:durableId="546798924">
+    <w:abstractNumId w:val="8"/>
+  </w:num>
+  <w:num w:numId="3" w16cid:durableId="563374064">
+    <w:abstractNumId w:val="7"/>
+  </w:num>
+  <w:num w:numId="4" w16cid:durableId="1238975505">
+    <w:abstractNumId w:val="3"/>
+  </w:num>
+  <w:num w:numId="5" w16cid:durableId="196047935">
+    <w:abstractNumId w:val="1"/>
+  </w:num>
+  <w:num w:numId="6" w16cid:durableId="807017504">
+    <w:abstractNumId w:val="6"/>
+  </w:num>
+  <w:num w:numId="7" w16cid:durableId="894853274">
     <w:abstractNumId w:val="4"/>
   </w:num>
-  <w:num w:numId="2" w16cid:durableId="546798924">
-    <w:abstractNumId w:val="7"/>
-  </w:num>
-  <w:num w:numId="3" w16cid:durableId="563374064">
-    <w:abstractNumId w:val="6"/>
-  </w:num>
-  <w:num w:numId="4" w16cid:durableId="1238975505">
+  <w:num w:numId="8" w16cid:durableId="1752852094">
     <w:abstractNumId w:val="2"/>
   </w:num>
-  <w:num w:numId="5" w16cid:durableId="196047935">
+  <w:num w:numId="9" w16cid:durableId="2093159708">
     <w:abstractNumId w:val="0"/>
-  </w:num>
-  <w:num w:numId="6" w16cid:durableId="807017504">
-    <w:abstractNumId w:val="5"/>
-  </w:num>
-  <w:num w:numId="7" w16cid:durableId="894853274">
-    <w:abstractNumId w:val="3"/>
-  </w:num>
-  <w:num w:numId="8" w16cid:durableId="1752852094">
-    <w:abstractNumId w:val="1"/>
   </w:num>
 </w:numbering>
 </file>

</xml_diff>

<commit_message>
finito statistica col clustering, aggiornato la roadmap e creato file csv completo di clustering per power bi
</commit_message>
<xml_diff>
--- a/Road Map - Capstone Project.docx
+++ b/Road Map - Capstone Project.docx
@@ -388,6 +388,7 @@
         <w:t xml:space="preserve">Con </w:t>
       </w:r>
       <w:proofErr w:type="spellStart"/>
+      <w:proofErr w:type="gramStart"/>
       <w:r>
         <w:rPr>
           <w:sz w:val="28"/>
@@ -396,6 +397,7 @@
         <w:t>io.StringIO</w:t>
       </w:r>
       <w:proofErr w:type="spellEnd"/>
+      <w:proofErr w:type="gramEnd"/>
       <w:r>
         <w:rPr>
           <w:sz w:val="28"/>
@@ -502,7 +504,15 @@
           <w:sz w:val="28"/>
           <w:szCs w:val="28"/>
         </w:rPr>
-        <w:t>pd.read_csv</w:t>
+        <w:t>pd.read_</w:t>
+      </w:r>
+      <w:proofErr w:type="gramStart"/>
+      <w:r>
+        <w:rPr>
+          <w:sz w:val="28"/>
+          <w:szCs w:val="28"/>
+        </w:rPr>
+        <w:t>csv</w:t>
       </w:r>
       <w:proofErr w:type="spellEnd"/>
       <w:r>
@@ -510,7 +520,15 @@
           <w:sz w:val="28"/>
           <w:szCs w:val="28"/>
         </w:rPr>
-        <w:t>(…) ma restituiva</w:t>
+        <w:t>(</w:t>
+      </w:r>
+      <w:proofErr w:type="gramEnd"/>
+      <w:r>
+        <w:rPr>
+          <w:sz w:val="28"/>
+          <w:szCs w:val="28"/>
+        </w:rPr>
+        <w:t>…) ma restituiva</w:t>
       </w:r>
       <w:r>
         <w:rPr>
@@ -600,6 +618,7 @@
         <w:t>: &lt;class '</w:t>
       </w:r>
       <w:proofErr w:type="spellStart"/>
+      <w:proofErr w:type="gramStart"/>
       <w:r>
         <w:rPr>
           <w:i/>
@@ -607,7 +626,17 @@
           <w:sz w:val="28"/>
           <w:szCs w:val="28"/>
         </w:rPr>
-        <w:t>requests.models.Response</w:t>
+        <w:t>requests.models</w:t>
+      </w:r>
+      <w:proofErr w:type="gramEnd"/>
+      <w:r>
+        <w:rPr>
+          <w:i/>
+          <w:iCs/>
+          <w:sz w:val="28"/>
+          <w:szCs w:val="28"/>
+        </w:rPr>
+        <w:t>.Response</w:t>
       </w:r>
       <w:proofErr w:type="spellEnd"/>
       <w:r>
@@ -640,6 +669,7 @@
         <w:t xml:space="preserve">l’unico pezzo nuovo che mi mancava era </w:t>
       </w:r>
       <w:proofErr w:type="spellStart"/>
+      <w:proofErr w:type="gramStart"/>
       <w:r>
         <w:rPr>
           <w:sz w:val="28"/>
@@ -648,6 +678,7 @@
         <w:t>io.StringIO</w:t>
       </w:r>
       <w:proofErr w:type="spellEnd"/>
+      <w:proofErr w:type="gramEnd"/>
       <w:r>
         <w:rPr>
           <w:sz w:val="28"/>
@@ -725,7 +756,25 @@
           <w:szCs w:val="28"/>
           <w:lang w:val="en-GB"/>
         </w:rPr>
-        <w:t xml:space="preserve">: By file-like object, we refer to objects with a read() method, such as a file handle (e.g. via </w:t>
+        <w:t>: By file-like object, we refer to objects with a </w:t>
+      </w:r>
+      <w:proofErr w:type="gramStart"/>
+      <w:r>
+        <w:rPr>
+          <w:sz w:val="28"/>
+          <w:szCs w:val="28"/>
+          <w:lang w:val="en-GB"/>
+        </w:rPr>
+        <w:t>read(</w:t>
+      </w:r>
+      <w:proofErr w:type="gramEnd"/>
+      <w:r>
+        <w:rPr>
+          <w:sz w:val="28"/>
+          <w:szCs w:val="28"/>
+          <w:lang w:val="en-GB"/>
+        </w:rPr>
+        <w:t xml:space="preserve">) method, such as a file handle (e.g. via </w:t>
       </w:r>
       <w:proofErr w:type="spellStart"/>
       <w:r>
@@ -755,6 +804,7 @@
         <w:t>StringIO</w:t>
       </w:r>
       <w:proofErr w:type="spellEnd"/>
+      <w:proofErr w:type="gramStart"/>
       <w:r>
         <w:rPr>
           <w:sz w:val="28"/>
@@ -769,7 +819,16 @@
           <w:szCs w:val="28"/>
           <w:lang w:val="en-GB"/>
         </w:rPr>
-        <w:t xml:space="preserve"> : </w:t>
+        <w:t xml:space="preserve"> :</w:t>
+      </w:r>
+      <w:proofErr w:type="gramEnd"/>
+      <w:r>
+        <w:rPr>
+          <w:sz w:val="28"/>
+          <w:szCs w:val="28"/>
+          <w:lang w:val="en-GB"/>
+        </w:rPr>
+        <w:t xml:space="preserve"> </w:t>
       </w:r>
       <w:proofErr w:type="spellStart"/>
       <w:r>
@@ -976,7 +1035,7 @@
         <mc:AlternateContent>
           <mc:Choice Requires="wps">
             <w:drawing>
-              <wp:anchor distT="0" distB="0" distL="114300" distR="114300" simplePos="0" relativeHeight="251661312" behindDoc="0" locked="0" layoutInCell="1" allowOverlap="1" wp14:anchorId="0C5DB149" wp14:editId="7FB2026D">
+              <wp:anchor distT="0" distB="0" distL="114300" distR="114300" simplePos="0" relativeHeight="251661312" behindDoc="0" locked="0" layoutInCell="1" allowOverlap="1" wp14:anchorId="0C5DB149" wp14:editId="637282CB">
                 <wp:simplePos x="0" y="0"/>
                 <wp:positionH relativeFrom="column">
                   <wp:posOffset>-275</wp:posOffset>
@@ -984,8 +1043,8 @@
                 <wp:positionV relativeFrom="paragraph">
                   <wp:posOffset>-2596</wp:posOffset>
                 </wp:positionV>
-                <wp:extent cx="20000518" cy="10571"/>
-                <wp:effectExtent l="0" t="0" r="21590" b="27940"/>
+                <wp:extent cx="18398996" cy="31713"/>
+                <wp:effectExtent l="0" t="0" r="22860" b="26035"/>
                 <wp:wrapNone/>
                 <wp:docPr id="1083866337" name="Straight Connector 1"/>
                 <wp:cNvGraphicFramePr/>
@@ -996,7 +1055,7 @@
                       <wps:spPr>
                         <a:xfrm flipH="1" flipV="1">
                           <a:off x="0" y="0"/>
-                          <a:ext cx="20000518" cy="10571"/>
+                          <a:ext cx="18398996" cy="31713"/>
                         </a:xfrm>
                         <a:prstGeom prst="line">
                           <a:avLst/>
@@ -1040,7 +1099,7 @@
           </mc:Choice>
           <mc:Fallback>
             <w:pict>
-              <v:line w14:anchorId="6FA1C5D8" id="Straight Connector 1" o:spid="_x0000_s1026" style="position:absolute;flip:x y;z-index:251661312;visibility:visible;mso-wrap-style:square;mso-width-percent:0;mso-height-percent:0;mso-wrap-distance-left:9pt;mso-wrap-distance-top:0;mso-wrap-distance-right:9pt;mso-wrap-distance-bottom:0;mso-position-horizontal:absolute;mso-position-horizontal-relative:text;mso-position-vertical:absolute;mso-position-vertical-relative:text;mso-width-percent:0;mso-height-percent:0;mso-width-relative:margin;mso-height-relative:margin" from="0,-.2pt" to="1574.85pt,.65pt" o:gfxdata="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" strokecolor="#156082 [3204]" strokeweight="1.5pt">
+              <v:line w14:anchorId="4CA00CEF" id="Straight Connector 1" o:spid="_x0000_s1026" style="position:absolute;flip:x y;z-index:251661312;visibility:visible;mso-wrap-style:square;mso-width-percent:0;mso-height-percent:0;mso-wrap-distance-left:9pt;mso-wrap-distance-top:0;mso-wrap-distance-right:9pt;mso-wrap-distance-bottom:0;mso-position-horizontal:absolute;mso-position-horizontal-relative:text;mso-position-vertical:absolute;mso-position-vertical-relative:text;mso-width-percent:0;mso-height-percent:0;mso-width-relative:margin;mso-height-relative:margin" from="0,-.2pt" to="1448.75pt,2.3pt" o:gfxdata="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" strokecolor="#156082 [3204]" strokeweight="1.5pt">
                 <v:stroke dashstyle="dash"/>
               </v:line>
             </w:pict>
@@ -1202,14 +1261,23 @@
           <w:sz w:val="28"/>
           <w:szCs w:val="28"/>
         </w:rPr>
-        <w:t>ho verificato la sua struttura con .info()</w:t>
-      </w:r>
-      <w:r>
-        <w:rPr>
-          <w:sz w:val="28"/>
-          <w:szCs w:val="28"/>
-        </w:rPr>
-        <w:t>.</w:t>
+        <w:t>ho verificato la sua struttura con .</w:t>
+      </w:r>
+      <w:proofErr w:type="gramStart"/>
+      <w:r>
+        <w:rPr>
+          <w:sz w:val="28"/>
+          <w:szCs w:val="28"/>
+        </w:rPr>
+        <w:t>info(</w:t>
+      </w:r>
+      <w:proofErr w:type="gramEnd"/>
+      <w:r>
+        <w:rPr>
+          <w:sz w:val="28"/>
+          <w:szCs w:val="28"/>
+        </w:rPr>
+        <w:t>)</w:t>
       </w:r>
     </w:p>
     <w:p>
@@ -1271,12 +1339,21 @@
         </w:rPr>
         <w:t xml:space="preserve">Per le restanti </w:t>
       </w:r>
-      <w:r>
-        <w:rPr>
-          <w:sz w:val="28"/>
-          <w:szCs w:val="28"/>
-        </w:rPr>
-        <w:t xml:space="preserve">6 </w:t>
+      <w:proofErr w:type="gramStart"/>
+      <w:r>
+        <w:rPr>
+          <w:sz w:val="28"/>
+          <w:szCs w:val="28"/>
+        </w:rPr>
+        <w:t>6</w:t>
+      </w:r>
+      <w:proofErr w:type="gramEnd"/>
+      <w:r>
+        <w:rPr>
+          <w:sz w:val="28"/>
+          <w:szCs w:val="28"/>
+        </w:rPr>
+        <w:t xml:space="preserve"> </w:t>
       </w:r>
       <w:r>
         <w:rPr>
@@ -1591,8 +1668,17 @@
           <w:sz w:val="28"/>
           <w:szCs w:val="28"/>
         </w:rPr>
-        <w:t>ho dedotto si trattasse della fonte dati..</w:t>
-      </w:r>
+        <w:t xml:space="preserve">ho dedotto si trattasse della fonte </w:t>
+      </w:r>
+      <w:proofErr w:type="gramStart"/>
+      <w:r>
+        <w:rPr>
+          <w:sz w:val="28"/>
+          <w:szCs w:val="28"/>
+        </w:rPr>
+        <w:t>dati..</w:t>
+      </w:r>
+      <w:proofErr w:type="gramEnd"/>
     </w:p>
     <w:p>
       <w:pPr>
@@ -1611,16 +1697,16 @@
         <mc:AlternateContent>
           <mc:Choice Requires="wps">
             <w:drawing>
-              <wp:anchor distT="0" distB="0" distL="114300" distR="114300" simplePos="0" relativeHeight="251659264" behindDoc="0" locked="0" layoutInCell="1" allowOverlap="1" wp14:anchorId="02442F77" wp14:editId="68352A3B">
+              <wp:anchor distT="0" distB="0" distL="114300" distR="114300" simplePos="0" relativeHeight="251659264" behindDoc="0" locked="0" layoutInCell="1" allowOverlap="1" wp14:anchorId="02442F77" wp14:editId="33180AC7">
                 <wp:simplePos x="0" y="0"/>
                 <wp:positionH relativeFrom="column">
-                  <wp:posOffset>5011</wp:posOffset>
+                  <wp:posOffset>5010</wp:posOffset>
                 </wp:positionH>
                 <wp:positionV relativeFrom="paragraph">
-                  <wp:posOffset>188221</wp:posOffset>
+                  <wp:posOffset>157939</wp:posOffset>
                 </wp:positionV>
-                <wp:extent cx="10887736" cy="0"/>
-                <wp:effectExtent l="0" t="0" r="0" b="0"/>
+                <wp:extent cx="19366252" cy="31713"/>
+                <wp:effectExtent l="0" t="0" r="26670" b="26035"/>
                 <wp:wrapNone/>
                 <wp:docPr id="1477320694" name="Straight Connector 1"/>
                 <wp:cNvGraphicFramePr/>
@@ -1629,9 +1715,9 @@
                     <wps:wsp>
                       <wps:cNvCnPr/>
                       <wps:spPr>
-                        <a:xfrm flipH="1" flipV="1">
+                        <a:xfrm flipH="1">
                           <a:off x="0" y="0"/>
-                          <a:ext cx="10887736" cy="0"/>
+                          <a:ext cx="19366252" cy="31713"/>
                         </a:xfrm>
                         <a:prstGeom prst="line">
                           <a:avLst/>
@@ -1675,7 +1761,7 @@
           </mc:Choice>
           <mc:Fallback>
             <w:pict>
-              <v:line w14:anchorId="12AFA6E0" id="Straight Connector 1" o:spid="_x0000_s1026" style="position:absolute;flip:x y;z-index:251659264;visibility:visible;mso-wrap-style:square;mso-width-percent:0;mso-height-percent:0;mso-wrap-distance-left:9pt;mso-wrap-distance-top:0;mso-wrap-distance-right:9pt;mso-wrap-distance-bottom:0;mso-position-horizontal:absolute;mso-position-horizontal-relative:text;mso-position-vertical:absolute;mso-position-vertical-relative:text;mso-width-percent:0;mso-height-percent:0;mso-width-relative:margin;mso-height-relative:margin" from=".4pt,14.8pt" to="857.7pt,14.8pt" o:gfxdata="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" strokecolor="#156082 [3204]" strokeweight="1.5pt">
+              <v:line w14:anchorId="04AF3D9A" id="Straight Connector 1" o:spid="_x0000_s1026" style="position:absolute;flip:x;z-index:251659264;visibility:visible;mso-wrap-style:square;mso-width-percent:0;mso-height-percent:0;mso-wrap-distance-left:9pt;mso-wrap-distance-top:0;mso-wrap-distance-right:9pt;mso-wrap-distance-bottom:0;mso-position-horizontal:absolute;mso-position-horizontal-relative:text;mso-position-vertical:absolute;mso-position-vertical-relative:text;mso-width-percent:0;mso-height-percent:0;mso-width-relative:margin;mso-height-relative:margin" from=".4pt,12.45pt" to="1525.3pt,14.95pt" o:gfxdata="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" strokecolor="#156082 [3204]" strokeweight="1.5pt">
                 <v:stroke dashstyle="dash"/>
               </v:line>
             </w:pict>
@@ -1799,7 +1885,23 @@
             <w:sz w:val="28"/>
             <w:szCs w:val="28"/>
           </w:rPr>
-          <w:t>https://situas.istat.it/web/#/territorio/body?id=74&amp;dateFrom=2001-12-31</w:t>
+          <w:t>https://situas.istat.it/web/#/</w:t>
+        </w:r>
+        <w:r>
+          <w:rPr>
+            <w:rStyle w:val="Hyperlink"/>
+            <w:sz w:val="28"/>
+            <w:szCs w:val="28"/>
+          </w:rPr>
+          <w:t>t</w:t>
+        </w:r>
+        <w:r>
+          <w:rPr>
+            <w:rStyle w:val="Hyperlink"/>
+            <w:sz w:val="28"/>
+            <w:szCs w:val="28"/>
+          </w:rPr>
+          <w:t>erritorio/body?id=74&amp;dateFrom=2001-12-31</w:t>
         </w:r>
       </w:hyperlink>
     </w:p>
@@ -1846,7 +1948,39 @@
           <w:sz w:val="28"/>
           <w:szCs w:val="28"/>
         </w:rPr>
-        <w:t xml:space="preserve"> un .max() e .min() sulla colonna </w:t>
+        <w:t xml:space="preserve"> un .</w:t>
+      </w:r>
+      <w:proofErr w:type="gramStart"/>
+      <w:r>
+        <w:rPr>
+          <w:sz w:val="28"/>
+          <w:szCs w:val="28"/>
+        </w:rPr>
+        <w:t>max(</w:t>
+      </w:r>
+      <w:proofErr w:type="gramEnd"/>
+      <w:r>
+        <w:rPr>
+          <w:sz w:val="28"/>
+          <w:szCs w:val="28"/>
+        </w:rPr>
+        <w:t xml:space="preserve">) </w:t>
+      </w:r>
+      <w:proofErr w:type="gramStart"/>
+      <w:r>
+        <w:rPr>
+          <w:sz w:val="28"/>
+          <w:szCs w:val="28"/>
+        </w:rPr>
+        <w:t>e .min</w:t>
+      </w:r>
+      <w:proofErr w:type="gramEnd"/>
+      <w:r>
+        <w:rPr>
+          <w:sz w:val="28"/>
+          <w:szCs w:val="28"/>
+        </w:rPr>
+        <w:t xml:space="preserve">() sulla colonna </w:t>
       </w:r>
       <w:proofErr w:type="spellStart"/>
       <w:r>
@@ -1947,8 +2081,17 @@
           <w:sz w:val="28"/>
           <w:szCs w:val="28"/>
         </w:rPr>
-        <w:t>per motivi organizzativi non potevo rischiare di rimanere troppo indietro con l’esame..</w:t>
-      </w:r>
+        <w:t xml:space="preserve">per motivi organizzativi non potevo rischiare di rimanere troppo indietro con </w:t>
+      </w:r>
+      <w:proofErr w:type="gramStart"/>
+      <w:r>
+        <w:rPr>
+          <w:sz w:val="28"/>
+          <w:szCs w:val="28"/>
+        </w:rPr>
+        <w:t>l’esame..</w:t>
+      </w:r>
+      <w:proofErr w:type="gramEnd"/>
       <w:r>
         <w:rPr>
           <w:sz w:val="28"/>
@@ -2150,7 +2293,15 @@
           <w:sz w:val="28"/>
           <w:szCs w:val="28"/>
         </w:rPr>
-        <w:t xml:space="preserve"> dentro a una lista con .</w:t>
+        <w:t xml:space="preserve"> dentro a una lista </w:t>
+      </w:r>
+      <w:proofErr w:type="gramStart"/>
+      <w:r>
+        <w:rPr>
+          <w:sz w:val="28"/>
+          <w:szCs w:val="28"/>
+        </w:rPr>
+        <w:t>con .</w:t>
       </w:r>
       <w:proofErr w:type="spellStart"/>
       <w:r>
@@ -2161,6 +2312,7 @@
         <w:t>append</w:t>
       </w:r>
       <w:proofErr w:type="spellEnd"/>
+      <w:proofErr w:type="gramEnd"/>
     </w:p>
     <w:p>
       <w:pPr>
@@ -2247,7 +2399,39 @@
           <w:sz w:val="28"/>
           <w:szCs w:val="28"/>
         </w:rPr>
-        <w:t>Ho notato, aprendo i vari file, che il censimento viene fatto ogni 10 anni e che la colonna popolazione legale non fa riferimento a quella attuale perché anch’essa cambia col cambiare del censimento.. ho quindi usato la colonna popolazione residente avendo notato che cambia col passare degli anni, quindi col cambiare della colonna anno popolazione</w:t>
+        <w:t xml:space="preserve">Ho notato, aprendo i vari file, che il censimento viene fatto ogni </w:t>
+      </w:r>
+      <w:proofErr w:type="gramStart"/>
+      <w:r>
+        <w:rPr>
+          <w:sz w:val="28"/>
+          <w:szCs w:val="28"/>
+        </w:rPr>
+        <w:t>10</w:t>
+      </w:r>
+      <w:proofErr w:type="gramEnd"/>
+      <w:r>
+        <w:rPr>
+          <w:sz w:val="28"/>
+          <w:szCs w:val="28"/>
+        </w:rPr>
+        <w:t xml:space="preserve"> anni e che la colonna popolazione legale non fa riferimento a quella attuale perché anch’essa cambia col cambiare del </w:t>
+      </w:r>
+      <w:proofErr w:type="gramStart"/>
+      <w:r>
+        <w:rPr>
+          <w:sz w:val="28"/>
+          <w:szCs w:val="28"/>
+        </w:rPr>
+        <w:t>censimento..</w:t>
+      </w:r>
+      <w:proofErr w:type="gramEnd"/>
+      <w:r>
+        <w:rPr>
+          <w:sz w:val="28"/>
+          <w:szCs w:val="28"/>
+        </w:rPr>
+        <w:t xml:space="preserve"> ho quindi usato la colonna popolazione residente avendo notato che cambia col passare degli anni, quindi col cambiare della colonna anno popolazione</w:t>
       </w:r>
     </w:p>
     <w:p>
@@ -2266,16 +2450,16 @@
         <mc:AlternateContent>
           <mc:Choice Requires="wps">
             <w:drawing>
-              <wp:anchor distT="0" distB="0" distL="114300" distR="114300" simplePos="0" relativeHeight="251663360" behindDoc="0" locked="0" layoutInCell="1" allowOverlap="1" wp14:anchorId="23ADDAB1" wp14:editId="5FAB8061">
+              <wp:anchor distT="0" distB="0" distL="114300" distR="114300" simplePos="0" relativeHeight="251663360" behindDoc="0" locked="0" layoutInCell="1" allowOverlap="1" wp14:anchorId="23ADDAB1" wp14:editId="1C1E7600">
                 <wp:simplePos x="0" y="0"/>
                 <wp:positionH relativeFrom="column">
-                  <wp:posOffset>0</wp:posOffset>
+                  <wp:posOffset>-37275</wp:posOffset>
                 </wp:positionH>
                 <wp:positionV relativeFrom="paragraph">
-                  <wp:posOffset>0</wp:posOffset>
+                  <wp:posOffset>57510</wp:posOffset>
                 </wp:positionV>
-                <wp:extent cx="10887736" cy="0"/>
-                <wp:effectExtent l="0" t="0" r="0" b="0"/>
+                <wp:extent cx="19630529" cy="5304"/>
+                <wp:effectExtent l="0" t="0" r="10160" b="33020"/>
                 <wp:wrapNone/>
                 <wp:docPr id="917576010" name="Straight Connector 1"/>
                 <wp:cNvGraphicFramePr/>
@@ -2284,9 +2468,9 @@
                     <wps:wsp>
                       <wps:cNvCnPr/>
                       <wps:spPr>
-                        <a:xfrm flipH="1" flipV="1">
+                        <a:xfrm flipH="1">
                           <a:off x="0" y="0"/>
-                          <a:ext cx="10887736" cy="0"/>
+                          <a:ext cx="19630529" cy="5304"/>
                         </a:xfrm>
                         <a:prstGeom prst="line">
                           <a:avLst/>
@@ -2330,7 +2514,7 @@
           </mc:Choice>
           <mc:Fallback>
             <w:pict>
-              <v:line w14:anchorId="2FFE95A8" id="Straight Connector 1" o:spid="_x0000_s1026" style="position:absolute;flip:x y;z-index:251663360;visibility:visible;mso-wrap-style:square;mso-width-percent:0;mso-height-percent:0;mso-wrap-distance-left:9pt;mso-wrap-distance-top:0;mso-wrap-distance-right:9pt;mso-wrap-distance-bottom:0;mso-position-horizontal:absolute;mso-position-horizontal-relative:text;mso-position-vertical:absolute;mso-position-vertical-relative:text;mso-width-percent:0;mso-height-percent:0;mso-width-relative:margin;mso-height-relative:margin" from="0,0" to="857.3pt,0" o:gfxdata="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" strokecolor="#156082 [3204]" strokeweight="1.5pt">
+              <v:line w14:anchorId="6224550D" id="Straight Connector 1" o:spid="_x0000_s1026" style="position:absolute;flip:x;z-index:251663360;visibility:visible;mso-wrap-style:square;mso-width-percent:0;mso-height-percent:0;mso-wrap-distance-left:9pt;mso-wrap-distance-top:0;mso-wrap-distance-right:9pt;mso-wrap-distance-bottom:0;mso-position-horizontal:absolute;mso-position-horizontal-relative:text;mso-position-vertical:absolute;mso-position-vertical-relative:text;mso-width-percent:0;mso-height-percent:0;mso-width-relative:margin;mso-height-relative:margin" from="-2.95pt,4.55pt" to="1542.75pt,4.95pt" o:gfxdata="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" strokecolor="#156082 [3204]" strokeweight="1.5pt">
                 <v:stroke dashstyle="dash"/>
               </v:line>
             </w:pict>
@@ -2489,7 +2673,23 @@
           <w:sz w:val="28"/>
           <w:szCs w:val="28"/>
         </w:rPr>
-        <w:t xml:space="preserve"> ed eseguito .info()</w:t>
+        <w:t xml:space="preserve"> ed eseguito .</w:t>
+      </w:r>
+      <w:proofErr w:type="gramStart"/>
+      <w:r>
+        <w:rPr>
+          <w:sz w:val="28"/>
+          <w:szCs w:val="28"/>
+        </w:rPr>
+        <w:t>info(</w:t>
+      </w:r>
+      <w:proofErr w:type="gramEnd"/>
+      <w:r>
+        <w:rPr>
+          <w:sz w:val="28"/>
+          <w:szCs w:val="28"/>
+        </w:rPr>
+        <w:t>)</w:t>
       </w:r>
     </w:p>
     <w:p>
@@ -2529,7 +2729,15 @@
           <w:sz w:val="28"/>
           <w:szCs w:val="28"/>
         </w:rPr>
-        <w:t>Ho verificato con .</w:t>
+        <w:t xml:space="preserve">Ho verificato </w:t>
+      </w:r>
+      <w:proofErr w:type="gramStart"/>
+      <w:r>
+        <w:rPr>
+          <w:sz w:val="28"/>
+          <w:szCs w:val="28"/>
+        </w:rPr>
+        <w:t>con .</w:t>
       </w:r>
       <w:proofErr w:type="spellStart"/>
       <w:r>
@@ -2540,6 +2748,7 @@
         <w:t>isnull</w:t>
       </w:r>
       <w:proofErr w:type="spellEnd"/>
+      <w:proofErr w:type="gramEnd"/>
       <w:r>
         <w:rPr>
           <w:sz w:val="28"/>
@@ -2581,7 +2790,23 @@
           <w:sz w:val="28"/>
           <w:szCs w:val="28"/>
         </w:rPr>
-        <w:t>Penso l’abbia tolto perché il nome None lo interpreta come nullo</w:t>
+        <w:t xml:space="preserve">Penso l’abbia tolto perché il nome </w:t>
+      </w:r>
+      <w:proofErr w:type="gramStart"/>
+      <w:r>
+        <w:rPr>
+          <w:sz w:val="28"/>
+          <w:szCs w:val="28"/>
+        </w:rPr>
+        <w:t>None</w:t>
+      </w:r>
+      <w:proofErr w:type="gramEnd"/>
+      <w:r>
+        <w:rPr>
+          <w:sz w:val="28"/>
+          <w:szCs w:val="28"/>
+        </w:rPr>
+        <w:t xml:space="preserve"> lo interpreta come nullo</w:t>
       </w:r>
     </w:p>
     <w:p>
@@ -2601,7 +2826,15 @@
           <w:sz w:val="28"/>
           <w:szCs w:val="28"/>
         </w:rPr>
-        <w:t>Ho usato .</w:t>
+        <w:t xml:space="preserve">Ho </w:t>
+      </w:r>
+      <w:proofErr w:type="gramStart"/>
+      <w:r>
+        <w:rPr>
+          <w:sz w:val="28"/>
+          <w:szCs w:val="28"/>
+        </w:rPr>
+        <w:t>usato .</w:t>
       </w:r>
       <w:proofErr w:type="spellStart"/>
       <w:r>
@@ -2612,6 +2845,7 @@
         <w:t>fillna</w:t>
       </w:r>
       <w:proofErr w:type="spellEnd"/>
+      <w:proofErr w:type="gramEnd"/>
       <w:r>
         <w:rPr>
           <w:sz w:val="28"/>
@@ -2685,7 +2919,23 @@
           <w:sz w:val="28"/>
           <w:szCs w:val="28"/>
         </w:rPr>
-        <w:t>Alla fine della fase 4 ho aggiunto un’analisi fatta sul file dopo aver notato dei valori doppi negli anni</w:t>
+        <w:t xml:space="preserve">Alla fine della fase </w:t>
+      </w:r>
+      <w:proofErr w:type="gramStart"/>
+      <w:r>
+        <w:rPr>
+          <w:sz w:val="28"/>
+          <w:szCs w:val="28"/>
+        </w:rPr>
+        <w:t>4</w:t>
+      </w:r>
+      <w:proofErr w:type="gramEnd"/>
+      <w:r>
+        <w:rPr>
+          <w:sz w:val="28"/>
+          <w:szCs w:val="28"/>
+        </w:rPr>
+        <w:t xml:space="preserve"> ho aggiunto un’analisi fatta sul file dopo aver notato dei valori doppi negli anni</w:t>
       </w:r>
     </w:p>
     <w:p>
@@ -2704,16 +2954,16 @@
         <mc:AlternateContent>
           <mc:Choice Requires="wps">
             <w:drawing>
-              <wp:anchor distT="0" distB="0" distL="114300" distR="114300" simplePos="0" relativeHeight="251665408" behindDoc="0" locked="0" layoutInCell="1" allowOverlap="1" wp14:anchorId="46585B0E" wp14:editId="46A9F124">
+              <wp:anchor distT="0" distB="0" distL="114300" distR="114300" simplePos="0" relativeHeight="251665408" behindDoc="0" locked="0" layoutInCell="1" allowOverlap="1" wp14:anchorId="46585B0E" wp14:editId="60427E4D">
                 <wp:simplePos x="0" y="0"/>
                 <wp:positionH relativeFrom="column">
-                  <wp:posOffset>0</wp:posOffset>
+                  <wp:posOffset>-276</wp:posOffset>
                 </wp:positionH>
                 <wp:positionV relativeFrom="paragraph">
-                  <wp:posOffset>-635</wp:posOffset>
+                  <wp:posOffset>-8791</wp:posOffset>
                 </wp:positionV>
-                <wp:extent cx="10887736" cy="0"/>
-                <wp:effectExtent l="0" t="0" r="0" b="0"/>
+                <wp:extent cx="19635815" cy="10571"/>
+                <wp:effectExtent l="0" t="0" r="24130" b="27940"/>
                 <wp:wrapNone/>
                 <wp:docPr id="1665347393" name="Straight Connector 1"/>
                 <wp:cNvGraphicFramePr/>
@@ -2722,9 +2972,9 @@
                     <wps:wsp>
                       <wps:cNvCnPr/>
                       <wps:spPr>
-                        <a:xfrm flipH="1" flipV="1">
+                        <a:xfrm flipH="1">
                           <a:off x="0" y="0"/>
-                          <a:ext cx="10887736" cy="0"/>
+                          <a:ext cx="19635815" cy="10571"/>
                         </a:xfrm>
                         <a:prstGeom prst="line">
                           <a:avLst/>
@@ -2768,7 +3018,7 @@
           </mc:Choice>
           <mc:Fallback>
             <w:pict>
-              <v:line w14:anchorId="6236CEE0" id="Straight Connector 1" o:spid="_x0000_s1026" style="position:absolute;flip:x y;z-index:251665408;visibility:visible;mso-wrap-style:square;mso-width-percent:0;mso-height-percent:0;mso-wrap-distance-left:9pt;mso-wrap-distance-top:0;mso-wrap-distance-right:9pt;mso-wrap-distance-bottom:0;mso-position-horizontal:absolute;mso-position-horizontal-relative:text;mso-position-vertical:absolute;mso-position-vertical-relative:text;mso-width-percent:0;mso-height-percent:0;mso-width-relative:margin;mso-height-relative:margin" from="0,-.05pt" to="857.3pt,-.05pt" o:gfxdata="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" strokecolor="#156082 [3204]" strokeweight="1.5pt">
+              <v:line w14:anchorId="69E1696C" id="Straight Connector 1" o:spid="_x0000_s1026" style="position:absolute;flip:x;z-index:251665408;visibility:visible;mso-wrap-style:square;mso-width-percent:0;mso-height-percent:0;mso-wrap-distance-left:9pt;mso-wrap-distance-top:0;mso-wrap-distance-right:9pt;mso-wrap-distance-bottom:0;mso-position-horizontal:absolute;mso-position-horizontal-relative:text;mso-position-vertical:absolute;mso-position-vertical-relative:text;mso-width-percent:0;mso-height-percent:0;mso-width-relative:margin;mso-height-relative:margin" from="0,-.7pt" to="1546.15pt,.15pt" o:gfxdata="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" strokecolor="#156082 [3204]" strokeweight="1.5pt">
                 <v:stroke dashstyle="dash"/>
               </v:line>
             </w:pict>
@@ -2868,7 +3118,7 @@
             <w:sz w:val="28"/>
             <w:szCs w:val="28"/>
           </w:rPr>
-          <w:t>https://stackoverflow.com/questions/41417214/prevent-pandas-fro</w:t>
+          <w:t>https://stackoverflow.com/questions/41417214/prevent-pandas</w:t>
         </w:r>
         <w:r>
           <w:rPr>
@@ -2876,7 +3126,7 @@
             <w:sz w:val="28"/>
             <w:szCs w:val="28"/>
           </w:rPr>
-          <w:t>m</w:t>
+          <w:t>-</w:t>
         </w:r>
         <w:r>
           <w:rPr>
@@ -2884,7 +3134,7 @@
             <w:sz w:val="28"/>
             <w:szCs w:val="28"/>
           </w:rPr>
-          <w:t>-reading-na-as-nan</w:t>
+          <w:t>from-reading-na-as-nan</w:t>
         </w:r>
       </w:hyperlink>
     </w:p>
@@ -2904,7 +3154,23 @@
             <w:sz w:val="28"/>
             <w:szCs w:val="28"/>
           </w:rPr>
-          <w:t>https://www.w3resource.com/pandas/dataframe/dataframe-rename_axis.php</w:t>
+          <w:t>https://www.w3resource.com/pandas/dataframe/datafr</w:t>
+        </w:r>
+        <w:r>
+          <w:rPr>
+            <w:rStyle w:val="Hyperlink"/>
+            <w:sz w:val="28"/>
+            <w:szCs w:val="28"/>
+          </w:rPr>
+          <w:t>a</w:t>
+        </w:r>
+        <w:r>
+          <w:rPr>
+            <w:rStyle w:val="Hyperlink"/>
+            <w:sz w:val="28"/>
+            <w:szCs w:val="28"/>
+          </w:rPr>
+          <w:t>me-rename_axis.php</w:t>
         </w:r>
       </w:hyperlink>
     </w:p>
@@ -2924,7 +3190,23 @@
             <w:sz w:val="28"/>
             <w:szCs w:val="28"/>
           </w:rPr>
-          <w:t>https://python-course.eu/numerical-programming/pandas-pivot.php</w:t>
+          <w:t>https://python-course.eu/numerical-programm</w:t>
+        </w:r>
+        <w:r>
+          <w:rPr>
+            <w:rStyle w:val="Hyperlink"/>
+            <w:sz w:val="28"/>
+            <w:szCs w:val="28"/>
+          </w:rPr>
+          <w:t>i</w:t>
+        </w:r>
+        <w:r>
+          <w:rPr>
+            <w:rStyle w:val="Hyperlink"/>
+            <w:sz w:val="28"/>
+            <w:szCs w:val="28"/>
+          </w:rPr>
+          <w:t>ng/pandas-pivot.php</w:t>
         </w:r>
       </w:hyperlink>
     </w:p>
@@ -3000,7 +3282,23 @@
           <w:sz w:val="28"/>
           <w:szCs w:val="28"/>
         </w:rPr>
-        <w:t>Ho fatto la Left join dei 2 file usando come chiavi i codici comune e anni</w:t>
+        <w:t xml:space="preserve">Ho fatto la Left join dei </w:t>
+      </w:r>
+      <w:proofErr w:type="gramStart"/>
+      <w:r>
+        <w:rPr>
+          <w:sz w:val="28"/>
+          <w:szCs w:val="28"/>
+        </w:rPr>
+        <w:t>2</w:t>
+      </w:r>
+      <w:proofErr w:type="gramEnd"/>
+      <w:r>
+        <w:rPr>
+          <w:sz w:val="28"/>
+          <w:szCs w:val="28"/>
+        </w:rPr>
+        <w:t xml:space="preserve"> file usando come chiavi i codici comune e anni</w:t>
       </w:r>
     </w:p>
     <w:p>
@@ -3040,7 +3338,23 @@
           <w:sz w:val="28"/>
           <w:szCs w:val="28"/>
         </w:rPr>
-        <w:t>Ho verificato con .info() e ho subito notato esserci dei valori mancanti e formato dati da sistemare</w:t>
+        <w:t>Ho verificato con .</w:t>
+      </w:r>
+      <w:proofErr w:type="gramStart"/>
+      <w:r>
+        <w:rPr>
+          <w:sz w:val="28"/>
+          <w:szCs w:val="28"/>
+        </w:rPr>
+        <w:t>info(</w:t>
+      </w:r>
+      <w:proofErr w:type="gramEnd"/>
+      <w:r>
+        <w:rPr>
+          <w:sz w:val="28"/>
+          <w:szCs w:val="28"/>
+        </w:rPr>
+        <w:t>) e ho subito notato esserci dei valori mancanti e formato dati da sistemare</w:t>
       </w:r>
     </w:p>
     <w:p>
@@ -3060,7 +3374,21 @@
           <w:sz w:val="28"/>
           <w:szCs w:val="28"/>
         </w:rPr>
-        <w:t>Ho verificato i valori mancati e fatto una verifica sui valori dati perderei se decidessi di eliminare le righe con valori mancanti</w:t>
+        <w:t>Ho verificato i valori mancati e fatto una verifica sui dati</w:t>
+      </w:r>
+      <w:r>
+        <w:rPr>
+          <w:sz w:val="28"/>
+          <w:szCs w:val="28"/>
+        </w:rPr>
+        <w:t xml:space="preserve"> che</w:t>
+      </w:r>
+      <w:r>
+        <w:rPr>
+          <w:sz w:val="28"/>
+          <w:szCs w:val="28"/>
+        </w:rPr>
+        <w:t xml:space="preserve"> perderei se decidessi di eliminare le righe con valori mancanti</w:t>
       </w:r>
     </w:p>
     <w:p>
@@ -3080,7 +3408,23 @@
           <w:sz w:val="28"/>
           <w:szCs w:val="28"/>
         </w:rPr>
-        <w:t>Ho eliminato le righe con valori mancanti e verificato con .info()</w:t>
+        <w:t>Ho eliminato le righe con valori mancanti e verificato con .</w:t>
+      </w:r>
+      <w:proofErr w:type="gramStart"/>
+      <w:r>
+        <w:rPr>
+          <w:sz w:val="28"/>
+          <w:szCs w:val="28"/>
+        </w:rPr>
+        <w:t>info(</w:t>
+      </w:r>
+      <w:proofErr w:type="gramEnd"/>
+      <w:r>
+        <w:rPr>
+          <w:sz w:val="28"/>
+          <w:szCs w:val="28"/>
+        </w:rPr>
+        <w:t>)</w:t>
       </w:r>
     </w:p>
     <w:p>
@@ -3209,7 +3553,23 @@
           <w:sz w:val="28"/>
           <w:szCs w:val="28"/>
         </w:rPr>
-        <w:t>Creato file CSV finale : df_finale.CSV</w:t>
+        <w:t xml:space="preserve">Creato file CSV </w:t>
+      </w:r>
+      <w:proofErr w:type="gramStart"/>
+      <w:r>
+        <w:rPr>
+          <w:sz w:val="28"/>
+          <w:szCs w:val="28"/>
+        </w:rPr>
+        <w:t>finale :</w:t>
+      </w:r>
+      <w:proofErr w:type="gramEnd"/>
+      <w:r>
+        <w:rPr>
+          <w:sz w:val="28"/>
+          <w:szCs w:val="28"/>
+        </w:rPr>
+        <w:t xml:space="preserve"> df_finale.CSV</w:t>
       </w:r>
     </w:p>
     <w:p>
@@ -3245,7 +3605,23 @@
           <w:sz w:val="28"/>
           <w:szCs w:val="28"/>
         </w:rPr>
-        <w:t>Ho elencato i link dove ho reperito le fonti per la pivot e risolvere il problema di None visto che non si era risolto col sistema usato precedentemente.</w:t>
+        <w:t xml:space="preserve">Ho elencato i link dove ho reperito le fonti per la pivot e risolvere il problema di </w:t>
+      </w:r>
+      <w:proofErr w:type="gramStart"/>
+      <w:r>
+        <w:rPr>
+          <w:sz w:val="28"/>
+          <w:szCs w:val="28"/>
+        </w:rPr>
+        <w:t>None</w:t>
+      </w:r>
+      <w:proofErr w:type="gramEnd"/>
+      <w:r>
+        <w:rPr>
+          <w:sz w:val="28"/>
+          <w:szCs w:val="28"/>
+        </w:rPr>
+        <w:t xml:space="preserve"> visto che non si era risolto col sistema usato precedentemente.</w:t>
       </w:r>
     </w:p>
     <w:p>
@@ -3284,6 +3660,1240 @@
     </w:p>
     <w:p>
       <w:pPr>
+        <w:rPr>
+          <w:sz w:val="28"/>
+          <w:szCs w:val="28"/>
+        </w:rPr>
+      </w:pPr>
+      <w:r>
+        <w:rPr>
+          <w:noProof/>
+          <w:sz w:val="28"/>
+          <w:szCs w:val="28"/>
+        </w:rPr>
+        <mc:AlternateContent>
+          <mc:Choice Requires="wps">
+            <w:drawing>
+              <wp:anchor distT="0" distB="0" distL="114300" distR="114300" simplePos="0" relativeHeight="251667456" behindDoc="0" locked="0" layoutInCell="1" allowOverlap="1" wp14:anchorId="5A7B54EF" wp14:editId="48763D59">
+                <wp:simplePos x="0" y="0"/>
+                <wp:positionH relativeFrom="column">
+                  <wp:posOffset>0</wp:posOffset>
+                </wp:positionH>
+                <wp:positionV relativeFrom="paragraph">
+                  <wp:posOffset>0</wp:posOffset>
+                </wp:positionV>
+                <wp:extent cx="19635815" cy="10571"/>
+                <wp:effectExtent l="0" t="0" r="24130" b="27940"/>
+                <wp:wrapNone/>
+                <wp:docPr id="1671186170" name="Straight Connector 1"/>
+                <wp:cNvGraphicFramePr/>
+                <a:graphic xmlns:a="http://schemas.openxmlformats.org/drawingml/2006/main">
+                  <a:graphicData uri="http://schemas.microsoft.com/office/word/2010/wordprocessingShape">
+                    <wps:wsp>
+                      <wps:cNvCnPr/>
+                      <wps:spPr>
+                        <a:xfrm flipH="1">
+                          <a:off x="0" y="0"/>
+                          <a:ext cx="19635815" cy="10571"/>
+                        </a:xfrm>
+                        <a:prstGeom prst="line">
+                          <a:avLst/>
+                        </a:prstGeom>
+                        <a:ln w="19050" cap="flat" cmpd="sng" algn="ctr">
+                          <a:solidFill>
+                            <a:schemeClr val="accent1"/>
+                          </a:solidFill>
+                          <a:prstDash val="dash"/>
+                          <a:round/>
+                          <a:headEnd type="none" w="med" len="med"/>
+                          <a:tailEnd type="none" w="med" len="med"/>
+                        </a:ln>
+                      </wps:spPr>
+                      <wps:style>
+                        <a:lnRef idx="0">
+                          <a:scrgbClr r="0" g="0" b="0"/>
+                        </a:lnRef>
+                        <a:fillRef idx="0">
+                          <a:scrgbClr r="0" g="0" b="0"/>
+                        </a:fillRef>
+                        <a:effectRef idx="0">
+                          <a:scrgbClr r="0" g="0" b="0"/>
+                        </a:effectRef>
+                        <a:fontRef idx="minor">
+                          <a:schemeClr val="tx1"/>
+                        </a:fontRef>
+                      </wps:style>
+                      <wps:bodyPr/>
+                    </wps:wsp>
+                  </a:graphicData>
+                </a:graphic>
+                <wp14:sizeRelH relativeFrom="margin">
+                  <wp14:pctWidth>0</wp14:pctWidth>
+                </wp14:sizeRelH>
+                <wp14:sizeRelV relativeFrom="margin">
+                  <wp14:pctHeight>0</wp14:pctHeight>
+                </wp14:sizeRelV>
+              </wp:anchor>
+            </w:drawing>
+          </mc:Choice>
+          <mc:Fallback>
+            <w:pict>
+              <v:line w14:anchorId="0733E6A6" id="Straight Connector 1" o:spid="_x0000_s1026" style="position:absolute;flip:x;z-index:251667456;visibility:visible;mso-wrap-style:square;mso-width-percent:0;mso-height-percent:0;mso-wrap-distance-left:9pt;mso-wrap-distance-top:0;mso-wrap-distance-right:9pt;mso-wrap-distance-bottom:0;mso-position-horizontal:absolute;mso-position-horizontal-relative:text;mso-position-vertical:absolute;mso-position-vertical-relative:text;mso-width-percent:0;mso-height-percent:0;mso-width-relative:margin;mso-height-relative:margin" from="0,0" to="1546.15pt,.85pt" o:gfxdata="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" strokecolor="#156082 [3204]" strokeweight="1.5pt">
+                <v:stroke dashstyle="dash"/>
+              </v:line>
+            </w:pict>
+          </mc:Fallback>
+        </mc:AlternateContent>
+      </w:r>
+    </w:p>
+    <w:p>
+      <w:pPr>
+        <w:pStyle w:val="ListParagraph"/>
+        <w:numPr>
+          <w:ilvl w:val="0"/>
+          <w:numId w:val="1"/>
+        </w:numPr>
+        <w:rPr>
+          <w:sz w:val="28"/>
+          <w:szCs w:val="28"/>
+          <w:highlight w:val="yellow"/>
+        </w:rPr>
+      </w:pPr>
+      <w:r>
+        <w:rPr>
+          <w:sz w:val="44"/>
+          <w:szCs w:val="44"/>
+          <w:highlight w:val="yellow"/>
+        </w:rPr>
+        <w:t xml:space="preserve">Fase </w:t>
+      </w:r>
+      <w:r>
+        <w:rPr>
+          <w:sz w:val="44"/>
+          <w:szCs w:val="44"/>
+          <w:highlight w:val="yellow"/>
+        </w:rPr>
+        <w:t>6</w:t>
+      </w:r>
+      <w:r>
+        <w:rPr>
+          <w:sz w:val="44"/>
+          <w:szCs w:val="44"/>
+          <w:highlight w:val="yellow"/>
+        </w:rPr>
+        <w:t xml:space="preserve">: </w:t>
+      </w:r>
+      <w:r>
+        <w:rPr>
+          <w:b/>
+          <w:bCs/>
+          <w:sz w:val="44"/>
+          <w:szCs w:val="44"/>
+          <w:highlight w:val="yellow"/>
+        </w:rPr>
+        <w:t>Analisi statistica</w:t>
+      </w:r>
+    </w:p>
+    <w:p>
+      <w:pPr>
+        <w:jc w:val="center"/>
+        <w:rPr>
+          <w:b/>
+          <w:bCs/>
+          <w:sz w:val="28"/>
+          <w:szCs w:val="28"/>
+        </w:rPr>
+      </w:pPr>
+      <w:r>
+        <w:rPr>
+          <w:b/>
+          <w:bCs/>
+          <w:sz w:val="28"/>
+          <w:szCs w:val="28"/>
+        </w:rPr>
+        <w:t>Fonti:</w:t>
+      </w:r>
+    </w:p>
+    <w:p>
+      <w:pPr>
+        <w:jc w:val="center"/>
+        <w:rPr>
+          <w:b/>
+          <w:bCs/>
+          <w:sz w:val="28"/>
+          <w:szCs w:val="28"/>
+        </w:rPr>
+      </w:pPr>
+      <w:r>
+        <w:rPr>
+          <w:b/>
+          <w:bCs/>
+          <w:sz w:val="28"/>
+          <w:szCs w:val="28"/>
+        </w:rPr>
+        <w:t>lezioni di statistica del corso</w:t>
+      </w:r>
+    </w:p>
+    <w:p>
+      <w:pPr>
+        <w:pStyle w:val="ListParagraph"/>
+        <w:rPr>
+          <w:sz w:val="28"/>
+          <w:szCs w:val="28"/>
+        </w:rPr>
+      </w:pPr>
+    </w:p>
+    <w:p>
+      <w:pPr>
+        <w:pStyle w:val="ListParagraph"/>
+        <w:numPr>
+          <w:ilvl w:val="0"/>
+          <w:numId w:val="10"/>
+        </w:numPr>
+        <w:rPr>
+          <w:sz w:val="28"/>
+          <w:szCs w:val="28"/>
+        </w:rPr>
+      </w:pPr>
+      <w:r>
+        <w:rPr>
+          <w:sz w:val="28"/>
+          <w:szCs w:val="28"/>
+        </w:rPr>
+        <w:t xml:space="preserve">Ho </w:t>
+      </w:r>
+      <w:r>
+        <w:rPr>
+          <w:sz w:val="28"/>
+          <w:szCs w:val="28"/>
+        </w:rPr>
+        <w:t xml:space="preserve">il file ottenuto dalla join e iniziato e a vedere le metriche principali </w:t>
+      </w:r>
+      <w:proofErr w:type="gramStart"/>
+      <w:r>
+        <w:rPr>
+          <w:sz w:val="28"/>
+          <w:szCs w:val="28"/>
+        </w:rPr>
+        <w:t>con .</w:t>
+      </w:r>
+      <w:proofErr w:type="spellStart"/>
+      <w:r>
+        <w:rPr>
+          <w:sz w:val="28"/>
+          <w:szCs w:val="28"/>
+        </w:rPr>
+        <w:t>describe</w:t>
+      </w:r>
+      <w:proofErr w:type="spellEnd"/>
+      <w:proofErr w:type="gramEnd"/>
+      <w:r>
+        <w:rPr>
+          <w:sz w:val="28"/>
+          <w:szCs w:val="28"/>
+        </w:rPr>
+        <w:t>()</w:t>
+      </w:r>
+    </w:p>
+    <w:p>
+      <w:pPr>
+        <w:pStyle w:val="ListParagraph"/>
+        <w:numPr>
+          <w:ilvl w:val="0"/>
+          <w:numId w:val="10"/>
+        </w:numPr>
+        <w:rPr>
+          <w:sz w:val="28"/>
+          <w:szCs w:val="28"/>
+        </w:rPr>
+      </w:pPr>
+      <w:r>
+        <w:rPr>
+          <w:sz w:val="28"/>
+          <w:szCs w:val="28"/>
+        </w:rPr>
+        <w:t xml:space="preserve">La prima cosa che ho fatto è stata andare a vedere se i valori max fossero degli </w:t>
+      </w:r>
+      <w:proofErr w:type="spellStart"/>
+      <w:r>
+        <w:rPr>
+          <w:sz w:val="28"/>
+          <w:szCs w:val="28"/>
+        </w:rPr>
+        <w:t>outlier</w:t>
+      </w:r>
+      <w:proofErr w:type="spellEnd"/>
+      <w:r>
+        <w:rPr>
+          <w:sz w:val="28"/>
+          <w:szCs w:val="28"/>
+        </w:rPr>
+        <w:t xml:space="preserve"> statistici o qualche </w:t>
+      </w:r>
+      <w:r>
+        <w:rPr>
+          <w:sz w:val="28"/>
+          <w:szCs w:val="28"/>
+        </w:rPr>
+        <w:t>errore:</w:t>
+      </w:r>
+    </w:p>
+    <w:p>
+      <w:pPr>
+        <w:pStyle w:val="ListParagraph"/>
+        <w:numPr>
+          <w:ilvl w:val="0"/>
+          <w:numId w:val="1"/>
+        </w:numPr>
+        <w:rPr>
+          <w:sz w:val="28"/>
+          <w:szCs w:val="28"/>
+        </w:rPr>
+      </w:pPr>
+      <w:r>
+        <w:rPr>
+          <w:sz w:val="28"/>
+          <w:szCs w:val="28"/>
+        </w:rPr>
+        <w:t>Facevano tutti riferimento a Roma che è la città più grande con il numero più alto di residenti quindi non si tratta di errori</w:t>
+      </w:r>
+    </w:p>
+    <w:p>
+      <w:pPr>
+        <w:pStyle w:val="ListParagraph"/>
+        <w:numPr>
+          <w:ilvl w:val="0"/>
+          <w:numId w:val="10"/>
+        </w:numPr>
+        <w:rPr>
+          <w:sz w:val="28"/>
+          <w:szCs w:val="28"/>
+        </w:rPr>
+      </w:pPr>
+      <w:r>
+        <w:rPr>
+          <w:sz w:val="28"/>
+          <w:szCs w:val="28"/>
+        </w:rPr>
+        <w:t xml:space="preserve">Ho iniziato con </w:t>
+      </w:r>
+      <w:proofErr w:type="spellStart"/>
+      <w:r>
+        <w:rPr>
+          <w:sz w:val="28"/>
+          <w:szCs w:val="28"/>
+        </w:rPr>
+        <w:t>l’eda</w:t>
+      </w:r>
+      <w:proofErr w:type="spellEnd"/>
+      <w:r>
+        <w:rPr>
+          <w:sz w:val="28"/>
+          <w:szCs w:val="28"/>
+        </w:rPr>
+        <w:t xml:space="preserve"> e ho deciso</w:t>
+      </w:r>
+      <w:r>
+        <w:rPr>
+          <w:sz w:val="28"/>
+          <w:szCs w:val="28"/>
+        </w:rPr>
+        <w:t xml:space="preserve"> </w:t>
+      </w:r>
+      <w:r>
+        <w:rPr>
+          <w:sz w:val="28"/>
+          <w:szCs w:val="28"/>
+        </w:rPr>
+        <w:t>di analizzare i dati inerenti agli incidenti</w:t>
+      </w:r>
+      <w:r>
+        <w:rPr>
+          <w:sz w:val="28"/>
+          <w:szCs w:val="28"/>
+        </w:rPr>
+        <w:t xml:space="preserve">, </w:t>
+      </w:r>
+      <w:proofErr w:type="gramStart"/>
+      <w:r>
+        <w:rPr>
+          <w:sz w:val="28"/>
+          <w:szCs w:val="28"/>
+        </w:rPr>
+        <w:t xml:space="preserve">feriti </w:t>
+      </w:r>
+      <w:r>
+        <w:rPr>
+          <w:sz w:val="28"/>
+          <w:szCs w:val="28"/>
+        </w:rPr>
+        <w:t xml:space="preserve"> e</w:t>
+      </w:r>
+      <w:proofErr w:type="gramEnd"/>
+      <w:r>
+        <w:rPr>
+          <w:sz w:val="28"/>
+          <w:szCs w:val="28"/>
+        </w:rPr>
+        <w:t xml:space="preserve"> morti perché dal </w:t>
+      </w:r>
+      <w:proofErr w:type="spellStart"/>
+      <w:r>
+        <w:rPr>
+          <w:sz w:val="28"/>
+          <w:szCs w:val="28"/>
+        </w:rPr>
+        <w:t>describe</w:t>
+      </w:r>
+      <w:proofErr w:type="spellEnd"/>
+      <w:r>
+        <w:rPr>
+          <w:sz w:val="28"/>
+          <w:szCs w:val="28"/>
+        </w:rPr>
+        <w:t xml:space="preserve"> noto esserci dei valori da attenzionare</w:t>
+      </w:r>
+      <w:r>
+        <w:rPr>
+          <w:sz w:val="28"/>
+          <w:szCs w:val="28"/>
+        </w:rPr>
+        <w:t xml:space="preserve"> come ad esempio le medie maggiori delle mediane suggeriscono la presenza di </w:t>
+      </w:r>
+      <w:proofErr w:type="spellStart"/>
+      <w:r>
+        <w:rPr>
+          <w:sz w:val="28"/>
+          <w:szCs w:val="28"/>
+        </w:rPr>
+        <w:t>outlier</w:t>
+      </w:r>
+      <w:proofErr w:type="spellEnd"/>
+      <w:r>
+        <w:rPr>
+          <w:sz w:val="28"/>
+          <w:szCs w:val="28"/>
+        </w:rPr>
+        <w:t>. Nell’analisi ho deciso di utilizzare diversi strumenti di visual per poter interpretare meglio i dati, tra cui:</w:t>
+      </w:r>
+    </w:p>
+    <w:p>
+      <w:pPr>
+        <w:pStyle w:val="ListParagraph"/>
+        <w:numPr>
+          <w:ilvl w:val="0"/>
+          <w:numId w:val="1"/>
+        </w:numPr>
+        <w:rPr>
+          <w:sz w:val="28"/>
+          <w:szCs w:val="28"/>
+        </w:rPr>
+      </w:pPr>
+      <w:proofErr w:type="spellStart"/>
+      <w:proofErr w:type="gramStart"/>
+      <w:r>
+        <w:rPr>
+          <w:sz w:val="28"/>
+          <w:szCs w:val="28"/>
+        </w:rPr>
+        <w:t>Boxplot</w:t>
+      </w:r>
+      <w:proofErr w:type="spellEnd"/>
+      <w:r>
+        <w:rPr>
+          <w:sz w:val="28"/>
+          <w:szCs w:val="28"/>
+        </w:rPr>
+        <w:t xml:space="preserve"> :</w:t>
+      </w:r>
+      <w:proofErr w:type="gramEnd"/>
+      <w:r>
+        <w:rPr>
+          <w:sz w:val="28"/>
+          <w:szCs w:val="28"/>
+        </w:rPr>
+        <w:t xml:space="preserve"> per la distribuzione dei valori, è stato utile per farmi un’idea sui valori e quali sono i possibili </w:t>
+      </w:r>
+      <w:proofErr w:type="spellStart"/>
+      <w:r>
+        <w:rPr>
+          <w:sz w:val="28"/>
+          <w:szCs w:val="28"/>
+        </w:rPr>
+        <w:t>outlier</w:t>
+      </w:r>
+      <w:proofErr w:type="spellEnd"/>
+    </w:p>
+    <w:p>
+      <w:pPr>
+        <w:pStyle w:val="ListParagraph"/>
+        <w:numPr>
+          <w:ilvl w:val="0"/>
+          <w:numId w:val="1"/>
+        </w:numPr>
+        <w:rPr>
+          <w:sz w:val="28"/>
+          <w:szCs w:val="28"/>
+        </w:rPr>
+      </w:pPr>
+      <w:proofErr w:type="gramStart"/>
+      <w:r>
+        <w:rPr>
+          <w:sz w:val="28"/>
+          <w:szCs w:val="28"/>
+        </w:rPr>
+        <w:t>Istogrammi</w:t>
+      </w:r>
+      <w:r>
+        <w:rPr>
+          <w:sz w:val="28"/>
+          <w:szCs w:val="28"/>
+        </w:rPr>
+        <w:t xml:space="preserve"> :</w:t>
+      </w:r>
+      <w:proofErr w:type="gramEnd"/>
+      <w:r>
+        <w:rPr>
+          <w:sz w:val="28"/>
+          <w:szCs w:val="28"/>
+        </w:rPr>
+        <w:t xml:space="preserve"> per la frequenza</w:t>
+      </w:r>
+    </w:p>
+    <w:p>
+      <w:pPr>
+        <w:pStyle w:val="ListParagraph"/>
+        <w:numPr>
+          <w:ilvl w:val="0"/>
+          <w:numId w:val="1"/>
+        </w:numPr>
+        <w:rPr>
+          <w:sz w:val="28"/>
+          <w:szCs w:val="28"/>
+        </w:rPr>
+      </w:pPr>
+      <w:proofErr w:type="spellStart"/>
+      <w:proofErr w:type="gramStart"/>
+      <w:r>
+        <w:rPr>
+          <w:sz w:val="28"/>
+          <w:szCs w:val="28"/>
+        </w:rPr>
+        <w:t>Scatterplot</w:t>
+      </w:r>
+      <w:proofErr w:type="spellEnd"/>
+      <w:r>
+        <w:rPr>
+          <w:sz w:val="28"/>
+          <w:szCs w:val="28"/>
+        </w:rPr>
+        <w:t xml:space="preserve"> :</w:t>
+      </w:r>
+      <w:proofErr w:type="gramEnd"/>
+      <w:r>
+        <w:rPr>
+          <w:sz w:val="28"/>
+          <w:szCs w:val="28"/>
+        </w:rPr>
+        <w:t xml:space="preserve"> per la relazione, utile per verificare se ci sono </w:t>
+      </w:r>
+      <w:proofErr w:type="gramStart"/>
+      <w:r>
+        <w:rPr>
+          <w:sz w:val="28"/>
+          <w:szCs w:val="28"/>
+        </w:rPr>
+        <w:t>delle possibile</w:t>
+      </w:r>
+      <w:proofErr w:type="gramEnd"/>
+      <w:r>
+        <w:rPr>
+          <w:sz w:val="28"/>
+          <w:szCs w:val="28"/>
+        </w:rPr>
+        <w:t xml:space="preserve"> correlazioni</w:t>
+      </w:r>
+    </w:p>
+    <w:p>
+      <w:pPr>
+        <w:pStyle w:val="ListParagraph"/>
+        <w:rPr>
+          <w:sz w:val="28"/>
+          <w:szCs w:val="28"/>
+        </w:rPr>
+      </w:pPr>
+      <w:r>
+        <w:rPr>
+          <w:sz w:val="28"/>
+          <w:szCs w:val="28"/>
+        </w:rPr>
+        <w:t>Ho documentato ogni decisione</w:t>
+      </w:r>
+      <w:r>
+        <w:rPr>
+          <w:sz w:val="28"/>
+          <w:szCs w:val="28"/>
+        </w:rPr>
+        <w:t>/ragionamento</w:t>
+      </w:r>
+      <w:r>
+        <w:rPr>
+          <w:sz w:val="28"/>
+          <w:szCs w:val="28"/>
+        </w:rPr>
+        <w:t xml:space="preserve"> pres</w:t>
+      </w:r>
+      <w:r>
+        <w:rPr>
+          <w:sz w:val="28"/>
+          <w:szCs w:val="28"/>
+        </w:rPr>
+        <w:t>o</w:t>
+      </w:r>
+      <w:r>
+        <w:rPr>
+          <w:sz w:val="28"/>
+          <w:szCs w:val="28"/>
+        </w:rPr>
+        <w:t xml:space="preserve"> nel file </w:t>
+      </w:r>
+      <w:proofErr w:type="spellStart"/>
+      <w:r>
+        <w:rPr>
+          <w:sz w:val="28"/>
+          <w:szCs w:val="28"/>
+        </w:rPr>
+        <w:t>python</w:t>
+      </w:r>
+      <w:proofErr w:type="spellEnd"/>
+    </w:p>
+    <w:p>
+      <w:pPr>
+        <w:pStyle w:val="ListParagraph"/>
+        <w:numPr>
+          <w:ilvl w:val="0"/>
+          <w:numId w:val="10"/>
+        </w:numPr>
+        <w:rPr>
+          <w:sz w:val="28"/>
+          <w:szCs w:val="28"/>
+        </w:rPr>
+      </w:pPr>
+      <w:r>
+        <w:rPr>
+          <w:sz w:val="28"/>
+          <w:szCs w:val="28"/>
+        </w:rPr>
+        <w:t xml:space="preserve">Ho verificato quali fossero i top </w:t>
+      </w:r>
+      <w:proofErr w:type="gramStart"/>
+      <w:r>
+        <w:rPr>
+          <w:sz w:val="28"/>
+          <w:szCs w:val="28"/>
+        </w:rPr>
+        <w:t>10</w:t>
+      </w:r>
+      <w:proofErr w:type="gramEnd"/>
+      <w:r>
+        <w:rPr>
+          <w:sz w:val="28"/>
+          <w:szCs w:val="28"/>
+        </w:rPr>
+        <w:t xml:space="preserve"> comuni per incidenti per capire meglio quali fossero i comuni col tasso maggiore di incidenti, ma andando avanti nelle analisi poi scopro non essere per forza quelli da dover per forza attenzionare</w:t>
+      </w:r>
+    </w:p>
+    <w:p>
+      <w:pPr>
+        <w:pStyle w:val="ListParagraph"/>
+        <w:numPr>
+          <w:ilvl w:val="0"/>
+          <w:numId w:val="10"/>
+        </w:numPr>
+        <w:rPr>
+          <w:sz w:val="28"/>
+          <w:szCs w:val="28"/>
+        </w:rPr>
+      </w:pPr>
+      <w:r>
+        <w:rPr>
+          <w:sz w:val="28"/>
+          <w:szCs w:val="28"/>
+        </w:rPr>
+        <w:t xml:space="preserve">Ho verificato </w:t>
+      </w:r>
+      <w:proofErr w:type="gramStart"/>
+      <w:r>
+        <w:rPr>
+          <w:sz w:val="28"/>
+          <w:szCs w:val="28"/>
+        </w:rPr>
+        <w:t>il trend</w:t>
+      </w:r>
+      <w:proofErr w:type="gramEnd"/>
+      <w:r>
+        <w:rPr>
+          <w:sz w:val="28"/>
+          <w:szCs w:val="28"/>
+        </w:rPr>
+        <w:t xml:space="preserve"> degli incidenti, morti e feriti dal 2001 al 2024 per vedere se c’è stato un miglioramento o peggioramento negli anni</w:t>
+      </w:r>
+    </w:p>
+    <w:p>
+      <w:pPr>
+        <w:pStyle w:val="ListParagraph"/>
+        <w:numPr>
+          <w:ilvl w:val="0"/>
+          <w:numId w:val="10"/>
+        </w:numPr>
+        <w:rPr>
+          <w:sz w:val="28"/>
+          <w:szCs w:val="28"/>
+        </w:rPr>
+      </w:pPr>
+      <w:r>
+        <w:rPr>
+          <w:sz w:val="28"/>
+          <w:szCs w:val="28"/>
+        </w:rPr>
+        <w:t xml:space="preserve">Ho creato le colonne calcolate </w:t>
+      </w:r>
+      <w:proofErr w:type="gramStart"/>
+      <w:r>
+        <w:rPr>
+          <w:sz w:val="28"/>
+          <w:szCs w:val="28"/>
+        </w:rPr>
+        <w:t xml:space="preserve">per </w:t>
+      </w:r>
+      <w:r>
+        <w:rPr>
+          <w:sz w:val="28"/>
+          <w:szCs w:val="28"/>
+        </w:rPr>
+        <w:t>:</w:t>
+      </w:r>
+      <w:proofErr w:type="gramEnd"/>
+    </w:p>
+    <w:p>
+      <w:pPr>
+        <w:pStyle w:val="ListParagraph"/>
+        <w:numPr>
+          <w:ilvl w:val="0"/>
+          <w:numId w:val="1"/>
+        </w:numPr>
+        <w:rPr>
+          <w:sz w:val="28"/>
+          <w:szCs w:val="28"/>
+        </w:rPr>
+      </w:pPr>
+      <w:r>
+        <w:rPr>
+          <w:sz w:val="28"/>
+          <w:szCs w:val="28"/>
+        </w:rPr>
+        <w:t>Incidenti per capita</w:t>
+      </w:r>
+    </w:p>
+    <w:p>
+      <w:pPr>
+        <w:pStyle w:val="ListParagraph"/>
+        <w:numPr>
+          <w:ilvl w:val="0"/>
+          <w:numId w:val="1"/>
+        </w:numPr>
+        <w:rPr>
+          <w:sz w:val="28"/>
+          <w:szCs w:val="28"/>
+        </w:rPr>
+      </w:pPr>
+      <w:r>
+        <w:rPr>
+          <w:sz w:val="28"/>
+          <w:szCs w:val="28"/>
+        </w:rPr>
+        <w:t>Incidenti per km2</w:t>
+      </w:r>
+    </w:p>
+    <w:p>
+      <w:pPr>
+        <w:pStyle w:val="ListParagraph"/>
+        <w:numPr>
+          <w:ilvl w:val="0"/>
+          <w:numId w:val="1"/>
+        </w:numPr>
+        <w:rPr>
+          <w:sz w:val="28"/>
+          <w:szCs w:val="28"/>
+        </w:rPr>
+      </w:pPr>
+      <w:r>
+        <w:rPr>
+          <w:sz w:val="28"/>
+          <w:szCs w:val="28"/>
+        </w:rPr>
+        <w:t xml:space="preserve">Analizzato le 2 colonne con uno </w:t>
+      </w:r>
+      <w:proofErr w:type="spellStart"/>
+      <w:r>
+        <w:rPr>
+          <w:sz w:val="28"/>
+          <w:szCs w:val="28"/>
+        </w:rPr>
+        <w:t>scatterplot</w:t>
+      </w:r>
+      <w:proofErr w:type="spellEnd"/>
+      <w:r>
+        <w:rPr>
+          <w:sz w:val="28"/>
+          <w:szCs w:val="28"/>
+        </w:rPr>
+        <w:t xml:space="preserve"> per cercare di indiv</w:t>
+      </w:r>
+      <w:r>
+        <w:rPr>
+          <w:sz w:val="28"/>
+          <w:szCs w:val="28"/>
+        </w:rPr>
+        <w:t>i</w:t>
+      </w:r>
+      <w:r>
+        <w:rPr>
+          <w:sz w:val="28"/>
+          <w:szCs w:val="28"/>
+        </w:rPr>
+        <w:t>duare dei pattern/correlazioni dai valori trovati</w:t>
+      </w:r>
+    </w:p>
+    <w:p>
+      <w:pPr>
+        <w:pStyle w:val="ListParagraph"/>
+        <w:numPr>
+          <w:ilvl w:val="0"/>
+          <w:numId w:val="1"/>
+        </w:numPr>
+        <w:rPr>
+          <w:sz w:val="28"/>
+          <w:szCs w:val="28"/>
+        </w:rPr>
+      </w:pPr>
+      <w:r>
+        <w:rPr>
+          <w:sz w:val="28"/>
+          <w:szCs w:val="28"/>
+        </w:rPr>
+        <w:t xml:space="preserve">Ho creato anche un grafico a barre con i top 10 comuni per densità di incidenti per kmq che ha mostrato una classifica diversa rispetto alla top 10 per </w:t>
+      </w:r>
+      <w:proofErr w:type="gramStart"/>
+      <w:r>
+        <w:rPr>
+          <w:sz w:val="28"/>
+          <w:szCs w:val="28"/>
+        </w:rPr>
+        <w:t>incidenti, infatti</w:t>
+      </w:r>
+      <w:proofErr w:type="gramEnd"/>
+      <w:r>
+        <w:rPr>
+          <w:sz w:val="28"/>
+          <w:szCs w:val="28"/>
+        </w:rPr>
+        <w:t xml:space="preserve"> qui emergono anche comuni più piccoli</w:t>
+      </w:r>
+    </w:p>
+    <w:p>
+      <w:pPr>
+        <w:pStyle w:val="ListParagraph"/>
+        <w:numPr>
+          <w:ilvl w:val="0"/>
+          <w:numId w:val="10"/>
+        </w:numPr>
+        <w:rPr>
+          <w:sz w:val="28"/>
+          <w:szCs w:val="28"/>
+        </w:rPr>
+      </w:pPr>
+      <w:r>
+        <w:rPr>
+          <w:sz w:val="28"/>
+          <w:szCs w:val="28"/>
+        </w:rPr>
+        <w:t>Ho fatto il clustering usando</w:t>
+      </w:r>
+      <w:r>
+        <w:rPr>
+          <w:sz w:val="28"/>
+          <w:szCs w:val="28"/>
+        </w:rPr>
+        <w:t xml:space="preserve"> la media (ho usato la media perché alcuni comuni potrebbero o avere meno dati/storico o perché potrebbero avere valori troppo alti/bassi)</w:t>
+      </w:r>
+      <w:r>
+        <w:rPr>
+          <w:sz w:val="28"/>
+          <w:szCs w:val="28"/>
+        </w:rPr>
+        <w:t xml:space="preserve"> </w:t>
+      </w:r>
+      <w:r>
+        <w:rPr>
+          <w:sz w:val="28"/>
+          <w:szCs w:val="28"/>
+        </w:rPr>
+        <w:t>del</w:t>
+      </w:r>
+      <w:r>
+        <w:rPr>
+          <w:sz w:val="28"/>
+          <w:szCs w:val="28"/>
+        </w:rPr>
+        <w:t>le colonne incidenti pro capite e incidenti per km2</w:t>
+      </w:r>
+      <w:r>
+        <w:rPr>
+          <w:sz w:val="28"/>
+          <w:szCs w:val="28"/>
+        </w:rPr>
+        <w:t xml:space="preserve"> perché il clustering deve (a mio avviso) misurare la concentrazione/pericolosità. Se usassi le colonne con valori assoluti, per esempio, Roma dominerebbe sempre da sola per dimensione e non per rischio reale (che è dato dagli incidenti pro capita e incidenti per kmq).</w:t>
+      </w:r>
+    </w:p>
+    <w:p>
+      <w:pPr>
+        <w:pStyle w:val="ListParagraph"/>
+        <w:ind w:left="1080"/>
+        <w:rPr>
+          <w:sz w:val="28"/>
+          <w:szCs w:val="28"/>
+        </w:rPr>
+      </w:pPr>
+      <w:r>
+        <w:rPr>
+          <w:sz w:val="28"/>
+          <w:szCs w:val="28"/>
+        </w:rPr>
+        <w:t xml:space="preserve">Successivamente ho normalizzato i valori facendo (valore – il minimo / </w:t>
+      </w:r>
+      <w:r>
+        <w:rPr>
+          <w:sz w:val="28"/>
+          <w:szCs w:val="28"/>
+        </w:rPr>
+        <w:t xml:space="preserve">massimo – il minimo) grazie a </w:t>
+      </w:r>
+      <w:proofErr w:type="spellStart"/>
+      <w:r>
+        <w:rPr>
+          <w:sz w:val="28"/>
+          <w:szCs w:val="28"/>
+        </w:rPr>
+        <w:t>MinMaxScaler</w:t>
+      </w:r>
+      <w:proofErr w:type="spellEnd"/>
+      <w:r>
+        <w:rPr>
+          <w:sz w:val="28"/>
+          <w:szCs w:val="28"/>
+        </w:rPr>
+        <w:t xml:space="preserve"> coì li ho portati tra 0 e 1. Senza questa fase i valori più grandi potrebbero penalizzare quelli più piccoli quando i centroidi vanno a calcolare/trovare i gruppi.</w:t>
+      </w:r>
+    </w:p>
+    <w:p>
+      <w:pPr>
+        <w:pStyle w:val="ListParagraph"/>
+        <w:ind w:left="1080"/>
+        <w:rPr>
+          <w:sz w:val="28"/>
+          <w:szCs w:val="28"/>
+        </w:rPr>
+      </w:pPr>
+      <w:r>
+        <w:rPr>
+          <w:sz w:val="28"/>
+          <w:szCs w:val="28"/>
+        </w:rPr>
+        <w:t xml:space="preserve">Successivamente, con un ciclo for ho testato K-Means con diversi valori di k (da 1 a 9), salvando il valore WCSS per ognuno e riportandolo graficamente. Il WCSS misura quanto sono compatti i cluster </w:t>
+      </w:r>
+      <w:r>
+        <w:rPr>
+          <w:sz w:val="28"/>
+          <w:szCs w:val="28"/>
+        </w:rPr>
+        <w:t>quindi</w:t>
+      </w:r>
+      <w:r>
+        <w:rPr>
+          <w:sz w:val="28"/>
+          <w:szCs w:val="28"/>
+        </w:rPr>
+        <w:t xml:space="preserve"> più è basso, meglio è. </w:t>
+      </w:r>
+    </w:p>
+    <w:p>
+      <w:pPr>
+        <w:pStyle w:val="ListParagraph"/>
+        <w:ind w:left="1080"/>
+        <w:rPr>
+          <w:sz w:val="28"/>
+          <w:szCs w:val="28"/>
+        </w:rPr>
+      </w:pPr>
+      <w:r>
+        <w:rPr>
+          <w:sz w:val="28"/>
+          <w:szCs w:val="28"/>
+        </w:rPr>
+        <w:t>Ho scelto k=3 perché è il punto dove la curva inizia a stabilizzarsi e perché 3 categorie (Basso/Medio/Alto rischio) sono sensate per rispondere alla domanda di business</w:t>
+      </w:r>
+      <w:r>
+        <w:rPr>
+          <w:sz w:val="28"/>
+          <w:szCs w:val="28"/>
+        </w:rPr>
+        <w:t>.</w:t>
+      </w:r>
+    </w:p>
+    <w:p>
+      <w:pPr>
+        <w:pStyle w:val="ListParagraph"/>
+        <w:ind w:left="1080"/>
+        <w:rPr>
+          <w:sz w:val="28"/>
+          <w:szCs w:val="28"/>
+        </w:rPr>
+      </w:pPr>
+      <w:proofErr w:type="gramStart"/>
+      <w:r>
+        <w:rPr>
+          <w:sz w:val="28"/>
+          <w:szCs w:val="28"/>
+        </w:rPr>
+        <w:t>alla fine</w:t>
+      </w:r>
+      <w:proofErr w:type="gramEnd"/>
+      <w:r>
+        <w:rPr>
+          <w:sz w:val="28"/>
+          <w:szCs w:val="28"/>
+        </w:rPr>
+        <w:t xml:space="preserve"> ho salvato quanto ottenuto e verificato che fosse corretto rappresentandolo graficamente + controllo con </w:t>
+      </w:r>
+      <w:r>
+        <w:rPr>
+          <w:sz w:val="28"/>
+          <w:szCs w:val="28"/>
+        </w:rPr>
+        <w:t>una tabella</w:t>
+      </w:r>
+      <w:r>
+        <w:rPr>
+          <w:sz w:val="28"/>
+          <w:szCs w:val="28"/>
+        </w:rPr>
+        <w:t xml:space="preserve"> fatta col group by e ordinamento decrescente</w:t>
+      </w:r>
+    </w:p>
+    <w:p>
+      <w:pPr>
+        <w:pStyle w:val="ListParagraph"/>
+        <w:numPr>
+          <w:ilvl w:val="0"/>
+          <w:numId w:val="10"/>
+        </w:numPr>
+        <w:rPr>
+          <w:sz w:val="28"/>
+          <w:szCs w:val="28"/>
+        </w:rPr>
+      </w:pPr>
+      <w:r>
+        <w:rPr>
+          <w:sz w:val="28"/>
+          <w:szCs w:val="28"/>
+        </w:rPr>
+        <w:t xml:space="preserve">Ho poi sistemato i cluster rinominandoli con nomenclature più comode e intuitive e con una join ho aggiunto al </w:t>
+      </w:r>
+      <w:proofErr w:type="spellStart"/>
+      <w:r>
+        <w:rPr>
+          <w:sz w:val="28"/>
+          <w:szCs w:val="28"/>
+        </w:rPr>
+        <w:t>df</w:t>
+      </w:r>
+      <w:proofErr w:type="spellEnd"/>
+      <w:r>
+        <w:rPr>
+          <w:sz w:val="28"/>
+          <w:szCs w:val="28"/>
+        </w:rPr>
+        <w:t xml:space="preserve"> la colonna cluster.</w:t>
+      </w:r>
+    </w:p>
+    <w:p>
+      <w:pPr>
+        <w:pStyle w:val="ListParagraph"/>
+        <w:numPr>
+          <w:ilvl w:val="0"/>
+          <w:numId w:val="10"/>
+        </w:numPr>
+        <w:rPr>
+          <w:sz w:val="28"/>
+          <w:szCs w:val="28"/>
+        </w:rPr>
+      </w:pPr>
+      <w:r>
+        <w:rPr>
+          <w:sz w:val="28"/>
+          <w:szCs w:val="28"/>
+        </w:rPr>
+        <w:t>Per concludere ho creato un nuovo file csv da usare su power bi.</w:t>
+      </w:r>
+    </w:p>
+    <w:p>
+      <w:pPr>
+        <w:pStyle w:val="ListParagraph"/>
+        <w:ind w:left="1080"/>
+        <w:rPr>
+          <w:sz w:val="28"/>
+          <w:szCs w:val="28"/>
+        </w:rPr>
+      </w:pPr>
+    </w:p>
+    <w:p>
+      <w:pPr>
+        <w:pStyle w:val="ListParagraph"/>
+        <w:rPr>
+          <w:sz w:val="28"/>
+          <w:szCs w:val="28"/>
+        </w:rPr>
+      </w:pPr>
+      <w:r>
+        <w:rPr>
+          <w:noProof/>
+          <w:sz w:val="28"/>
+          <w:szCs w:val="28"/>
+        </w:rPr>
+        <mc:AlternateContent>
+          <mc:Choice Requires="wps">
+            <w:drawing>
+              <wp:anchor distT="0" distB="0" distL="114300" distR="114300" simplePos="0" relativeHeight="251669504" behindDoc="0" locked="0" layoutInCell="1" allowOverlap="1" wp14:anchorId="4A52DA7F" wp14:editId="67951207">
+                <wp:simplePos x="0" y="0"/>
+                <wp:positionH relativeFrom="column">
+                  <wp:posOffset>0</wp:posOffset>
+                </wp:positionH>
+                <wp:positionV relativeFrom="paragraph">
+                  <wp:posOffset>0</wp:posOffset>
+                </wp:positionV>
+                <wp:extent cx="19635815" cy="10571"/>
+                <wp:effectExtent l="0" t="0" r="24130" b="27940"/>
+                <wp:wrapNone/>
+                <wp:docPr id="427771512" name="Straight Connector 1"/>
+                <wp:cNvGraphicFramePr/>
+                <a:graphic xmlns:a="http://schemas.openxmlformats.org/drawingml/2006/main">
+                  <a:graphicData uri="http://schemas.microsoft.com/office/word/2010/wordprocessingShape">
+                    <wps:wsp>
+                      <wps:cNvCnPr/>
+                      <wps:spPr>
+                        <a:xfrm flipH="1">
+                          <a:off x="0" y="0"/>
+                          <a:ext cx="19635815" cy="10571"/>
+                        </a:xfrm>
+                        <a:prstGeom prst="line">
+                          <a:avLst/>
+                        </a:prstGeom>
+                        <a:ln w="19050" cap="flat" cmpd="sng" algn="ctr">
+                          <a:solidFill>
+                            <a:schemeClr val="accent1"/>
+                          </a:solidFill>
+                          <a:prstDash val="dash"/>
+                          <a:round/>
+                          <a:headEnd type="none" w="med" len="med"/>
+                          <a:tailEnd type="none" w="med" len="med"/>
+                        </a:ln>
+                      </wps:spPr>
+                      <wps:style>
+                        <a:lnRef idx="0">
+                          <a:scrgbClr r="0" g="0" b="0"/>
+                        </a:lnRef>
+                        <a:fillRef idx="0">
+                          <a:scrgbClr r="0" g="0" b="0"/>
+                        </a:fillRef>
+                        <a:effectRef idx="0">
+                          <a:scrgbClr r="0" g="0" b="0"/>
+                        </a:effectRef>
+                        <a:fontRef idx="minor">
+                          <a:schemeClr val="tx1"/>
+                        </a:fontRef>
+                      </wps:style>
+                      <wps:bodyPr/>
+                    </wps:wsp>
+                  </a:graphicData>
+                </a:graphic>
+                <wp14:sizeRelH relativeFrom="margin">
+                  <wp14:pctWidth>0</wp14:pctWidth>
+                </wp14:sizeRelH>
+                <wp14:sizeRelV relativeFrom="margin">
+                  <wp14:pctHeight>0</wp14:pctHeight>
+                </wp14:sizeRelV>
+              </wp:anchor>
+            </w:drawing>
+          </mc:Choice>
+          <mc:Fallback>
+            <w:pict>
+              <v:line w14:anchorId="3D26E01C" id="Straight Connector 1" o:spid="_x0000_s1026" style="position:absolute;flip:x;z-index:251669504;visibility:visible;mso-wrap-style:square;mso-width-percent:0;mso-height-percent:0;mso-wrap-distance-left:9pt;mso-wrap-distance-top:0;mso-wrap-distance-right:9pt;mso-wrap-distance-bottom:0;mso-position-horizontal:absolute;mso-position-horizontal-relative:text;mso-position-vertical:absolute;mso-position-vertical-relative:text;mso-width-percent:0;mso-height-percent:0;mso-width-relative:margin;mso-height-relative:margin" from="0,0" to="1546.15pt,.85pt" o:gfxdata="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" strokecolor="#156082 [3204]" strokeweight="1.5pt">
+                <v:stroke dashstyle="dash"/>
+              </v:line>
+            </w:pict>
+          </mc:Fallback>
+        </mc:AlternateContent>
+      </w:r>
+    </w:p>
+    <w:p>
+      <w:pPr>
+        <w:pStyle w:val="ListParagraph"/>
+        <w:rPr>
+          <w:sz w:val="28"/>
+          <w:szCs w:val="28"/>
+        </w:rPr>
+      </w:pPr>
+    </w:p>
+    <w:p>
+      <w:pPr>
+        <w:pStyle w:val="ListParagraph"/>
+        <w:rPr>
+          <w:sz w:val="28"/>
+          <w:szCs w:val="28"/>
+        </w:rPr>
+      </w:pPr>
+    </w:p>
+    <w:p>
+      <w:pPr>
+        <w:pStyle w:val="ListParagraph"/>
+        <w:rPr>
+          <w:sz w:val="28"/>
+          <w:szCs w:val="28"/>
+        </w:rPr>
+      </w:pPr>
+    </w:p>
+    <w:p>
+      <w:pPr>
+        <w:pStyle w:val="ListParagraph"/>
+        <w:rPr>
+          <w:sz w:val="28"/>
+          <w:szCs w:val="28"/>
+        </w:rPr>
+      </w:pPr>
+    </w:p>
+    <w:p>
+      <w:pPr>
+        <w:pStyle w:val="ListParagraph"/>
+        <w:rPr>
+          <w:sz w:val="28"/>
+          <w:szCs w:val="28"/>
+        </w:rPr>
+      </w:pPr>
+    </w:p>
+    <w:p>
+      <w:pPr>
+        <w:pStyle w:val="ListParagraph"/>
         <w:rPr>
           <w:sz w:val="28"/>
           <w:szCs w:val="28"/>
@@ -3305,15 +4915,18 @@
   <w:abstractNum w:abstractNumId="0" w15:restartNumberingAfterBreak="0">
     <w:nsid w:val="05FF42A6"/>
     <w:multiLevelType w:val="hybridMultilevel"/>
-    <w:tmpl w:val="5F1C4D24"/>
-    <w:lvl w:ilvl="0" w:tplc="0410000F">
+    <w:tmpl w:val="B25A9754"/>
+    <w:lvl w:ilvl="0" w:tplc="150AA304">
       <w:start w:val="1"/>
       <w:numFmt w:val="decimal"/>
-      <w:lvlText w:val="%1."/>
+      <w:lvlText w:val="%1)"/>
       <w:lvlJc w:val="left"/>
       <w:pPr>
         <w:ind w:left="1080" w:hanging="360"/>
       </w:pPr>
+      <w:rPr>
+        <w:rFonts w:asciiTheme="minorHAnsi" w:eastAsiaTheme="minorHAnsi" w:hAnsiTheme="minorHAnsi" w:cstheme="minorBidi"/>
+      </w:rPr>
     </w:lvl>
     <w:lvl w:ilvl="1" w:tplc="04100019" w:tentative="1">
       <w:start w:val="1"/>
@@ -3947,6 +5560,95 @@
     </w:lvl>
   </w:abstractNum>
   <w:abstractNum w:abstractNumId="7" w15:restartNumberingAfterBreak="0">
+    <w:nsid w:val="61C63A6D"/>
+    <w:multiLevelType w:val="hybridMultilevel"/>
+    <w:tmpl w:val="B348672A"/>
+    <w:lvl w:ilvl="0" w:tplc="20E6863A">
+      <w:start w:val="1"/>
+      <w:numFmt w:val="decimal"/>
+      <w:lvlText w:val="%1)"/>
+      <w:lvlJc w:val="left"/>
+      <w:pPr>
+        <w:ind w:left="1080" w:hanging="360"/>
+      </w:pPr>
+      <w:rPr>
+        <w:rFonts w:asciiTheme="minorHAnsi" w:eastAsiaTheme="minorHAnsi" w:hAnsiTheme="minorHAnsi" w:cstheme="minorBidi"/>
+      </w:rPr>
+    </w:lvl>
+    <w:lvl w:ilvl="1" w:tplc="FFFFFFFF" w:tentative="1">
+      <w:start w:val="1"/>
+      <w:numFmt w:val="lowerLetter"/>
+      <w:lvlText w:val="%2."/>
+      <w:lvlJc w:val="left"/>
+      <w:pPr>
+        <w:ind w:left="1800" w:hanging="360"/>
+      </w:pPr>
+    </w:lvl>
+    <w:lvl w:ilvl="2" w:tplc="FFFFFFFF" w:tentative="1">
+      <w:start w:val="1"/>
+      <w:numFmt w:val="lowerRoman"/>
+      <w:lvlText w:val="%3."/>
+      <w:lvlJc w:val="right"/>
+      <w:pPr>
+        <w:ind w:left="2520" w:hanging="180"/>
+      </w:pPr>
+    </w:lvl>
+    <w:lvl w:ilvl="3" w:tplc="FFFFFFFF" w:tentative="1">
+      <w:start w:val="1"/>
+      <w:numFmt w:val="decimal"/>
+      <w:lvlText w:val="%4."/>
+      <w:lvlJc w:val="left"/>
+      <w:pPr>
+        <w:ind w:left="3240" w:hanging="360"/>
+      </w:pPr>
+    </w:lvl>
+    <w:lvl w:ilvl="4" w:tplc="FFFFFFFF" w:tentative="1">
+      <w:start w:val="1"/>
+      <w:numFmt w:val="lowerLetter"/>
+      <w:lvlText w:val="%5."/>
+      <w:lvlJc w:val="left"/>
+      <w:pPr>
+        <w:ind w:left="3960" w:hanging="360"/>
+      </w:pPr>
+    </w:lvl>
+    <w:lvl w:ilvl="5" w:tplc="FFFFFFFF" w:tentative="1">
+      <w:start w:val="1"/>
+      <w:numFmt w:val="lowerRoman"/>
+      <w:lvlText w:val="%6."/>
+      <w:lvlJc w:val="right"/>
+      <w:pPr>
+        <w:ind w:left="4680" w:hanging="180"/>
+      </w:pPr>
+    </w:lvl>
+    <w:lvl w:ilvl="6" w:tplc="FFFFFFFF" w:tentative="1">
+      <w:start w:val="1"/>
+      <w:numFmt w:val="decimal"/>
+      <w:lvlText w:val="%7."/>
+      <w:lvlJc w:val="left"/>
+      <w:pPr>
+        <w:ind w:left="5400" w:hanging="360"/>
+      </w:pPr>
+    </w:lvl>
+    <w:lvl w:ilvl="7" w:tplc="FFFFFFFF" w:tentative="1">
+      <w:start w:val="1"/>
+      <w:numFmt w:val="lowerLetter"/>
+      <w:lvlText w:val="%8."/>
+      <w:lvlJc w:val="left"/>
+      <w:pPr>
+        <w:ind w:left="6120" w:hanging="360"/>
+      </w:pPr>
+    </w:lvl>
+    <w:lvl w:ilvl="8" w:tplc="FFFFFFFF" w:tentative="1">
+      <w:start w:val="1"/>
+      <w:numFmt w:val="lowerRoman"/>
+      <w:lvlText w:val="%9."/>
+      <w:lvlJc w:val="right"/>
+      <w:pPr>
+        <w:ind w:left="6840" w:hanging="180"/>
+      </w:pPr>
+    </w:lvl>
+  </w:abstractNum>
+  <w:abstractNum w:abstractNumId="8" w15:restartNumberingAfterBreak="0">
     <w:nsid w:val="6DBC25C0"/>
     <w:multiLevelType w:val="hybridMultilevel"/>
     <w:tmpl w:val="55143D28"/>
@@ -4035,7 +5737,7 @@
       </w:pPr>
     </w:lvl>
   </w:abstractNum>
-  <w:abstractNum w:abstractNumId="8" w15:restartNumberingAfterBreak="0">
+  <w:abstractNum w:abstractNumId="9" w15:restartNumberingAfterBreak="0">
     <w:nsid w:val="77CB0222"/>
     <w:multiLevelType w:val="hybridMultilevel"/>
     <w:tmpl w:val="5AE2F93C"/>
@@ -4128,10 +5830,10 @@
     <w:abstractNumId w:val="5"/>
   </w:num>
   <w:num w:numId="2" w16cid:durableId="546798924">
-    <w:abstractNumId w:val="8"/>
+    <w:abstractNumId w:val="9"/>
   </w:num>
   <w:num w:numId="3" w16cid:durableId="563374064">
-    <w:abstractNumId w:val="7"/>
+    <w:abstractNumId w:val="8"/>
   </w:num>
   <w:num w:numId="4" w16cid:durableId="1238975505">
     <w:abstractNumId w:val="3"/>
@@ -4150,6 +5852,9 @@
   </w:num>
   <w:num w:numId="9" w16cid:durableId="2093159708">
     <w:abstractNumId w:val="0"/>
+  </w:num>
+  <w:num w:numId="10" w16cid:durableId="874007344">
+    <w:abstractNumId w:val="7"/>
   </w:num>
 </w:numbering>
 </file>
@@ -4757,7 +6462,6 @@
   <w:style w:type="character" w:default="1" w:styleId="DefaultParagraphFont">
     <w:name w:val="Default Paragraph Font"/>
     <w:uiPriority w:val="1"/>
-    <w:semiHidden/>
     <w:unhideWhenUsed/>
   </w:style>
   <w:style w:type="table" w:default="1" w:styleId="TableNormal">

</xml_diff>